<commit_message>
Incorporate Crystal/Leanne review edits: new title, updated refs, tighter language
</commit_message>
<xml_diff>
--- a/publications/biopharm_report_spring2026/article.docx
+++ b/publications/biopharm_report_spring2026/article.docx
@@ -7,7 +7,7 @@
         <w:pStyle w:val="Title"/>
       </w:pPr>
       <w:r>
-        <w:t xml:space="preserve">How Many Vials for Brazil? Efficiency+ Brings Statistics to Trial Operations</w:t>
+        <w:t xml:space="preserve">How Many Vials for Brazil? Efficiency+ Brings Statistical Innovation to Trial Operations</w:t>
       </w:r>
     </w:p>
     <w:p>
@@ -90,25 +90,25 @@
         <w:pStyle w:val="BodyText"/>
       </w:pPr>
       <w:r>
-        <w:t xml:space="preserve">These are clinical operations questions - and they are fundamentally statistical problems. Yet for decades, they have been answered largely by rules of thumb, spreadsheets, and gut instinct. The result? Globally, more than 80% of clinical trials fail to enroll on time, leading to costly extensions and additional sites</w:t>
-      </w:r>
-      <w:r>
-        <w:t xml:space="preserve"> </w:t>
-      </w:r>
-      <w:r>
-        <w:t xml:space="preserve">(Desai, 2020)</w:t>
-      </w:r>
-      <w:r>
-        <w:t xml:space="preserve">. Drug supply waste in clinical trials is estimated at 50-70% of packaged material</w:t>
-      </w:r>
-      <w:r>
-        <w:t xml:space="preserve"> </w:t>
-      </w:r>
-      <w:r>
-        <w:t xml:space="preserve">(N-SIDE, 2023)</w:t>
-      </w:r>
-      <w:r>
-        <w:t xml:space="preserve">. Sites are selected based on relationships rather than data. The cost of these inefficiencies is staggering - delays alone can cost sponsors millions of dollars per day for a late-stage program.</w:t>
+        <w:t xml:space="preserve">These are clinical operations questions, but they are fundamentally statistical problems. For decades, operational decisions have been made largely by rules of thumb, spreadsheets, and gut instinct; sites are selected based on relationships rather than data. The result? More than half of clinical trials globally fail to enroll on time, leading to costly extensions and additional sites</w:t>
+      </w:r>
+      <w:r>
+        <w:t xml:space="preserve"> </w:t>
+      </w:r>
+      <w:r>
+        <w:t xml:space="preserve">(Lamberti et al., 2024)</w:t>
+      </w:r>
+      <w:r>
+        <w:t xml:space="preserve">; and drug supply waste in clinical trials is estimated at 50%</w:t>
+      </w:r>
+      <w:r>
+        <w:t xml:space="preserve"> </w:t>
+      </w:r>
+      <w:r>
+        <w:t xml:space="preserve">(McKinsey &amp; Company, 2021)</w:t>
+      </w:r>
+      <w:r>
+        <w:t xml:space="preserve">. The cost of these inefficiencies is staggering - delays alone can cost sponsors millions of dollars per day for a late-stage program.</w:t>
       </w:r>
     </w:p>
     <w:p>
@@ -116,7 +116,7 @@
         <w:pStyle w:val="BodyText"/>
       </w:pPr>
       <w:r>
-        <w:t xml:space="preserve">We believe statisticians can do something about this. That is why we started</w:t>
+        <w:t xml:space="preserve">Statisticians are well-equipped to contribute innovative solutions to several aspects of operational inefficiencies, including enrollment forecasting, site selection, drug supply planning, and more. Yet, there is no organized community to share methods, compare approaches, or develop best practices. That is why we started</w:t>
       </w:r>
       <w:r>
         <w:t xml:space="preserve"> </w:t>
@@ -147,7 +147,7 @@
         <w:pStyle w:val="FirstParagraph"/>
       </w:pPr>
       <w:r>
-        <w:t xml:space="preserve">The idea for Efficiency+ grew out of conversations among statisticians who found themselves increasingly involved in operational decisions - enrollment forecasting, site selection, drug supply planning - and realized there was no organized community to share methods, compare approaches, or develop best practices.</w:t>
+        <w:t xml:space="preserve">The idea for Efficiency+ grew out of conversations among statisticians who found themselves increasingly involved in operational decisions, including enrollment forecasting, site selection, and drug supply planning.</w:t>
       </w:r>
     </w:p>
     <w:p>
@@ -163,7 +163,7 @@
         <w:pStyle w:val="BodyText"/>
       </w:pPr>
       <w:r>
-        <w:t xml:space="preserve">From the start, we wanted Efficiency+ to be different from a typical methods-focused working group. Our scope is deliberately cross-functional - we care about the intersection of statistics with clinical operations, drug supply, regulatory planning, and data management. The</w:t>
+        <w:t xml:space="preserve">From the start, we wanted Efficiency+ to be different from a typical methods-focused working group. Our scope is deliberately cross-functional. We care about the intersection of statistics with clinical operations, drug supply, regulatory planning, and data management. The</w:t>
       </w:r>
       <w:r>
         <w:t xml:space="preserve"> </w:t>
@@ -175,7 +175,64 @@
         <w:t xml:space="preserve"> </w:t>
       </w:r>
       <w:r>
-        <w:t xml:space="preserve">in our name reflects this: we are statisticians,</w:t>
+        <w:t xml:space="preserve">in our name reflects this: statisticians, plus the collaborators and domains we need to work with to move the needle.</w:t>
+      </w:r>
+    </w:p>
+    <w:bookmarkEnd w:id="21"/>
+    <w:bookmarkStart w:id="22" w:name="our-mission"/>
+    <w:p>
+      <w:pPr>
+        <w:pStyle w:val="Heading2"/>
+      </w:pPr>
+      <w:r>
+        <w:t xml:space="preserve">Our Mission</w:t>
+      </w:r>
+    </w:p>
+    <w:p>
+      <w:pPr>
+        <w:pStyle w:val="FirstParagraph"/>
+      </w:pPr>
+      <w:r>
+        <w:t xml:space="preserve">Our mission is to advance clinical trial operations by championing cross-pharma and cross-functional collaborative research and driving statistical innovations. We are dedicated to fostering interdisciplinary progress in trial design and execution, ensuring the highest standards of study conduct. Through sharing insights, identifying gaps, and learning from one another, we aim to optimize efficiency, reduce waste, and ultimately accelerate the path from lab to patient</w:t>
+      </w:r>
+      <w:r>
+        <w:t xml:space="preserve"> </w:t>
+      </w:r>
+      <w:r>
+        <w:t xml:space="preserve">(Efficiency+ Scientific Working Group, 2025)</w:t>
+      </w:r>
+      <w:r>
+        <w:t xml:space="preserve">.</w:t>
+      </w:r>
+    </w:p>
+    <w:bookmarkEnd w:id="22"/>
+    <w:bookmarkStart w:id="23" w:name="our-workstreams"/>
+    <w:p>
+      <w:pPr>
+        <w:pStyle w:val="Heading2"/>
+      </w:pPr>
+      <w:r>
+        <w:t xml:space="preserve">Our Workstreams</w:t>
+      </w:r>
+    </w:p>
+    <w:p>
+      <w:pPr>
+        <w:pStyle w:val="FirstParagraph"/>
+      </w:pPr>
+      <w:r>
+        <w:t xml:space="preserve">After our kickoff, we surveyed members to identify the most pressing topics. The results were clear - four focus areas emerged. We then organized our group into corresponding topic workstreams:</w:t>
+      </w:r>
+    </w:p>
+    <w:p>
+      <w:pPr>
+        <w:pStyle w:val="BodyText"/>
+      </w:pPr>
+      <w:r>
+        <w:rPr>
+          <w:b/>
+          <w:bCs/>
+        </w:rPr>
+        <w:t xml:space="preserve">1. Patient Recruitment Monitoring and Forecasting, Site Selection</w:t>
       </w:r>
       <w:r>
         <w:t xml:space="preserve"> </w:t>
@@ -185,58 +242,15 @@
           <w:i/>
           <w:iCs/>
         </w:rPr>
-        <w:t xml:space="preserve">plus</w:t>
-      </w:r>
-      <w:r>
-        <w:t xml:space="preserve"> </w:t>
-      </w:r>
-      <w:r>
-        <w:t xml:space="preserve">the collaborators and domains we need to work with to actually move the needle.</w:t>
-      </w:r>
-    </w:p>
-    <w:bookmarkEnd w:id="21"/>
-    <w:bookmarkStart w:id="22" w:name="our-mission"/>
-    <w:p>
-      <w:pPr>
-        <w:pStyle w:val="Heading2"/>
-      </w:pPr>
-      <w:r>
-        <w:t xml:space="preserve">Our Mission</w:t>
-      </w:r>
-    </w:p>
-    <w:p>
-      <w:pPr>
-        <w:pStyle w:val="FirstParagraph"/>
-      </w:pPr>
-      <w:r>
-        <w:t xml:space="preserve">Our mission is to advance clinical trial operations by championing cross-pharma and cross-functional collaborative research and driving statistical innovations. We are dedicated to fostering interdisciplinary progress in trial design and execution, ensuring the highest standards of study conduct. Through sharing insights, identifying gaps, and learning from one another, we aim to optimize efficiency, reduce waste, and ultimately accelerate the path from lab to patient</w:t>
-      </w:r>
-      <w:r>
-        <w:t xml:space="preserve"> </w:t>
-      </w:r>
-      <w:r>
-        <w:t xml:space="preserve">(Efficiency+ Scientific Working Group, 2025)</w:t>
-      </w:r>
-      <w:r>
-        <w:t xml:space="preserve">.</w:t>
-      </w:r>
-    </w:p>
-    <w:bookmarkEnd w:id="22"/>
-    <w:bookmarkStart w:id="23" w:name="what-we-are-working-on"/>
-    <w:p>
-      <w:pPr>
-        <w:pStyle w:val="Heading2"/>
-      </w:pPr>
-      <w:r>
-        <w:t xml:space="preserve">What We Are Working On</w:t>
-      </w:r>
-    </w:p>
-    <w:p>
-      <w:pPr>
-        <w:pStyle w:val="FirstParagraph"/>
-      </w:pPr>
-      <w:r>
-        <w:t xml:space="preserve">After our kickoff, we surveyed members to identify the most pressing topics. The results were clear - four focus areas emerged, and we organized into corresponding workstreams:</w:t>
+        <w:t xml:space="preserve">Led by Clara Cali Mella (Bayer) and Vlad Anisimov (Amgen)</w:t>
+      </w:r>
+    </w:p>
+    <w:p>
+      <w:pPr>
+        <w:pStyle w:val="BodyText"/>
+      </w:pPr>
+      <w:r>
+        <w:t xml:space="preserve">This topic drew the most interest. The team is tackling questions like: What are the best statistical models for enrollment forecasting? How do you combine historical data, real-world data, and accumulating trial data into a single forecast? How should site selection leverage predictive analytics rather than just investigator relationships? Vlad brings deep expertise in Poisson-gamma modeling for recruitment, and the team is working toward a comparative review of forecasting methodologies.</w:t>
       </w:r>
     </w:p>
     <w:p>
@@ -248,7 +262,7 @@
           <w:b/>
           <w:bCs/>
         </w:rPr>
-        <w:t xml:space="preserve">1. Patient Recruitment Monitoring and Forecasting, Site Selection</w:t>
+        <w:t xml:space="preserve">2. Dynamic Trial Monitoring and Data Quality</w:t>
       </w:r>
       <w:r>
         <w:t xml:space="preserve"> </w:t>
@@ -258,7 +272,7 @@
           <w:i/>
           <w:iCs/>
         </w:rPr>
-        <w:t xml:space="preserve">Led by Clara Cali Mella (Bayer) and Vlad Anisimov (Amgen)</w:t>
+        <w:t xml:space="preserve">Led by Palanikumar Ravindran (BMS)</w:t>
       </w:r>
     </w:p>
     <w:p>
@@ -266,16 +280,7 @@
         <w:pStyle w:val="BodyText"/>
       </w:pPr>
       <w:r>
-        <w:t xml:space="preserve">This is the area that drew the most interest. The team is tackling questions like: What are the best statistical models for enrollment forecasting? How do you combine historical data, real-world data, and accumulating trial data into a single forecast? How should site selection leverage predictive analytics rather than just investigator relationships? Vlad brings deep expertise in Poisson-gamma modeling for recruitment</w:t>
-      </w:r>
-      <w:r>
-        <w:t xml:space="preserve"> </w:t>
-      </w:r>
-      <w:r>
-        <w:t xml:space="preserve">(Anisimov &amp; Fedorov, 2007)</w:t>
-      </w:r>
-      <w:r>
-        <w:t xml:space="preserve">, and the team is working toward a comparative review of forecasting methodologies.</w:t>
+        <w:t xml:space="preserve">This workstream focuses on using AI/ML and statistical methods for real-time risk detection during trial conduct - identifying underperforming sites early, predicting dropout patterns, and monitoring data quality signals. The goal is to move trial oversight from reactive to proactive.</w:t>
       </w:r>
     </w:p>
     <w:p>
@@ -287,7 +292,7 @@
           <w:b/>
           <w:bCs/>
         </w:rPr>
-        <w:t xml:space="preserve">2. Dynamic Trial Monitoring and Data Quality</w:t>
+        <w:t xml:space="preserve">3. Study Design and Operations Impact</w:t>
       </w:r>
       <w:r>
         <w:t xml:space="preserve"> </w:t>
@@ -297,7 +302,7 @@
           <w:i/>
           <w:iCs/>
         </w:rPr>
-        <w:t xml:space="preserve">Led by Palanikumar Ravindran (BMS)</w:t>
+        <w:t xml:space="preserve">Led by Dooti Roy (Boehringer Ingelheim)</w:t>
       </w:r>
     </w:p>
     <w:p>
@@ -305,7 +310,7 @@
         <w:pStyle w:val="BodyText"/>
       </w:pPr>
       <w:r>
-        <w:t xml:space="preserve">This workstream focuses on using AI/ML and statistical methods for real-time risk detection during trial conduct - identifying underperforming sites early, predicting dropout patterns, and monitoring data quality signals. The goal is to move trial oversight from reactive to proactive.</w:t>
+        <w:t xml:space="preserve">Innovative trial designs, such as adaptive, platform, and seamless designs, are statistically exciting but can create operational nightmares. This team examines the two-way relationship between design choices and operational execution - how design decisions affect timelines and resources, and how operational realities should inform design.</w:t>
       </w:r>
     </w:p>
     <w:p>
@@ -317,7 +322,7 @@
           <w:b/>
           <w:bCs/>
         </w:rPr>
-        <w:t xml:space="preserve">3. Study Design and Operations Impact</w:t>
+        <w:t xml:space="preserve">4. Clinical Supply Chain</w:t>
       </w:r>
       <w:r>
         <w:t xml:space="preserve"> </w:t>
@@ -327,7 +332,7 @@
           <w:i/>
           <w:iCs/>
         </w:rPr>
-        <w:t xml:space="preserve">Led by Dooti Roy (Boehringer Ingelheim)</w:t>
+        <w:t xml:space="preserve">Led by Christi Kleoudis (AstraZeneca)</w:t>
       </w:r>
     </w:p>
     <w:p>
@@ -335,7 +340,43 @@
         <w:pStyle w:val="BodyText"/>
       </w:pPr>
       <w:r>
-        <w:t xml:space="preserve">Innovative trial designs (adaptive, platform, seamless) are exciting statistically but can create operational nightmares. This team examines the two-way relationship between design choices and operational execution - how design decisions affect timelines and resources, and how operational realities should inform design.</w:t>
+        <w:t xml:space="preserve">Drug supply planning is one of the most impactful yet underappreciated areas where statistical innovation can make a difference. This workstream is developing simulation-based approaches to forecast drug demand, optimize vial configurations, and reduce waste, potentially saving millions per program.</w:t>
+      </w:r>
+    </w:p>
+    <w:bookmarkEnd w:id="23"/>
+    <w:bookmarkStart w:id="24" w:name="our-members"/>
+    <w:p>
+      <w:pPr>
+        <w:pStyle w:val="Heading2"/>
+      </w:pPr>
+      <w:r>
+        <w:t xml:space="preserve">Our Members</w:t>
+      </w:r>
+    </w:p>
+    <w:p>
+      <w:pPr>
+        <w:pStyle w:val="FirstParagraph"/>
+      </w:pPr>
+      <w:r>
+        <w:t xml:space="preserve">We are proud of the breadth of our membership, which exemplifies our vision for cross-industry, cross-functional collaboration. Efficiency+ currently includes about 20 active members from AbbVie, Amgen, AstraZeneca, Bayer, Beonemed, Boehringer Ingelheim, BMS, Cytel, Johnson &amp; Johnson, Eli Lilly, Regeneron, and Sanofi. Our membership comprises statisticians, data scientists, and clinical operations professionals - exactly the kind of cross-functional mix needed to make real progress.</w:t>
+      </w:r>
+    </w:p>
+    <w:bookmarkEnd w:id="24"/>
+    <w:bookmarkStart w:id="25" w:name="what-we-have-done-so-far"/>
+    <w:p>
+      <w:pPr>
+        <w:pStyle w:val="Heading2"/>
+      </w:pPr>
+      <w:r>
+        <w:t xml:space="preserve">What We Have Done So Far</w:t>
+      </w:r>
+    </w:p>
+    <w:p>
+      <w:pPr>
+        <w:pStyle w:val="FirstParagraph"/>
+      </w:pPr>
+      <w:r>
+        <w:t xml:space="preserve">Efficiency+ has been quite productive in building a presence in the research community:</w:t>
       </w:r>
     </w:p>
     <w:p>
@@ -347,7 +388,29 @@
           <w:b/>
           <w:bCs/>
         </w:rPr>
-        <w:t xml:space="preserve">4. Clinical Supply Chain</w:t>
+        <w:t xml:space="preserve">Conference Presence.</w:t>
+      </w:r>
+      <w:r>
+        <w:t xml:space="preserve"> </w:t>
+      </w:r>
+      <w:r>
+        <w:t xml:space="preserve">We just wrapped up a successful invited session at</w:t>
+      </w:r>
+      <w:r>
+        <w:t xml:space="preserve"> </w:t>
+      </w:r>
+      <w:r>
+        <w:rPr>
+          <w:b/>
+          <w:bCs/>
+        </w:rPr>
+        <w:t xml:space="preserve">ENAR 2026</w:t>
+      </w:r>
+      <w:r>
+        <w:t xml:space="preserve"> </w:t>
+      </w:r>
+      <w:r>
+        <w:t xml:space="preserve">(March 15-18, Indianapolis) titled</w:t>
       </w:r>
       <w:r>
         <w:t xml:space="preserve"> </w:t>
@@ -357,101 +420,13 @@
           <w:i/>
           <w:iCs/>
         </w:rPr>
-        <w:t xml:space="preserve">Led by Christi Kleoudis (AstraZeneca)</w:t>
-      </w:r>
-    </w:p>
-    <w:p>
-      <w:pPr>
-        <w:pStyle w:val="BodyText"/>
-      </w:pPr>
-      <w:r>
-        <w:t xml:space="preserve">Drug supply planning is one of the most impactful yet underappreciated areas where statistics can help. This workstream is developing simulation-based approaches to forecast drug demand, optimize vial configurations, and reduce waste - potentially saving millions per program.</w:t>
-      </w:r>
-    </w:p>
-    <w:bookmarkEnd w:id="23"/>
-    <w:bookmarkStart w:id="24" w:name="our-members"/>
-    <w:p>
-      <w:pPr>
-        <w:pStyle w:val="Heading2"/>
-      </w:pPr>
-      <w:r>
-        <w:t xml:space="preserve">Our Members</w:t>
-      </w:r>
-    </w:p>
-    <w:p>
-      <w:pPr>
-        <w:pStyle w:val="FirstParagraph"/>
-      </w:pPr>
-      <w:r>
-        <w:t xml:space="preserve">One thing we are proud of is the breadth of our membership. Efficiency+ currently includes about 20 active members from AbbVie, Amgen, AstraZeneca, Bayer, Beonemed, Boehringer Ingelheim, BMS, Cytel, Johnson &amp; Johnson, Eli Lilly, Regeneron, and Sanofi. We have statisticians, data scientists, and clinical operations professionals - exactly the kind of cross-functional mix we think is needed to make real progress.</w:t>
-      </w:r>
-    </w:p>
-    <w:bookmarkEnd w:id="24"/>
-    <w:bookmarkStart w:id="26" w:name="what-we-have-done-so-far"/>
-    <w:p>
-      <w:pPr>
-        <w:pStyle w:val="Heading2"/>
-      </w:pPr>
-      <w:r>
-        <w:t xml:space="preserve">What We Have Done So Far</w:t>
-      </w:r>
-    </w:p>
-    <w:p>
-      <w:pPr>
-        <w:pStyle w:val="FirstParagraph"/>
-      </w:pPr>
-      <w:r>
-        <w:t xml:space="preserve">It has been less than a year since our kickoff, but we have been busy.</w:t>
-      </w:r>
-    </w:p>
-    <w:p>
-      <w:pPr>
-        <w:pStyle w:val="BodyText"/>
-      </w:pPr>
-      <w:r>
-        <w:rPr>
-          <w:b/>
-          <w:bCs/>
-        </w:rPr>
-        <w:t xml:space="preserve">Conference Presence.</w:t>
-      </w:r>
-      <w:r>
-        <w:t xml:space="preserve"> </w:t>
-      </w:r>
-      <w:r>
-        <w:t xml:space="preserve">We just wrapped up a successful invited session at</w:t>
-      </w:r>
-      <w:r>
-        <w:t xml:space="preserve"> </w:t>
-      </w:r>
-      <w:r>
-        <w:rPr>
-          <w:b/>
-          <w:bCs/>
-        </w:rPr>
-        <w:t xml:space="preserve">ENAR 2026</w:t>
-      </w:r>
-      <w:r>
-        <w:t xml:space="preserve"> </w:t>
-      </w:r>
-      <w:r>
-        <w:t xml:space="preserve">(March 15-18, Indianapolis) titled</w:t>
-      </w:r>
-      <w:r>
-        <w:t xml:space="preserve"> </w:t>
-      </w:r>
-      <w:r>
-        <w:rPr>
-          <w:i/>
-          <w:iCs/>
-        </w:rPr>
         <w:t xml:space="preserve">“Enhancing Clinical Trial Efficiency through Statistics, AI, and Collaborative Innovation.”</w:t>
       </w:r>
       <w:r>
         <w:t xml:space="preserve"> </w:t>
       </w:r>
       <w:r>
-        <w:t xml:space="preserve">The session featured talks on data-driven recruitment forecasting, trial monitoring methods, pediatric trial challenges, and randomization in platform trials - and generated great discussion with the audience. We have more sessions coming:</w:t>
+        <w:t xml:space="preserve">The session featured talks on data-driven recruitment forecasting, trial monitoring methods, pediatric trial challenges, and randomization in platform trials, and the conversations are just beginning! We have more sessions coming this year:</w:t>
       </w:r>
     </w:p>
     <w:p>
@@ -617,7 +592,7 @@
         <w:t xml:space="preserve"> </w:t>
       </w:r>
       <w:r>
-        <w:t xml:space="preserve">project) that provides end-to-end simulation capabilities - from site activation and patient enrollment through randomization, visit scheduling, and drug supply forecasting. The engine features 31 country-specific parameter types and Bayesian forecasting with JAGS integration. A key strength of the tool is its scenario planning capability: supply chain planners can explore the trade-off between probability of stock-out and amount of drug waste under different study designs and forecast/supply strategies, enabling more informed decision-making before and during a trial.</w:t>
+        <w:t xml:space="preserve">project) that provides end-to-end simulation capabilities from site activation and patient enrollment through randomization, visit scheduling, and drug supply forecasting. The engine features 31 country-specific parameter types and Bayesian forecasting with JAGS integration. A key strength of the tool is its scenario planning capability: supply chain planners can explore the trade-off between probability of stock-out and amount of drug waste under different study designs and forecast/supply strategies, enabling more informed decision-making before and during a trial.</w:t>
       </w:r>
     </w:p>
     <w:p>
@@ -671,27 +646,138 @@
         <w:t xml:space="preserve">We run a regular reading group where members discuss recent literature on clinical trial operations, keeping the group current on methods and sparking new research ideas.</w:t>
       </w:r>
     </w:p>
-    <w:p>
-      <w:pPr>
-        <w:pStyle w:val="BodyText"/>
+    <w:bookmarkEnd w:id="25"/>
+    <w:bookmarkStart w:id="30" w:name="find-us-online"/>
+    <w:p>
+      <w:pPr>
+        <w:pStyle w:val="Heading2"/>
+      </w:pPr>
+      <w:r>
+        <w:t xml:space="preserve">Find Us Online</w:t>
+      </w:r>
+    </w:p>
+    <w:p>
+      <w:pPr>
+        <w:pStyle w:val="FirstParagraph"/>
+      </w:pPr>
+      <w:r>
+        <w:t xml:space="preserve">We are actively building our community presence beyond conferences:</w:t>
+      </w:r>
+    </w:p>
+    <w:p>
+      <w:pPr>
+        <w:pStyle w:val="Compact"/>
+        <w:numPr>
+          <w:ilvl w:val="0"/>
+          <w:numId w:val="1002"/>
+        </w:numPr>
       </w:pPr>
       <w:r>
         <w:rPr>
           <w:b/>
           <w:bCs/>
         </w:rPr>
-        <w:t xml:space="preserve">Website.</w:t>
-      </w:r>
-      <w:r>
-        <w:t xml:space="preserve"> </w:t>
-      </w:r>
-      <w:r>
-        <w:t xml:space="preserve">Our website at</w:t>
-      </w:r>
-      <w:r>
-        <w:t xml:space="preserve"> </w:t>
-      </w:r>
-      <w:hyperlink r:id="rId25">
+        <w:t xml:space="preserve">X (Twitter)</w:t>
+      </w:r>
+      <w:r>
+        <w:t xml:space="preserve">: Follow us at</w:t>
+      </w:r>
+      <w:r>
+        <w:t xml:space="preserve"> </w:t>
+      </w:r>
+      <w:r>
+        <w:rPr>
+          <w:b/>
+          <w:bCs/>
+        </w:rPr>
+        <w:t xml:space="preserve">@efficiencyplus</w:t>
+      </w:r>
+      <w:r>
+        <w:t xml:space="preserve"> </w:t>
+      </w:r>
+      <w:r>
+        <w:t xml:space="preserve">(</w:t>
+      </w:r>
+      <w:hyperlink r:id="rId26">
+        <w:r>
+          <w:rPr>
+            <w:rStyle w:val="Hyperlink"/>
+          </w:rPr>
+          <w:t xml:space="preserve">x.com/efficiencyplus</w:t>
+        </w:r>
+      </w:hyperlink>
+      <w:r>
+        <w:t xml:space="preserve">) for session highlights, working group milestones, and new publications</w:t>
+      </w:r>
+    </w:p>
+    <w:p>
+      <w:pPr>
+        <w:pStyle w:val="Compact"/>
+        <w:numPr>
+          <w:ilvl w:val="0"/>
+          <w:numId w:val="1002"/>
+        </w:numPr>
+      </w:pPr>
+      <w:r>
+        <w:rPr>
+          <w:b/>
+          <w:bCs/>
+        </w:rPr>
+        <w:t xml:space="preserve">LinkedIn</w:t>
+      </w:r>
+      <w:r>
+        <w:t xml:space="preserve">: Connect with us at</w:t>
+      </w:r>
+      <w:r>
+        <w:t xml:space="preserve"> </w:t>
+      </w:r>
+      <w:r>
+        <w:rPr>
+          <w:b/>
+          <w:bCs/>
+        </w:rPr>
+        <w:t xml:space="preserve">@efficiency-plus-trials</w:t>
+      </w:r>
+      <w:r>
+        <w:t xml:space="preserve"> </w:t>
+      </w:r>
+      <w:r>
+        <w:t xml:space="preserve">(</w:t>
+      </w:r>
+      <w:hyperlink r:id="rId27">
+        <w:r>
+          <w:rPr>
+            <w:rStyle w:val="Hyperlink"/>
+          </w:rPr>
+          <w:t xml:space="preserve">linkedin.com/company/efficiency-plus-trials</w:t>
+        </w:r>
+      </w:hyperlink>
+      <w:r>
+        <w:t xml:space="preserve">) for updates on conference sessions, working group news, and member spotlights</w:t>
+      </w:r>
+    </w:p>
+    <w:p>
+      <w:pPr>
+        <w:pStyle w:val="Compact"/>
+        <w:numPr>
+          <w:ilvl w:val="0"/>
+          <w:numId w:val="1002"/>
+        </w:numPr>
+      </w:pPr>
+      <w:r>
+        <w:rPr>
+          <w:b/>
+          <w:bCs/>
+        </w:rPr>
+        <w:t xml:space="preserve">Website</w:t>
+      </w:r>
+      <w:r>
+        <w:t xml:space="preserve">:</w:t>
+      </w:r>
+      <w:r>
+        <w:t xml:space="preserve"> </w:t>
+      </w:r>
+      <w:hyperlink r:id="rId28">
         <w:r>
           <w:rPr>
             <w:rStyle w:val="Hyperlink"/>
@@ -703,148 +789,8 @@
         <w:t xml:space="preserve"> </w:t>
       </w:r>
       <w:r>
-        <w:t xml:space="preserve">serves as a hub for our mission, focus areas, and resources.</w:t>
-      </w:r>
-    </w:p>
-    <w:bookmarkEnd w:id="26"/>
-    <w:bookmarkStart w:id="30" w:name="find-us-online"/>
-    <w:p>
-      <w:pPr>
-        <w:pStyle w:val="Heading2"/>
-      </w:pPr>
-      <w:r>
-        <w:t xml:space="preserve">Find Us Online</w:t>
-      </w:r>
-    </w:p>
-    <w:p>
-      <w:pPr>
-        <w:pStyle w:val="FirstParagraph"/>
-      </w:pPr>
-      <w:r>
-        <w:t xml:space="preserve">We are actively building our community presence beyond conferences:</w:t>
-      </w:r>
-    </w:p>
-    <w:p>
-      <w:pPr>
-        <w:pStyle w:val="Compact"/>
-        <w:numPr>
-          <w:ilvl w:val="0"/>
-          <w:numId w:val="1002"/>
-        </w:numPr>
-      </w:pPr>
-      <w:r>
-        <w:rPr>
-          <w:b/>
-          <w:bCs/>
-        </w:rPr>
-        <w:t xml:space="preserve">X (Twitter)</w:t>
-      </w:r>
-      <w:r>
-        <w:t xml:space="preserve">: Follow us at</w:t>
-      </w:r>
-      <w:r>
-        <w:t xml:space="preserve"> </w:t>
-      </w:r>
-      <w:r>
-        <w:rPr>
-          <w:b/>
-          <w:bCs/>
-        </w:rPr>
-        <w:t xml:space="preserve">@efficiencyplus</w:t>
-      </w:r>
-      <w:r>
-        <w:t xml:space="preserve"> </w:t>
-      </w:r>
-      <w:r>
-        <w:t xml:space="preserve">(</w:t>
-      </w:r>
-      <w:hyperlink r:id="rId27">
-        <w:r>
-          <w:rPr>
-            <w:rStyle w:val="Hyperlink"/>
-          </w:rPr>
-          <w:t xml:space="preserve">x.com/efficiencyplus</w:t>
-        </w:r>
-      </w:hyperlink>
-      <w:r>
-        <w:t xml:space="preserve">) for session highlights, working group milestones, and new publications</w:t>
-      </w:r>
-    </w:p>
-    <w:p>
-      <w:pPr>
-        <w:pStyle w:val="Compact"/>
-        <w:numPr>
-          <w:ilvl w:val="0"/>
-          <w:numId w:val="1002"/>
-        </w:numPr>
-      </w:pPr>
-      <w:r>
-        <w:rPr>
-          <w:b/>
-          <w:bCs/>
-        </w:rPr>
-        <w:t xml:space="preserve">LinkedIn</w:t>
-      </w:r>
-      <w:r>
-        <w:t xml:space="preserve">: Connect with us at</w:t>
-      </w:r>
-      <w:r>
-        <w:t xml:space="preserve"> </w:t>
-      </w:r>
-      <w:r>
-        <w:rPr>
-          <w:b/>
-          <w:bCs/>
-        </w:rPr>
-        <w:t xml:space="preserve">@efficiency-plus-trials</w:t>
-      </w:r>
-      <w:r>
-        <w:t xml:space="preserve"> </w:t>
-      </w:r>
-      <w:r>
-        <w:t xml:space="preserve">(</w:t>
-      </w:r>
-      <w:hyperlink r:id="rId28">
-        <w:r>
-          <w:rPr>
-            <w:rStyle w:val="Hyperlink"/>
-          </w:rPr>
-          <w:t xml:space="preserve">linkedin.com/company/efficiency-plus-trials</w:t>
-        </w:r>
-      </w:hyperlink>
-      <w:r>
-        <w:t xml:space="preserve">) for updates on conference sessions, working group news, and member spotlights</w:t>
-      </w:r>
-    </w:p>
-    <w:p>
-      <w:pPr>
-        <w:pStyle w:val="Compact"/>
-        <w:numPr>
-          <w:ilvl w:val="0"/>
-          <w:numId w:val="1002"/>
-        </w:numPr>
-      </w:pPr>
-      <w:r>
-        <w:rPr>
-          <w:b/>
-          <w:bCs/>
-        </w:rPr>
-        <w:t xml:space="preserve">Website</w:t>
-      </w:r>
-      <w:r>
-        <w:t xml:space="preserve">:</w:t>
-      </w:r>
-      <w:r>
-        <w:t xml:space="preserve"> </w:t>
-      </w:r>
-      <w:hyperlink r:id="rId25">
-        <w:r>
-          <w:rPr>
-            <w:rStyle w:val="Hyperlink"/>
-          </w:rPr>
-          <w:t xml:space="preserve">efficiencyplustrials.github.io</w:t>
-        </w:r>
-      </w:hyperlink>
+        <w:t xml:space="preserve">- serves as a hub for our mission, focus areas, and resources</w:t>
+      </w:r>
     </w:p>
     <w:p>
       <w:pPr>
@@ -927,7 +873,7 @@
         <w:t xml:space="preserve"> </w:t>
       </w:r>
       <w:r>
-        <w:t xml:space="preserve">- We plan to organize a collection of white papers from each of our topic subteams into a special issue of a peer-reviewed journal (exact venue to be determined), providing a comprehensive reference for the field</w:t>
+        <w:t xml:space="preserve">- organizing a collection of white papers from each of our topic subteams into a special issue of a peer-reviewed journal (exact venue to be determined), providing a comprehensive reference for the field</w:t>
       </w:r>
     </w:p>
     <w:p>
@@ -1011,7 +957,7 @@
         <w:pStyle w:val="FirstParagraph"/>
       </w:pPr>
       <w:r>
-        <w:t xml:space="preserve">If any of this resonates with you - whether you are a statistician who has been pulled into operational discussions, a clinical operations professional curious about what advanced analytics can do, or a data scientist looking for impactful applications - we would love to hear from you.</w:t>
+        <w:t xml:space="preserve">If any of this resonates with you - whether you are a statistician who has been pulled into operational discussions, a clinical operations professional curious about what advanced analytics can do, or a data scientist looking for impactful applications - we would love your input.</w:t>
       </w:r>
     </w:p>
     <w:p>
@@ -1063,7 +1009,7 @@
         <w:t xml:space="preserve"> </w:t>
       </w:r>
       <w:r>
-        <w:t xml:space="preserve">- the people who live these challenges daily and can ground our statistical work in operational reality</w:t>
+        <w:t xml:space="preserve">- people who live these challenges daily and can ground our statistical work in operational reality</w:t>
       </w:r>
     </w:p>
     <w:p>
@@ -1075,7 +1021,17 @@
         </w:numPr>
       </w:pPr>
       <w:r>
-        <w:t xml:space="preserve">Statisticians and data scientists with experience in Bayesian modeling, AI/ML, clinical trial simulation, or drug supply chain analytics</w:t>
+        <w:rPr>
+          <w:b/>
+          <w:bCs/>
+        </w:rPr>
+        <w:t xml:space="preserve">Statisticians and data scientists</w:t>
+      </w:r>
+      <w:r>
+        <w:t xml:space="preserve"> </w:t>
+      </w:r>
+      <w:r>
+        <w:t xml:space="preserve">with experience in Bayesian modeling, AI/ML, clinical trial simulation, or drug supply chain analytics</w:t>
       </w:r>
     </w:p>
     <w:p>
@@ -1102,7 +1058,7 @@
       <w:r>
         <w:t xml:space="preserve"> </w:t>
       </w:r>
-      <w:hyperlink r:id="rId25">
+      <w:hyperlink r:id="rId28">
         <w:r>
           <w:rPr>
             <w:rStyle w:val="Hyperlink"/>
@@ -1111,7 +1067,7 @@
         </w:r>
       </w:hyperlink>
       <w:r>
-        <w:t xml:space="preserve">, or find us at any of our upcoming conference sessions. We are building something that we think can genuinely change how our industry runs clinical trials - and the more perspectives we have at the table, the better.</w:t>
+        <w:t xml:space="preserve">, or find us at any of our upcoming conference sessions. We are building something that we think can genuinely change how our industry runs clinical trials - the more perspectives we have at the table, the better.</w:t>
       </w:r>
     </w:p>
     <w:bookmarkEnd w:id="33"/>
@@ -1129,17 +1085,17 @@
         <w:pStyle w:val="FirstParagraph"/>
       </w:pPr>
       <w:r>
-        <w:t xml:space="preserve">The author thanks all members of the Efficiency+ Scientific Working Group for their contributions and enthusiasm in the group’s first year. Efficiency+ was co-founded by Fei Chen (Johnson &amp; Johnson) and Bohdana Ratitch (Bayer), who jointly developed the original proposal and led the working group through its formation. Bohdana has since stepped down from her co-chair role, and her contributions to launching this initiative are gratefully acknowledged. Clara Cali Mella (Bayer) has stepped in as co-chair to continue the partnership. Special thanks to our group advisors - José Pinheiro, Inna Perevozskaya (BMS), and Benjamin Hofner (PEI) - for their guidance, to the workstream leads - Clara Cali Mella, Vlad Anisimov, Palanikumar Ravindran, Dooti Roy, and Christi Kleoudis - to Crystal Shaw and Leanne Goldstein (Amgen) for leading our social media presence on LinkedIn and X, and to Kyle Wathen (Cytel) for chairing our ENAR session. Thanks also to the ASA Biopharmaceutical Section for supporting this initiative. A full list of Efficiency+ members and their affiliations can be found on our website at</w:t>
-      </w:r>
-      <w:r>
-        <w:t xml:space="preserve"> </w:t>
-      </w:r>
-      <w:hyperlink r:id="rId25">
+        <w:t xml:space="preserve">The author thanks all members of the Efficiency+ Scientific Working Group for their contributions and enthusiasm in the group’s first year. Efficiency+ was co-founded by Fei Chen (Johnson &amp; Johnson) and Bohdana Ratitch (Bayer), who jointly developed the original proposal and led the working group through its formation. Bohdana has since stepped down from her co-chair role, and her contributions to launching this initiative are gratefully acknowledged. Clara Cali Mella (Bayer) has stepped in as co-chair to continue the partnership. Special thanks to our group advisors - Jose Pinheiro, Inna Perevozskaya (BMS), and Benjamin Hofner (PEI) - for their guidance; to the workstream leads - Clara Cali Mella, Vlad Anisimov, Palanikumar Ravindran, Dooti Roy, and Christi Kleoudis; to our social media team, Crystal Shaw and Leanne Goldstein (Amgen), for leading our presence on LinkedIn and X; and to Kyle Wathen (Cytel) for chairing our ENAR session. Thanks also to the ASA Biopharmaceutical Section for supporting this initiative. A full list of Efficiency+ members and their affiliations can be found on our GitHub repository at</w:t>
+      </w:r>
+      <w:r>
+        <w:t xml:space="preserve"> </w:t>
+      </w:r>
+      <w:hyperlink r:id="rId29">
         <w:r>
           <w:rPr>
             <w:rStyle w:val="Hyperlink"/>
           </w:rPr>
-          <w:t xml:space="preserve">efficiencyplustrials.github.io</w:t>
+          <w:t xml:space="preserve">github.com/efficiencyplustrials</w:t>
         </w:r>
       </w:hyperlink>
       <w:r>
@@ -1147,7 +1103,7 @@
       </w:r>
     </w:p>
     <w:bookmarkEnd w:id="34"/>
-    <w:bookmarkStart w:id="43" w:name="references"/>
+    <w:bookmarkStart w:id="41" w:name="references"/>
     <w:p>
       <w:pPr>
         <w:pStyle w:val="Heading2"/>
@@ -1156,14 +1112,14 @@
         <w:t xml:space="preserve">References</w:t>
       </w:r>
     </w:p>
-    <w:bookmarkStart w:id="42" w:name="refs"/>
-    <w:bookmarkStart w:id="36" w:name="ref-anisimov2007"/>
+    <w:bookmarkStart w:id="40" w:name="refs"/>
+    <w:bookmarkStart w:id="35" w:name="ref-efficiencyplus_website"/>
     <w:p>
       <w:pPr>
         <w:pStyle w:val="Bibliography"/>
       </w:pPr>
       <w:r>
-        <w:t xml:space="preserve">Anisimov, V. V., &amp; Fedorov, V. V. (2007). Modelling, prediction and adaptive adjustment of recruitment in multicentre trials.</w:t>
+        <w:t xml:space="preserve">Efficiency+ Scientific Working Group. (2025).</w:t>
       </w:r>
       <w:r>
         <w:t xml:space="preserve"> </w:t>
@@ -1173,100 +1129,6 @@
           <w:i/>
           <w:iCs/>
         </w:rPr>
-        <w:t xml:space="preserve">Statistics in Medicine</w:t>
-      </w:r>
-      <w:r>
-        <w:t xml:space="preserve">,</w:t>
-      </w:r>
-      <w:r>
-        <w:t xml:space="preserve"> </w:t>
-      </w:r>
-      <w:r>
-        <w:rPr>
-          <w:i/>
-          <w:iCs/>
-        </w:rPr>
-        <w:t xml:space="preserve">26</w:t>
-      </w:r>
-      <w:r>
-        <w:t xml:space="preserve">(27), 4958–4975.</w:t>
-      </w:r>
-      <w:r>
-        <w:t xml:space="preserve"> </w:t>
-      </w:r>
-      <w:hyperlink r:id="rId35">
-        <w:r>
-          <w:rPr>
-            <w:rStyle w:val="Hyperlink"/>
-          </w:rPr>
-          <w:t xml:space="preserve">https://doi.org/10.1002/sim.2956</w:t>
-        </w:r>
-      </w:hyperlink>
-    </w:p>
-    <w:bookmarkEnd w:id="36"/>
-    <w:bookmarkStart w:id="38" w:name="ref-desai2020"/>
-    <w:p>
-      <w:pPr>
-        <w:pStyle w:val="Bibliography"/>
-      </w:pPr>
-      <w:r>
-        <w:t xml:space="preserve">Desai, M. (2020). Recruitment and retention of participants in clinical studies: Critical issues and challenges.</w:t>
-      </w:r>
-      <w:r>
-        <w:t xml:space="preserve"> </w:t>
-      </w:r>
-      <w:r>
-        <w:rPr>
-          <w:i/>
-          <w:iCs/>
-        </w:rPr>
-        <w:t xml:space="preserve">Perspectives in Clinical Research</w:t>
-      </w:r>
-      <w:r>
-        <w:t xml:space="preserve">,</w:t>
-      </w:r>
-      <w:r>
-        <w:t xml:space="preserve"> </w:t>
-      </w:r>
-      <w:r>
-        <w:rPr>
-          <w:i/>
-          <w:iCs/>
-        </w:rPr>
-        <w:t xml:space="preserve">11</w:t>
-      </w:r>
-      <w:r>
-        <w:t xml:space="preserve">(2), 51–53.</w:t>
-      </w:r>
-      <w:r>
-        <w:t xml:space="preserve"> </w:t>
-      </w:r>
-      <w:hyperlink r:id="rId37">
-        <w:r>
-          <w:rPr>
-            <w:rStyle w:val="Hyperlink"/>
-          </w:rPr>
-          <w:t xml:space="preserve">https://doi.org/10.4103/picr.PICR_6_20</w:t>
-        </w:r>
-      </w:hyperlink>
-    </w:p>
-    <w:bookmarkEnd w:id="38"/>
-    <w:bookmarkStart w:id="39" w:name="ref-efficiencyplus_website"/>
-    <w:p>
-      <w:pPr>
-        <w:pStyle w:val="Bibliography"/>
-      </w:pPr>
-      <w:r>
-        <w:t xml:space="preserve">Efficiency+ Scientific Working Group. (2025).</w:t>
-      </w:r>
-      <w:r>
-        <w:t xml:space="preserve"> </w:t>
-      </w:r>
-      <w:r>
-        <w:rPr>
-          <w:i/>
-          <w:iCs/>
-        </w:rPr>
         <w:t xml:space="preserve">Efficiency+: Enhancing clinical trial operations through advanced statistics</w:t>
       </w:r>
       <w:r>
@@ -1275,7 +1137,7 @@
       <w:r>
         <w:t xml:space="preserve"> </w:t>
       </w:r>
-      <w:hyperlink r:id="rId25">
+      <w:hyperlink r:id="rId28">
         <w:r>
           <w:rPr>
             <w:rStyle w:val="Hyperlink"/>
@@ -1284,14 +1146,14 @@
         </w:r>
       </w:hyperlink>
     </w:p>
-    <w:bookmarkEnd w:id="39"/>
-    <w:bookmarkStart w:id="41" w:name="ref-nside2023"/>
+    <w:bookmarkEnd w:id="35"/>
+    <w:bookmarkStart w:id="37" w:name="ref-lamberti2024"/>
     <w:p>
       <w:pPr>
         <w:pStyle w:val="Bibliography"/>
       </w:pPr>
       <w:r>
-        <w:t xml:space="preserve">N-SIDE. (2023).</w:t>
+        <w:t xml:space="preserve">Lamberti, M. J., Dirks, A., Kikuchi, N., et al. (2024). Benchmarking site activation and patient enrollment.</w:t>
       </w:r>
       <w:r>
         <w:t xml:space="preserve"> </w:t>
@@ -1301,26 +1163,73 @@
           <w:i/>
           <w:iCs/>
         </w:rPr>
-        <w:t xml:space="preserve">Reduce drug waste in clinical trials</w:t>
-      </w:r>
-      <w:r>
-        <w:t xml:space="preserve">.</w:t>
-      </w:r>
-      <w:r>
-        <w:t xml:space="preserve"> </w:t>
-      </w:r>
-      <w:hyperlink r:id="rId40">
+        <w:t xml:space="preserve">Therapeutic Innovation &amp; Regulatory Science</w:t>
+      </w:r>
+      <w:r>
+        <w:t xml:space="preserve">,</w:t>
+      </w:r>
+      <w:r>
+        <w:t xml:space="preserve"> </w:t>
+      </w:r>
+      <w:r>
+        <w:rPr>
+          <w:i/>
+          <w:iCs/>
+        </w:rPr>
+        <w:t xml:space="preserve">58</w:t>
+      </w:r>
+      <w:r>
+        <w:t xml:space="preserve">, 696–703.</w:t>
+      </w:r>
+      <w:r>
+        <w:t xml:space="preserve"> </w:t>
+      </w:r>
+      <w:hyperlink r:id="rId36">
         <w:r>
           <w:rPr>
             <w:rStyle w:val="Hyperlink"/>
           </w:rPr>
-          <w:t xml:space="preserve">https://lifesciences.n-side.com/blog/unlock-the-hidden-value</w:t>
+          <w:t xml:space="preserve">https://doi.org/10.1007/s43441-024-00638-1</w:t>
         </w:r>
       </w:hyperlink>
     </w:p>
+    <w:bookmarkEnd w:id="37"/>
+    <w:bookmarkStart w:id="39" w:name="ref-mckinsey2021"/>
+    <w:p>
+      <w:pPr>
+        <w:pStyle w:val="Bibliography"/>
+      </w:pPr>
+      <w:r>
+        <w:t xml:space="preserve">McKinsey &amp; Company. (2021).</w:t>
+      </w:r>
+      <w:r>
+        <w:t xml:space="preserve"> </w:t>
+      </w:r>
+      <w:r>
+        <w:rPr>
+          <w:i/>
+          <w:iCs/>
+        </w:rPr>
+        <w:t xml:space="preserve">Clinical supply chains: How to boost excellence and innovation</w:t>
+      </w:r>
+      <w:r>
+        <w:t xml:space="preserve">.</w:t>
+      </w:r>
+      <w:r>
+        <w:t xml:space="preserve"> </w:t>
+      </w:r>
+      <w:hyperlink r:id="rId38">
+        <w:r>
+          <w:rPr>
+            <w:rStyle w:val="Hyperlink"/>
+          </w:rPr>
+          <w:t xml:space="preserve">https://www.mckinsey.com/industries/life-sciences/our-insights/clinical-supply-chains-how-to-boost-excellence-and-innovation</w:t>
+        </w:r>
+      </w:hyperlink>
+    </w:p>
+    <w:bookmarkEnd w:id="39"/>
+    <w:bookmarkEnd w:id="40"/>
     <w:bookmarkEnd w:id="41"/>
-    <w:bookmarkEnd w:id="42"/>
-    <w:bookmarkEnd w:id="43"/>
     <w:sectPr>
       <w:footnotePr>
         <w:numRestart w:val="eachSect"/>

</xml_diff>

<commit_message>
Crystal/Leanne edits as base + add back SCOPE, SLDS, GitHub, title update, member list fix
</commit_message>
<xml_diff>
--- a/publications/biopharm_report_spring2026/article.docx
+++ b/publications/biopharm_report_spring2026/article.docx
@@ -90,7 +90,7 @@
         <w:pStyle w:val="BodyText"/>
       </w:pPr>
       <w:r>
-        <w:t xml:space="preserve">These are clinical operations questions, but they are fundamentally statistical problems. For decades, operational decisions have been made largely by rules of thumb, spreadsheets, and gut instinct; sites are selected based on relationships rather than data. The result? More than half of clinical trials globally fail to enroll on time, leading to costly extensions and additional sites</w:t>
+        <w:t xml:space="preserve">These are clinical operations questions, but they are fundamentally statistical problems. For decades, operational decisions have been made largely by rules of thumb, spreadsheets, and gut instinct. The result? sites are selected based on relationships rather than data; more than half of clinical trials globally fail to enroll on time, leading to costly extensions and additional sites</w:t>
       </w:r>
       <w:r>
         <w:t xml:space="preserve"> </w:t>
@@ -108,7 +108,7 @@
         <w:t xml:space="preserve">(McKinsey &amp; Company, 2021)</w:t>
       </w:r>
       <w:r>
-        <w:t xml:space="preserve">. The cost of these inefficiencies is staggering - delays alone can cost sponsors millions of dollars per day for a late-stage program.</w:t>
+        <w:t xml:space="preserve">. The cost of these inefficiencies is staggering as delays alone can cost sponsors millions of dollars per day for a late-stage program.</w:t>
       </w:r>
     </w:p>
     <w:p>
@@ -116,7 +116,7 @@
         <w:pStyle w:val="BodyText"/>
       </w:pPr>
       <w:r>
-        <w:t xml:space="preserve">Statisticians are well-equipped to contribute innovative solutions to several aspects of operational inefficiencies, including enrollment forecasting, site selection, drug supply planning, and more. Yet, there is no organized community to share methods, compare approaches, or develop best practices. That is why we started</w:t>
+        <w:t xml:space="preserve">Statisticians are well-equipped to contribute innovative solutions to operational inefficiencies. That is why we started</w:t>
       </w:r>
       <w:r>
         <w:t xml:space="preserve"> </w:t>
@@ -147,7 +147,7 @@
         <w:pStyle w:val="FirstParagraph"/>
       </w:pPr>
       <w:r>
-        <w:t xml:space="preserve">The idea for Efficiency+ grew out of conversations among statisticians who found themselves increasingly involved in operational decisions, including enrollment forecasting, site selection, and drug supply planning.</w:t>
+        <w:t xml:space="preserve">The idea for Efficiency+ grew out of conversations among statisticians who found themselves increasingly involved in several aspects of operational decisions, including enrollment forecasting, site selection, and drug supply planning. Yet, there is no organized statistical community to share methods, compare approaches, or develop best practices.</w:t>
       </w:r>
     </w:p>
     <w:p>
@@ -175,7 +175,7 @@
         <w:t xml:space="preserve"> </w:t>
       </w:r>
       <w:r>
-        <w:t xml:space="preserve">in our name reflects this: statisticians, plus the collaborators and domains we need to work with to move the needle.</w:t>
+        <w:t xml:space="preserve">in our name reflects the statisticians plus the collaborators and domains we need to work with to move the needle.</w:t>
       </w:r>
     </w:p>
     <w:bookmarkEnd w:id="21"/>
@@ -193,7 +193,7 @@
         <w:pStyle w:val="FirstParagraph"/>
       </w:pPr>
       <w:r>
-        <w:t xml:space="preserve">Our mission is to advance clinical trial operations by championing cross-pharma and cross-functional collaborative research and driving statistical innovations. We are dedicated to fostering interdisciplinary progress in trial design and execution, ensuring the highest standards of study conduct. Through sharing insights, identifying gaps, and learning from one another, we aim to optimize efficiency, reduce waste, and ultimately accelerate the path from lab to patient</w:t>
+        <w:t xml:space="preserve">Our mission is to advance clinical trial operations by championing cross-pharma and cross-functional collaborative research to drive statistical innovations. We are dedicated to fostering interdisciplinary progress in trial design and execution, ensuring the highest standards of study conduct. Through sharing insights, identifying gaps, and learning from one another, we aim to optimize efficiency, reduce waste, and ultimately accelerate the path from lab to patient</w:t>
       </w:r>
       <w:r>
         <w:t xml:space="preserve"> </w:t>
@@ -206,13 +206,13 @@
       </w:r>
     </w:p>
     <w:bookmarkEnd w:id="22"/>
-    <w:bookmarkStart w:id="23" w:name="our-workstreams"/>
+    <w:bookmarkStart w:id="23" w:name="workstreams"/>
     <w:p>
       <w:pPr>
         <w:pStyle w:val="Heading2"/>
       </w:pPr>
       <w:r>
-        <w:t xml:space="preserve">Our Workstreams</w:t>
+        <w:t xml:space="preserve">Workstreams</w:t>
       </w:r>
     </w:p>
     <w:p>
@@ -220,7 +220,7 @@
         <w:pStyle w:val="FirstParagraph"/>
       </w:pPr>
       <w:r>
-        <w:t xml:space="preserve">After our kickoff, we surveyed members to identify the most pressing topics. The results were clear - four focus areas emerged. We then organized our group into corresponding topic workstreams:</w:t>
+        <w:t xml:space="preserve">After our kickoff, we surveyed members to identify the most pressing topics. The results were clear and four focus areas emerged. We then organized our group into corresponding workstreams:</w:t>
       </w:r>
     </w:p>
     <w:p>
@@ -250,7 +250,7 @@
         <w:pStyle w:val="BodyText"/>
       </w:pPr>
       <w:r>
-        <w:t xml:space="preserve">This topic drew the most interest. The team is tackling questions like: What are the best statistical models for enrollment forecasting? How do you combine historical data, real-world data, and accumulating trial data into a single forecast? How should site selection leverage predictive analytics rather than just investigator relationships? Vlad brings deep expertise in Poisson-gamma modeling for recruitment, and the team is working toward a comparative review of forecasting methodologies.</w:t>
+        <w:t xml:space="preserve">This topic drew the most interest. The team is tackling questions like: What are the best statistical models for enrollment forecasting? How do you combine historical data, real-world data, and accumulating trial data into a single forecast? How should site selection leverage predictive analytics rather than just investigator relationships? Vlad brings deep expertise in Poisson-gamma modeling for recruitment and the team is working toward a comparative review of forecasting methodologies.</w:t>
       </w:r>
     </w:p>
     <w:p>
@@ -280,7 +280,7 @@
         <w:pStyle w:val="BodyText"/>
       </w:pPr>
       <w:r>
-        <w:t xml:space="preserve">This workstream focuses on using AI/ML and statistical methods for real-time risk detection during trial conduct - identifying underperforming sites early, predicting dropout patterns, and monitoring data quality signals. The goal is to move trial oversight from reactive to proactive.</w:t>
+        <w:t xml:space="preserve">This workstream focuses on using AI/ML and statistical methods for real-time risk detection during trial conduct, identifying underperforming sites early, predicting dropout patterns, and monitoring data quality signals. The goal is to move from reactive to proactive trial oversight.</w:t>
       </w:r>
     </w:p>
     <w:p>
@@ -310,7 +310,7 @@
         <w:pStyle w:val="BodyText"/>
       </w:pPr>
       <w:r>
-        <w:t xml:space="preserve">Innovative trial designs, such as adaptive, platform, and seamless designs, are statistically exciting but can create operational nightmares. This team examines the two-way relationship between design choices and operational execution - how design decisions affect timelines and resources, and how operational realities should inform design.</w:t>
+        <w:t xml:space="preserve">Innovative trial designs (adaptive, platform, seamless) are statistically exciting but can create operational nightmares. This team examines the two-way relationship between design choices and operational execution, such as how design decisions affect timelines and resources, and how operational realities should inform design.</w:t>
       </w:r>
     </w:p>
     <w:p>
@@ -358,7 +358,7 @@
         <w:pStyle w:val="FirstParagraph"/>
       </w:pPr>
       <w:r>
-        <w:t xml:space="preserve">We are proud of the breadth of our membership, which exemplifies our vision for cross-industry, cross-functional collaboration. Efficiency+ currently includes about 20 active members from AbbVie, Amgen, AstraZeneca, Bayer, Beonemed, Boehringer Ingelheim, BMS, Cytel, Johnson &amp; Johnson, Eli Lilly, Regeneron, and Sanofi. Our membership comprises statisticians, data scientists, and clinical operations professionals - exactly the kind of cross-functional mix needed to make real progress.</w:t>
+        <w:t xml:space="preserve">We are proud of the breadth of our membership, which exemplifies our vision for cross-industry, cross-functional collaboration. Efficiency+ currently includes about 20 active members from AbbVie, Amgen, AstraZeneca, Bayer, Beonemed, Boehringer Ingelheim, BMS, Cytel, Johnson &amp; Johnson, Eli Lilly, Regeneron, and Sanofi. Our membership comprises statisticians, data scientists, and clinical operations professionals, exactly the kind of cross-functional mix needed to make real progress.</w:t>
       </w:r>
     </w:p>
     <w:bookmarkEnd w:id="24"/>
@@ -376,7 +376,7 @@
         <w:pStyle w:val="FirstParagraph"/>
       </w:pPr>
       <w:r>
-        <w:t xml:space="preserve">Efficiency+ has been quite productive in building a presence in the research community:</w:t>
+        <w:t xml:space="preserve">It has been less than a year since our kickoff, but Efficiency+ has been quite productive in building presence in the research community:</w:t>
       </w:r>
     </w:p>
     <w:p>
@@ -426,7 +426,7 @@
         <w:t xml:space="preserve"> </w:t>
       </w:r>
       <w:r>
-        <w:t xml:space="preserve">The session featured talks on data-driven recruitment forecasting, trial monitoring methods, pediatric trial challenges, and randomization in platform trials, and the conversations are just beginning! We have more sessions coming this year:</w:t>
+        <w:t xml:space="preserve">The session featured talks on data-driven recruitment forecasting, trial monitoring methods, pediatric trial challenges, and randomization in platform trials. We generated great discussion with the audience, and the conversations are just beginning! We have more sessions coming this year:</w:t>
       </w:r>
     </w:p>
     <w:p>
@@ -592,7 +592,7 @@
         <w:t xml:space="preserve"> </w:t>
       </w:r>
       <w:r>
-        <w:t xml:space="preserve">project) that provides end-to-end simulation capabilities from site activation and patient enrollment through randomization, visit scheduling, and drug supply forecasting. The engine features 31 country-specific parameter types and Bayesian forecasting with JAGS integration. A key strength of the tool is its scenario planning capability: supply chain planners can explore the trade-off between probability of stock-out and amount of drug waste under different study designs and forecast/supply strategies, enabling more informed decision-making before and during a trial.</w:t>
+        <w:t xml:space="preserve">project) that provides end-to-end simulation capabilities, from site activation and patient enrollment through randomization, visit scheduling, and drug supply forecasting. The engine features 31 country-specific parameter types and Bayesian forecasting with JAGS integration. A key strength of the tool is its scenario planning capability: supply chain planners can explore the trade-off between probability of stock-out and amount of drug waste under different study designs and forecast/supply strategies, enabling more informed decision-making before and during a trial.</w:t>
       </w:r>
     </w:p>
     <w:p>
@@ -600,7 +600,7 @@
         <w:pStyle w:val="BodyText"/>
       </w:pPr>
       <w:r>
-        <w:t xml:space="preserve">Importantly, the CSC platform is not just a standalone tool - it is our integration backbone. Each of our four topic teams works on different aspects of trial operations, and the simulation engine serves as the common platform that ties all their work together. The approach is</w:t>
+        <w:t xml:space="preserve">Importantly, the CSC platform is not just a standalone tool. It is our integration backbone. Each of our four topic teams works on different aspects of trial operations, and the simulation engine serves as the common platform that ties all their work together. The approach is</w:t>
       </w:r>
       <w:r>
         <w:t xml:space="preserve"> </w:t>
@@ -625,7 +625,7 @@
         <w:t xml:space="preserve"> </w:t>
       </w:r>
       <w:r>
-        <w:t xml:space="preserve">their methodology improves (e.g., adaptive site activation, ML-based enrollment forecasting, kit-specific safety stock policies) as structured specifications, and AI-assisted coding tools translate those specs into working simulation modules. This lets methodology experts contribute without needing to write code themselves, while enabling rigorous comparison of isolated versus integrated improvements. The vision is one platform, four teams, infinite scenarios - where simulation becomes the common language that proves the value of each team’s contribution and reveals synergies across them. This tool is still a work in progress, with active development ongoing across the working group.</w:t>
+        <w:t xml:space="preserve">their methodology improves (e.g., adaptive site activation, ML-based enrollment forecasting, kit-specific safety stock policies) as structured specifications, and AI-assisted coding tools translate those specs into working simulation modules. This lets methodology experts contribute without needing to write code themselves, while enabling rigorous comparison of isolated versus integrated improvements. The vision is one platform, four teams, infinite scenarios, where simulation becomes the common language that proves the value of each team’s contribution and reveals synergies across them. This tool is still a work in progress, with active development ongoing across the working group.</w:t>
       </w:r>
     </w:p>
     <w:p>
@@ -789,7 +789,7 @@
         <w:t xml:space="preserve"> </w:t>
       </w:r>
       <w:r>
-        <w:t xml:space="preserve">- serves as a hub for our mission, focus areas, and resources</w:t>
+        <w:t xml:space="preserve">serves as a hub for our mission, focus areas, and resources</w:t>
       </w:r>
     </w:p>
     <w:p>
@@ -939,7 +939,7 @@
         <w:t xml:space="preserve"> </w:t>
       </w:r>
       <w:r>
-        <w:t xml:space="preserve">with other ASA BIOP SWGs (e.g., Safety, Bayesian, Software Engineering) on shared challenges</w:t>
+        <w:t xml:space="preserve">- working with other ASA BIOP SWGs (e.g., Safety, Bayesian, Software Engineering) on shared challenges</w:t>
       </w:r>
     </w:p>
     <w:bookmarkEnd w:id="31"/>
@@ -957,7 +957,7 @@
         <w:pStyle w:val="FirstParagraph"/>
       </w:pPr>
       <w:r>
-        <w:t xml:space="preserve">If any of this resonates with you - whether you are a statistician who has been pulled into operational discussions, a clinical operations professional curious about what advanced analytics can do, or a data scientist looking for impactful applications - we would love your input.</w:t>
+        <w:t xml:space="preserve">If any of this resonates with you, whether you are a statistician who has been pulled into operational discussions, a clinical operations professional curious about what advanced analytics can do, or a data scientist looking for impactful applications, we would love your input.</w:t>
       </w:r>
     </w:p>
     <w:p>
@@ -1021,17 +1021,7 @@
         </w:numPr>
       </w:pPr>
       <w:r>
-        <w:rPr>
-          <w:b/>
-          <w:bCs/>
-        </w:rPr>
-        <w:t xml:space="preserve">Statisticians and data scientists</w:t>
-      </w:r>
-      <w:r>
-        <w:t xml:space="preserve"> </w:t>
-      </w:r>
-      <w:r>
-        <w:t xml:space="preserve">with experience in Bayesian modeling, AI/ML, clinical trial simulation, or drug supply chain analytics</w:t>
+        <w:t xml:space="preserve">Statisticians and data scientists with experience in Bayesian modeling, AI/ML, clinical trial simulation, or drug supply chain analytics</w:t>
       </w:r>
     </w:p>
     <w:p>
@@ -1067,7 +1057,7 @@
         </w:r>
       </w:hyperlink>
       <w:r>
-        <w:t xml:space="preserve">, or find us at any of our upcoming conference sessions. We are building something that we think can genuinely change how our industry runs clinical trials - the more perspectives we have at the table, the better.</w:t>
+        <w:t xml:space="preserve">, or find us at any of our upcoming conference sessions. We are building something that we think can genuinely change how our industry runs clinical trials. The more perspectives we have at the table, the better.</w:t>
       </w:r>
     </w:p>
     <w:bookmarkEnd w:id="33"/>
@@ -1085,7 +1075,7 @@
         <w:pStyle w:val="FirstParagraph"/>
       </w:pPr>
       <w:r>
-        <w:t xml:space="preserve">The author thanks all members of the Efficiency+ Scientific Working Group for their contributions and enthusiasm in the group’s first year. Efficiency+ was co-founded by Fei Chen (Johnson &amp; Johnson) and Bohdana Ratitch (Bayer), who jointly developed the original proposal and led the working group through its formation. Bohdana has since stepped down from her co-chair role, and her contributions to launching this initiative are gratefully acknowledged. Clara Cali Mella (Bayer) has stepped in as co-chair to continue the partnership. Special thanks to our group advisors - Jose Pinheiro, Inna Perevozskaya (BMS), and Benjamin Hofner (PEI) - for their guidance; to the workstream leads - Clara Cali Mella, Vlad Anisimov, Palanikumar Ravindran, Dooti Roy, and Christi Kleoudis; to our social media team, Crystal Shaw and Leanne Goldstein (Amgen), for leading our presence on LinkedIn and X; and to Kyle Wathen (Cytel) for chairing our ENAR session. Thanks also to the ASA Biopharmaceutical Section for supporting this initiative. A full list of Efficiency+ members and their affiliations can be found on our GitHub repository at</w:t>
+        <w:t xml:space="preserve">The author thanks all members of the Efficiency+ Scientific Working Group for their contributions and enthusiasm in the group’s first year. Efficiency+ was co-founded by Fei Chen (Johnson &amp; Johnson) and Bohdana Ratitch (Bayer), who jointly developed the original proposal and led the working group through its formation. Bohdana has since stepped down from her co-chair role, and her contributions to launching this initiative are gratefully acknowledged. Clara Cali Mella (Bayer) has stepped in as co-chair to continue the partnership. Special thanks to our group advisors; Jose Pinheiro, Inna Perevozskaya (BMS), and Benjamin Hofner (PEI), for their guidance; to the workstream leads; Clara Cali Mella, Vlad Anisimov, Palanikumar Ravindran, Dooti Roy, and Christi Kleoudis; to our social media team, Crystal Shaw and Leanne Goldstein (Amgen), for leading our presence on LinkedIn and X; and to Kyle Wathen (Cytel) for chairing our ENAR session. Thanks also to the ASA Biopharmaceutical Section for supporting this initiative. A full list of Efficiency+ members and their affiliations can be found on our GitHub repository at</w:t>
       </w:r>
       <w:r>
         <w:t xml:space="preserve"> </w:t>

</xml_diff>

<commit_message>
Add Anisimov 2020 reference on predictive modeling of trial operations
</commit_message>
<xml_diff>
--- a/publications/biopharm_report_spring2026/article.docx
+++ b/publications/biopharm_report_spring2026/article.docx
@@ -250,7 +250,19 @@
         <w:pStyle w:val="BodyText"/>
       </w:pPr>
       <w:r>
-        <w:t xml:space="preserve">This topic drew the most interest. The team is tackling questions like: What are the best statistical models for enrollment forecasting? How do you combine historical data, real-world data, and accumulating trial data into a single forecast? How should site selection leverage predictive analytics rather than just investigator relationships? Vlad brings deep expertise in Poisson-gamma modeling for recruitment and the team is working toward a comparative review of forecasting methodologies.</w:t>
+        <w:t xml:space="preserve">This topic drew the most interest. The team is tackling questions like: What are the best statistical models for enrollment forecasting? How do you combine historical data, real-world data, and accumulating trial data into a single forecast? How should site selection leverage predictive analytics rather than just investigator relationships? Vlad brings deep expertise in Poisson-gamma modeling for recruitment</w:t>
+      </w:r>
+      <w:r>
+        <w:t xml:space="preserve"> </w:t>
+      </w:r>
+      <w:r>
+        <w:t xml:space="preserve">(Anisimov, 2020)</w:t>
+      </w:r>
+      <w:r>
+        <w:t xml:space="preserve"> </w:t>
+      </w:r>
+      <w:r>
+        <w:t xml:space="preserve">and the team is working toward a comparative review of forecasting methodologies.</w:t>
       </w:r>
     </w:p>
     <w:p>
@@ -1093,7 +1105,7 @@
       </w:r>
     </w:p>
     <w:bookmarkEnd w:id="34"/>
-    <w:bookmarkStart w:id="41" w:name="references"/>
+    <w:bookmarkStart w:id="43" w:name="references"/>
     <w:p>
       <w:pPr>
         <w:pStyle w:val="Heading2"/>
@@ -1102,8 +1114,45 @@
         <w:t xml:space="preserve">References</w:t>
       </w:r>
     </w:p>
-    <w:bookmarkStart w:id="40" w:name="refs"/>
-    <w:bookmarkStart w:id="35" w:name="ref-efficiencyplus_website"/>
+    <w:bookmarkStart w:id="42" w:name="refs"/>
+    <w:bookmarkStart w:id="36" w:name="ref-anisimov2020"/>
+    <w:p>
+      <w:pPr>
+        <w:pStyle w:val="Bibliography"/>
+      </w:pPr>
+      <w:r>
+        <w:t xml:space="preserve">Anisimov, V. (2020). Modern analytic techniques for predictive modeling of clinical trial operations. In O. Marchenko &amp; N. Katenka (Eds.),</w:t>
+      </w:r>
+      <w:r>
+        <w:t xml:space="preserve"> </w:t>
+      </w:r>
+      <w:r>
+        <w:rPr>
+          <w:i/>
+          <w:iCs/>
+        </w:rPr>
+        <w:t xml:space="preserve">Quantitative methods in pharmaceutical research and development</w:t>
+      </w:r>
+      <w:r>
+        <w:t xml:space="preserve"> </w:t>
+      </w:r>
+      <w:r>
+        <w:t xml:space="preserve">(pp. 361–408). Springer.</w:t>
+      </w:r>
+      <w:r>
+        <w:t xml:space="preserve"> </w:t>
+      </w:r>
+      <w:hyperlink r:id="rId35">
+        <w:r>
+          <w:rPr>
+            <w:rStyle w:val="Hyperlink"/>
+          </w:rPr>
+          <w:t xml:space="preserve">https://doi.org/10.1007/978-3-030-48555-9_8</w:t>
+        </w:r>
+      </w:hyperlink>
+    </w:p>
+    <w:bookmarkEnd w:id="36"/>
+    <w:bookmarkStart w:id="37" w:name="ref-efficiencyplus_website"/>
     <w:p>
       <w:pPr>
         <w:pStyle w:val="Bibliography"/>
@@ -1136,8 +1185,8 @@
         </w:r>
       </w:hyperlink>
     </w:p>
-    <w:bookmarkEnd w:id="35"/>
-    <w:bookmarkStart w:id="37" w:name="ref-lamberti2024"/>
+    <w:bookmarkEnd w:id="37"/>
+    <w:bookmarkStart w:id="39" w:name="ref-lamberti2024"/>
     <w:p>
       <w:pPr>
         <w:pStyle w:val="Bibliography"/>
@@ -1174,7 +1223,7 @@
       <w:r>
         <w:t xml:space="preserve"> </w:t>
       </w:r>
-      <w:hyperlink r:id="rId36">
+      <w:hyperlink r:id="rId38">
         <w:r>
           <w:rPr>
             <w:rStyle w:val="Hyperlink"/>
@@ -1183,8 +1232,8 @@
         </w:r>
       </w:hyperlink>
     </w:p>
-    <w:bookmarkEnd w:id="37"/>
-    <w:bookmarkStart w:id="39" w:name="ref-mckinsey2021"/>
+    <w:bookmarkEnd w:id="39"/>
+    <w:bookmarkStart w:id="41" w:name="ref-mckinsey2021"/>
     <w:p>
       <w:pPr>
         <w:pStyle w:val="Bibliography"/>
@@ -1208,7 +1257,7 @@
       <w:r>
         <w:t xml:space="preserve"> </w:t>
       </w:r>
-      <w:hyperlink r:id="rId38">
+      <w:hyperlink r:id="rId40">
         <w:r>
           <w:rPr>
             <w:rStyle w:val="Hyperlink"/>
@@ -1217,9 +1266,9 @@
         </w:r>
       </w:hyperlink>
     </w:p>
-    <w:bookmarkEnd w:id="39"/>
-    <w:bookmarkEnd w:id="40"/>
     <w:bookmarkEnd w:id="41"/>
+    <w:bookmarkEnd w:id="42"/>
+    <w:bookmarkEnd w:id="43"/>
     <w:sectPr>
       <w:footnotePr>
         <w:numRestart w:val="eachSect"/>

</xml_diff>

<commit_message>
Remove SLDS, add subteam papers as 2026 deliverables (Guohui feedback)
</commit_message>
<xml_diff>
--- a/publications/biopharm_report_spring2026/article.docx
+++ b/publications/biopharm_report_spring2026/article.docx
@@ -553,28 +553,6 @@
       </w:r>
       <w:r>
         <w:t xml:space="preserve">(October, Barcelona) - Planning to submit a session proposal to this premier clinical operations summit, bringing our work directly to the operations community</w:t>
-      </w:r>
-    </w:p>
-    <w:p>
-      <w:pPr>
-        <w:pStyle w:val="Compact"/>
-        <w:numPr>
-          <w:ilvl w:val="0"/>
-          <w:numId w:val="1001"/>
-        </w:numPr>
-      </w:pPr>
-      <w:r>
-        <w:rPr>
-          <w:b/>
-          <w:bCs/>
-        </w:rPr>
-        <w:t xml:space="preserve">SLDS 2026</w:t>
-      </w:r>
-      <w:r>
-        <w:t xml:space="preserve"> </w:t>
-      </w:r>
-      <w:r>
-        <w:t xml:space="preserve">(November, Brooklyn, NY) - Invited presentation at the ASA Statistical Learning and Data Science conference, showcasing our AI-enabled specification-driven simulation approach</w:t>
       </w:r>
     </w:p>
     <w:p>
@@ -885,7 +863,7 @@
         <w:t xml:space="preserve"> </w:t>
       </w:r>
       <w:r>
-        <w:t xml:space="preserve">- organizing a collection of white papers from each of our topic subteams into a special issue of a peer-reviewed journal (exact venue to be determined), providing a comprehensive reference for the field</w:t>
+        <w:t xml:space="preserve">- organizing a collection of white papers from each of our topic subteams into a special issue of a peer-reviewed journal (exact venue to be determined), providing a comprehensive reference for the field. Each subteam is actively drafting papers as expected deliverables for 2026</w:t>
       </w:r>
     </w:p>
     <w:p>

</xml_diff>

<commit_message>
Incorporate Jose Pinheiro's review comments
</commit_message>
<xml_diff>
--- a/publications/biopharm_report_spring2026/article.docx
+++ b/publications/biopharm_report_spring2026/article.docx
@@ -90,7 +90,7 @@
         <w:pStyle w:val="BodyText"/>
       </w:pPr>
       <w:r>
-        <w:t xml:space="preserve">These are clinical operations questions, but they are fundamentally statistical problems. For decades, operational decisions have been made largely by rules of thumb, spreadsheets, and gut instinct. The result? sites are selected based on relationships rather than data; more than half of clinical trials globally fail to enroll on time, leading to costly extensions and additional sites</w:t>
+        <w:t xml:space="preserve">These are clinical operations questions, but they are fundamentally statistical problems. For decades, operational decisions have been made largely by deterministic rules of thumb, spreadsheets, previous experience, and gut instinct. The result? sites are selected based on relationships rather than data; more than half of clinical trials globally fail to enroll on time, leading to costly extensions and opening of additional sites</w:t>
       </w:r>
       <w:r>
         <w:t xml:space="preserve"> </w:t>
@@ -116,7 +116,7 @@
         <w:pStyle w:val="BodyText"/>
       </w:pPr>
       <w:r>
-        <w:t xml:space="preserve">Statisticians are well-equipped to contribute innovative solutions to operational inefficiencies. That is why we started</w:t>
+        <w:t xml:space="preserve">Statisticians are well-equipped to contribute innovative solutions to address operational inefficiencies. That is why we started</w:t>
       </w:r>
       <w:r>
         <w:t xml:space="preserve"> </w:t>
@@ -155,7 +155,7 @@
         <w:pStyle w:val="BodyText"/>
       </w:pPr>
       <w:r>
-        <w:t xml:space="preserve">In early 2025, we submitted a proposal to the ASA Biopharmaceutical Section to form a new Scientific Working Group (SWG) focused on clinical trial operational efficiency. The proposal was approved, and in July 2025 we held our kickoff meeting with about 20 members from over 10 pharmaceutical and biotech companies.</w:t>
+        <w:t xml:space="preserve">In early 2025, we submitted a proposal to the ASA Biopharmaceutical Section to form a new Scientific Working Group (SWG) focused on clinical trial operational efficiency. The proposal was approved and in July 2025 we held our kickoff meeting with about 20 members from over 10 pharmaceutical and biotech companies.</w:t>
       </w:r>
     </w:p>
     <w:p>
@@ -163,7 +163,7 @@
         <w:pStyle w:val="BodyText"/>
       </w:pPr>
       <w:r>
-        <w:t xml:space="preserve">From the start, we wanted Efficiency+ to be different from a typical methods-focused working group. Our scope is deliberately cross-functional. We care about the intersection of statistics with clinical operations, drug supply, regulatory planning, and data management. The</w:t>
+        <w:t xml:space="preserve">From the start, we wanted Efficiency+ to be different from a typical methods-focused working group. Our scope is deliberately cross-functional. We care about the intersection of statistics with clinical operations, drug supply, regulatory planning, data management, and functions supporting other clinical operations. The</w:t>
       </w:r>
       <w:r>
         <w:t xml:space="preserve"> </w:t>
@@ -220,7 +220,7 @@
         <w:pStyle w:val="FirstParagraph"/>
       </w:pPr>
       <w:r>
-        <w:t xml:space="preserve">After our kickoff, we surveyed members to identify the most pressing topics. The results were clear and four focus areas emerged. We then organized our group into corresponding workstreams:</w:t>
+        <w:t xml:space="preserve">After our kickoff, we surveyed members to identify the most pressing topics. The results were clear and four focus areas emerged. We then organized our group into the corresponding workstreams:</w:t>
       </w:r>
     </w:p>
     <w:p>
@@ -352,7 +352,7 @@
         <w:pStyle w:val="BodyText"/>
       </w:pPr>
       <w:r>
-        <w:t xml:space="preserve">Drug supply planning is one of the most impactful yet underappreciated areas where statistical innovation can make a difference. This workstream is developing simulation-based approaches to forecast drug demand, optimize vial configurations, and reduce waste, potentially saving millions per program.</w:t>
+        <w:t xml:space="preserve">Drug supply planning is one of the most impactful yet underappreciated areas where statistical innovation can make a difference. This workstream is developing simulation-based approaches to forecast drug demand, optimize vial configurations, and reduce waste, potentially saving millions of dollars per program.</w:t>
       </w:r>
     </w:p>
     <w:bookmarkEnd w:id="23"/>
@@ -615,7 +615,7 @@
         <w:t xml:space="preserve"> </w:t>
       </w:r>
       <w:r>
-        <w:t xml:space="preserve">their methodology improves (e.g., adaptive site activation, ML-based enrollment forecasting, kit-specific safety stock policies) as structured specifications, and AI-assisted coding tools translate those specs into working simulation modules. This lets methodology experts contribute without needing to write code themselves, while enabling rigorous comparison of isolated versus integrated improvements. The vision is one platform, four teams, infinite scenarios, where simulation becomes the common language that proves the value of each team’s contribution and reveals synergies across them. This tool is still a work in progress, with active development ongoing across the working group.</w:t>
+        <w:t xml:space="preserve">their methodology improves (e.g., adaptive site activation, ML-based enrollment forecasting, kit-specific safety stock policies) as structured specifications, and AI-assisted coding tools translate those specs into working simulation modules. This lets methodology experts contribute without needing to write code themselves, while enabling rigorous comparison of isolated versus integrated improvements. The vision is one platform, four teams, infinite scenarios, where simulation becomes the common language that proves the value of each team’s contribution and reveals synergies across them. This tool is still work in progress, with active development ongoing across the working group.</w:t>
       </w:r>
     </w:p>
     <w:p>

</xml_diff>

<commit_message>
Incorporate Crystal Shaw v2 edits: language tightening, remove X/Twitter
</commit_message>
<xml_diff>
--- a/publications/biopharm_report_spring2026/article.docx
+++ b/publications/biopharm_report_spring2026/article.docx
@@ -56,7 +56,7 @@
         <w:pStyle w:val="FirstParagraph"/>
       </w:pPr>
       <w:r>
-        <w:t xml:space="preserve">Here is a question that most statisticians have probably never been asked:</w:t>
+        <w:t xml:space="preserve">Most clinical trial statisticians have probably never been asked:</w:t>
       </w:r>
       <w:r>
         <w:t xml:space="preserve"> </w:t>
@@ -116,7 +116,7 @@
         <w:pStyle w:val="BodyText"/>
       </w:pPr>
       <w:r>
-        <w:t xml:space="preserve">Statisticians are well-equipped to contribute innovative solutions to address operational inefficiencies. That is why we started</w:t>
+        <w:t xml:space="preserve">Statisticians are well-equipped to contribute innovative solutions to address operational inefficiencies. This motivated the formation of</w:t>
       </w:r>
       <w:r>
         <w:t xml:space="preserve"> </w:t>
@@ -163,7 +163,7 @@
         <w:pStyle w:val="BodyText"/>
       </w:pPr>
       <w:r>
-        <w:t xml:space="preserve">From the start, we wanted Efficiency+ to be different from a typical methods-focused working group. Our scope is deliberately cross-functional. We care about the intersection of statistics with clinical operations, drug supply, regulatory planning, data management, and functions supporting other clinical operations. The</w:t>
+        <w:t xml:space="preserve">From the start, we wanted Efficiency+ to be different from a typical methods-focused working group. Our scope is deliberately cross-functional, emphasizing the intersection of statistics with clinical operations, drug supply, regulatory planning, data management, and functions supporting other clinical operations. The</w:t>
       </w:r>
       <w:r>
         <w:t xml:space="preserve"> </w:t>
@@ -175,7 +175,7 @@
         <w:t xml:space="preserve"> </w:t>
       </w:r>
       <w:r>
-        <w:t xml:space="preserve">in our name reflects the statisticians plus the collaborators and domains we need to work with to move the needle.</w:t>
+        <w:t xml:space="preserve">in our name reflects the statisticians plus the collaborators and domains needed to move the needle.</w:t>
       </w:r>
     </w:p>
     <w:bookmarkEnd w:id="21"/>
@@ -220,7 +220,7 @@
         <w:pStyle w:val="FirstParagraph"/>
       </w:pPr>
       <w:r>
-        <w:t xml:space="preserve">After our kickoff, we surveyed members to identify the most pressing topics. The results were clear and four focus areas emerged. We then organized our group into the corresponding workstreams:</w:t>
+        <w:t xml:space="preserve">After our kickoff, we surveyed members to identify the most pressing topics. Four focus areas emerged, and the group was organized into the corresponding workstreams:</w:t>
       </w:r>
     </w:p>
     <w:p>
@@ -259,10 +259,7 @@
         <w:t xml:space="preserve">(Anisimov, 2020)</w:t>
       </w:r>
       <w:r>
-        <w:t xml:space="preserve"> </w:t>
-      </w:r>
-      <w:r>
-        <w:t xml:space="preserve">and the team is working toward a comparative review of forecasting methodologies.</w:t>
+        <w:t xml:space="preserve">, and the team is working toward a comparative review of forecasting methodologies.</w:t>
       </w:r>
     </w:p>
     <w:p>
@@ -438,7 +435,7 @@
         <w:t xml:space="preserve"> </w:t>
       </w:r>
       <w:r>
-        <w:t xml:space="preserve">The session featured talks by Inna Perevozskaya (BMS) on trial monitoring methods, Vlad Anisimov (Amgen) on recruitment forecasting, Forrest Williamson (Eli Lilly) on pediatric trial challenges, and Ziqian Geng (AbbVie) on randomization in platform trials, with Kyle Wathen (Cytel) chairing. We generated great discussion with the audience, and the conversations are just beginning! We have more sessions coming this year:</w:t>
+        <w:t xml:space="preserve">The session featured talks by Inna Perevozskaya (BMS) on trial monitoring methods, Vlad Anisimov (Amgen) on recruitment forecasting, Forrest Williamson (Eli Lilly) on pediatric trial challenges, and Ziqian Geng (AbbVie) on randomization in platform trials, with Kyle Wathen (Cytel) chairing. We generated great discussion with the ENAR audience, and we look forward to more conversations at these upcoming Efficiency+ sessions:</w:t>
       </w:r>
     </w:p>
     <w:p>
@@ -570,7 +567,7 @@
         <w:t xml:space="preserve"> </w:t>
       </w:r>
       <w:r>
-        <w:t xml:space="preserve">We have been developing a clinical trial simulation engine in R (the</w:t>
+        <w:t xml:space="preserve">We are developing a clinical trial simulation engine in R (the</w:t>
       </w:r>
       <w:r>
         <w:t xml:space="preserve"> </w:t>
@@ -615,7 +612,7 @@
         <w:t xml:space="preserve"> </w:t>
       </w:r>
       <w:r>
-        <w:t xml:space="preserve">their methodology improves (e.g., adaptive site activation, ML-based enrollment forecasting, kit-specific safety stock policies) as structured specifications, and AI-assisted coding tools translate those specs into working simulation modules. This lets methodology experts contribute without needing to write code themselves, while enabling rigorous comparison of isolated versus integrated improvements. The vision is one platform, four teams, infinite scenarios, where simulation becomes the common language that proves the value of each team’s contribution and reveals synergies across them. This tool is still work in progress, with active development ongoing across the working group.</w:t>
+        <w:t xml:space="preserve">their methodology improves (e.g., adaptive site activation, ML-based enrollment forecasting, kit-specific safety stock policies) as structured specifications, and AI-assisted coding tools translate those specs into working simulation modules. This allows methodology experts to contribute without the necessity of writing code, while enabling rigorous comparison of isolated versus integrated improvements. The vision is one platform, four teams, infinite scenarios, where simulation becomes the common language that proves the value of each team’s contribution and reveals synergies across them. This tool is still work in progress, with active development ongoing across the working group.</w:t>
       </w:r>
     </w:p>
     <w:p>
@@ -637,7 +634,7 @@
       </w:r>
     </w:p>
     <w:bookmarkEnd w:id="25"/>
-    <w:bookmarkStart w:id="30" w:name="find-us-online"/>
+    <w:bookmarkStart w:id="29" w:name="find-us-online"/>
     <w:p>
       <w:pPr>
         <w:pStyle w:val="Heading2"/>
@@ -667,10 +664,10 @@
           <w:b/>
           <w:bCs/>
         </w:rPr>
-        <w:t xml:space="preserve">X (Twitter)</w:t>
-      </w:r>
-      <w:r>
-        <w:t xml:space="preserve">: Follow us at</w:t>
+        <w:t xml:space="preserve">LinkedIn</w:t>
+      </w:r>
+      <w:r>
+        <w:t xml:space="preserve">: Connect with us at</w:t>
       </w:r>
       <w:r>
         <w:t xml:space="preserve"> </w:t>
@@ -680,7 +677,7 @@
           <w:b/>
           <w:bCs/>
         </w:rPr>
-        <w:t xml:space="preserve">@efficiencyplus</w:t>
+        <w:t xml:space="preserve">@efficiency-plus-trials</w:t>
       </w:r>
       <w:r>
         <w:t xml:space="preserve"> </w:t>
@@ -689,52 +686,6 @@
         <w:t xml:space="preserve">(</w:t>
       </w:r>
       <w:hyperlink r:id="rId26">
-        <w:r>
-          <w:rPr>
-            <w:rStyle w:val="Hyperlink"/>
-          </w:rPr>
-          <w:t xml:space="preserve">x.com/efficiencyplus</w:t>
-        </w:r>
-      </w:hyperlink>
-      <w:r>
-        <w:t xml:space="preserve">) for session highlights, working group milestones, and new publications</w:t>
-      </w:r>
-    </w:p>
-    <w:p>
-      <w:pPr>
-        <w:pStyle w:val="Compact"/>
-        <w:numPr>
-          <w:ilvl w:val="0"/>
-          <w:numId w:val="1002"/>
-        </w:numPr>
-      </w:pPr>
-      <w:r>
-        <w:rPr>
-          <w:b/>
-          <w:bCs/>
-        </w:rPr>
-        <w:t xml:space="preserve">LinkedIn</w:t>
-      </w:r>
-      <w:r>
-        <w:t xml:space="preserve">: Connect with us at</w:t>
-      </w:r>
-      <w:r>
-        <w:t xml:space="preserve"> </w:t>
-      </w:r>
-      <w:r>
-        <w:rPr>
-          <w:b/>
-          <w:bCs/>
-        </w:rPr>
-        <w:t xml:space="preserve">@efficiency-plus-trials</w:t>
-      </w:r>
-      <w:r>
-        <w:t xml:space="preserve"> </w:t>
-      </w:r>
-      <w:r>
-        <w:t xml:space="preserve">(</w:t>
-      </w:r>
-      <w:hyperlink r:id="rId27">
         <w:r>
           <w:rPr>
             <w:rStyle w:val="Hyperlink"/>
@@ -767,7 +718,7 @@
       <w:r>
         <w:t xml:space="preserve"> </w:t>
       </w:r>
-      <w:hyperlink r:id="rId28">
+      <w:hyperlink r:id="rId27">
         <w:r>
           <w:rPr>
             <w:rStyle w:val="Hyperlink"/>
@@ -803,7 +754,7 @@
       <w:r>
         <w:t xml:space="preserve"> </w:t>
       </w:r>
-      <w:hyperlink r:id="rId29">
+      <w:hyperlink r:id="rId28">
         <w:r>
           <w:rPr>
             <w:rStyle w:val="Hyperlink"/>
@@ -826,8 +777,8 @@
         <w:t xml:space="preserve">We promote our work through these channels and through the ASA BIOP section’s own communications, including the AMSTAT newsletter and conference announcements.</w:t>
       </w:r>
     </w:p>
-    <w:bookmarkEnd w:id="30"/>
-    <w:bookmarkStart w:id="31" w:name="where-we-are-headed"/>
+    <w:bookmarkEnd w:id="29"/>
+    <w:bookmarkStart w:id="30" w:name="where-we-are-headed"/>
     <w:p>
       <w:pPr>
         <w:pStyle w:val="Heading2"/>
@@ -923,7 +874,7 @@
           <w:b/>
           <w:bCs/>
         </w:rPr>
-        <w:t xml:space="preserve">Cross-working-group collaboration</w:t>
+        <w:t xml:space="preserve">Cross-working group collaboration</w:t>
       </w:r>
       <w:r>
         <w:t xml:space="preserve"> </w:t>
@@ -932,8 +883,8 @@
         <w:t xml:space="preserve">- working with other ASA BIOP SWGs (e.g., Safety, Bayesian, Software Engineering) on shared challenges</w:t>
       </w:r>
     </w:p>
-    <w:bookmarkEnd w:id="31"/>
-    <w:bookmarkStart w:id="33" w:name="join-us"/>
+    <w:bookmarkEnd w:id="30"/>
+    <w:bookmarkStart w:id="32" w:name="join-us"/>
     <w:p>
       <w:pPr>
         <w:pStyle w:val="Heading2"/>
@@ -1024,7 +975,7 @@
       <w:r>
         <w:t xml:space="preserve"> </w:t>
       </w:r>
-      <w:hyperlink r:id="rId32">
+      <w:hyperlink r:id="rId31">
         <w:r>
           <w:rPr>
             <w:rStyle w:val="Hyperlink"/>
@@ -1038,7 +989,7 @@
       <w:r>
         <w:t xml:space="preserve"> </w:t>
       </w:r>
-      <w:hyperlink r:id="rId28">
+      <w:hyperlink r:id="rId27">
         <w:r>
           <w:rPr>
             <w:rStyle w:val="Hyperlink"/>
@@ -1047,11 +998,11 @@
         </w:r>
       </w:hyperlink>
       <w:r>
-        <w:t xml:space="preserve">, or find us at any of our upcoming conference sessions. We are building something that we think can genuinely change how our industry runs clinical trials. The more perspectives we have at the table, the better.</w:t>
-      </w:r>
-    </w:p>
-    <w:bookmarkEnd w:id="33"/>
-    <w:bookmarkStart w:id="34" w:name="acknowledgments"/>
+        <w:t xml:space="preserve">, or find us at any of our upcoming conference sessions. We are building something that we believe can genuinely change how our industry runs clinical trials. The more perspectives we have at the table, the better.</w:t>
+      </w:r>
+    </w:p>
+    <w:bookmarkEnd w:id="32"/>
+    <w:bookmarkStart w:id="33" w:name="acknowledgments"/>
     <w:p>
       <w:pPr>
         <w:pStyle w:val="Heading2"/>
@@ -1065,12 +1016,12 @@
         <w:pStyle w:val="FirstParagraph"/>
       </w:pPr>
       <w:r>
-        <w:t xml:space="preserve">The author thanks all members of the Efficiency+ Scientific Working Group for their contributions and enthusiasm in the group’s first year. Efficiency+ was co-founded by Fei Chen (Johnson &amp; Johnson) and Bohdana Ratitch (Bayer), who jointly developed the original proposal and led the working group through its formation. Bohdana has since stepped down from her co-chair role, and her contributions to launching this initiative are gratefully acknowledged. Clara Cali Mella (Bayer) has stepped in as co-chair to continue the partnership. Special thanks to our group advisors; Jose Pinheiro, Inna Perevozskaya (BMS), and Benjamin Hofner (PEI), for their guidance; to the workstream leads; Clara Cali Mella, Vlad Anisimov, Palanikumar Ravindran, Dooti Roy, and Christi Kleoudis; to our communication leads, Crystal Shaw and Leanne Goldstein (Amgen), for building our presence on LinkedIn and X; and to Kyle Wathen (Cytel) for chairing our ENAR session. Thanks also to the ASA Biopharmaceutical Section for supporting this initiative. We are grateful to each of our member companies for investing their people’s time and expertise in this initiative - Efficiency+ exists because our sponsors recognize that improving trial operations is a shared challenge worth solving together. A full list of Efficiency+ members and their affiliations can be found on our GitHub repository at</w:t>
-      </w:r>
-      <w:r>
-        <w:t xml:space="preserve"> </w:t>
-      </w:r>
-      <w:hyperlink r:id="rId29">
+        <w:t xml:space="preserve">The author thanks all members of the Efficiency+ Scientific Working Group for their contributions and enthusiasm in the group’s first year. Efficiency+ was co-founded by Fei Chen (Johnson &amp; Johnson) and Bohdana Ratitch (Bayer), who jointly developed the original proposal and led the working group through its formation. Bohdana has since stepped down from her co-chair role, and her contributions to launching this initiative are gratefully acknowledged. Clara Cali Mella (Bayer) has stepped in as co-chair to continue the partnership. Special thanks to our group advisors; Jose Pinheiro, Inna Perevozskaya (BMS), and Benjamin Hofner (PEI), for their guidance; to the workstream leads; Clara Cali Mella, Vlad Anisimov, Palanikumar Ravindran, Dooti Roy, and Christi Kleoudis; to our communication leads, Crystal Shaw and Leanne Goldstein (Amgen), for building our presence on LinkedIn; and to Kyle Wathen (Cytel) for chairing our ENAR session. Thanks also to the ASA Biopharmaceutical Section for supporting this initiative. We are grateful to each of our member companies for investing their people’s time and expertise in this initiative - Efficiency+ exists because our sponsors recognize that improving trial operations is a shared challenge worth solving together. A full list of Efficiency+ members and their affiliations can be found on our GitHub repository at</w:t>
+      </w:r>
+      <w:r>
+        <w:t xml:space="preserve"> </w:t>
+      </w:r>
+      <w:hyperlink r:id="rId28">
         <w:r>
           <w:rPr>
             <w:rStyle w:val="Hyperlink"/>
@@ -1082,8 +1033,8 @@
         <w:t xml:space="preserve">.</w:t>
       </w:r>
     </w:p>
-    <w:bookmarkEnd w:id="34"/>
-    <w:bookmarkStart w:id="43" w:name="references"/>
+    <w:bookmarkEnd w:id="33"/>
+    <w:bookmarkStart w:id="42" w:name="references"/>
     <w:p>
       <w:pPr>
         <w:pStyle w:val="Heading2"/>
@@ -1092,8 +1043,8 @@
         <w:t xml:space="preserve">References</w:t>
       </w:r>
     </w:p>
-    <w:bookmarkStart w:id="42" w:name="refs"/>
-    <w:bookmarkStart w:id="36" w:name="ref-anisimov2020"/>
+    <w:bookmarkStart w:id="41" w:name="refs"/>
+    <w:bookmarkStart w:id="35" w:name="ref-anisimov2020"/>
     <w:p>
       <w:pPr>
         <w:pStyle w:val="Bibliography"/>
@@ -1120,7 +1071,7 @@
       <w:r>
         <w:t xml:space="preserve"> </w:t>
       </w:r>
-      <w:hyperlink r:id="rId35">
+      <w:hyperlink r:id="rId34">
         <w:r>
           <w:rPr>
             <w:rStyle w:val="Hyperlink"/>
@@ -1129,8 +1080,8 @@
         </w:r>
       </w:hyperlink>
     </w:p>
-    <w:bookmarkEnd w:id="36"/>
-    <w:bookmarkStart w:id="37" w:name="ref-efficiencyplus_website"/>
+    <w:bookmarkEnd w:id="35"/>
+    <w:bookmarkStart w:id="36" w:name="ref-efficiencyplus_website"/>
     <w:p>
       <w:pPr>
         <w:pStyle w:val="Bibliography"/>
@@ -1154,7 +1105,7 @@
       <w:r>
         <w:t xml:space="preserve"> </w:t>
       </w:r>
-      <w:hyperlink r:id="rId28">
+      <w:hyperlink r:id="rId27">
         <w:r>
           <w:rPr>
             <w:rStyle w:val="Hyperlink"/>
@@ -1163,8 +1114,8 @@
         </w:r>
       </w:hyperlink>
     </w:p>
-    <w:bookmarkEnd w:id="37"/>
-    <w:bookmarkStart w:id="39" w:name="ref-lamberti2024"/>
+    <w:bookmarkEnd w:id="36"/>
+    <w:bookmarkStart w:id="38" w:name="ref-lamberti2024"/>
     <w:p>
       <w:pPr>
         <w:pStyle w:val="Bibliography"/>
@@ -1201,7 +1152,7 @@
       <w:r>
         <w:t xml:space="preserve"> </w:t>
       </w:r>
-      <w:hyperlink r:id="rId38">
+      <w:hyperlink r:id="rId37">
         <w:r>
           <w:rPr>
             <w:rStyle w:val="Hyperlink"/>
@@ -1210,8 +1161,8 @@
         </w:r>
       </w:hyperlink>
     </w:p>
-    <w:bookmarkEnd w:id="39"/>
-    <w:bookmarkStart w:id="41" w:name="ref-mckinsey2021"/>
+    <w:bookmarkEnd w:id="38"/>
+    <w:bookmarkStart w:id="40" w:name="ref-mckinsey2021"/>
     <w:p>
       <w:pPr>
         <w:pStyle w:val="Bibliography"/>
@@ -1235,7 +1186,7 @@
       <w:r>
         <w:t xml:space="preserve"> </w:t>
       </w:r>
-      <w:hyperlink r:id="rId40">
+      <w:hyperlink r:id="rId39">
         <w:r>
           <w:rPr>
             <w:rStyle w:val="Hyperlink"/>
@@ -1244,9 +1195,9 @@
         </w:r>
       </w:hyperlink>
     </w:p>
+    <w:bookmarkEnd w:id="40"/>
     <w:bookmarkEnd w:id="41"/>
     <w:bookmarkEnd w:id="42"/>
-    <w:bookmarkEnd w:id="43"/>
     <w:sectPr>
       <w:footnotePr>
         <w:numRestart w:val="eachSect"/>

</xml_diff>

<commit_message>
Add LinkedIn QR code to Find Us Online section
</commit_message>
<xml_diff>
--- a/publications/biopharm_report_spring2026/article.docx
+++ b/publications/biopharm_report_spring2026/article.docx
@@ -634,7 +634,7 @@
       </w:r>
     </w:p>
     <w:bookmarkEnd w:id="25"/>
-    <w:bookmarkStart w:id="29" w:name="find-us-online"/>
+    <w:bookmarkStart w:id="32" w:name="find-us-online"/>
     <w:p>
       <w:pPr>
         <w:pStyle w:val="Heading2"/>
@@ -699,12 +699,59 @@
     </w:p>
     <w:p>
       <w:pPr>
-        <w:pStyle w:val="Compact"/>
-        <w:numPr>
-          <w:ilvl w:val="0"/>
-          <w:numId w:val="1002"/>
-        </w:numPr>
-      </w:pPr>
+        <w:pStyle w:val="FirstParagraph"/>
+      </w:pPr>
+      <w:r>
+        <w:drawing>
+          <wp:inline>
+            <wp:extent cx="1600200" cy="1600200"/>
+            <wp:effectExtent b="0" l="0" r="0" t="0"/>
+            <wp:docPr descr="Scan to follow Efficiency+ on LinkedIn" title="" id="28" name="Picture"/>
+            <a:graphic>
+              <a:graphicData uri="http://schemas.openxmlformats.org/drawingml/2006/picture">
+                <pic:pic>
+                  <pic:nvPicPr>
+                    <pic:cNvPr descr="QR.png" id="29" name="Picture"/>
+                    <pic:cNvPicPr>
+                      <a:picLocks noChangeArrowheads="1" noChangeAspect="1"/>
+                    </pic:cNvPicPr>
+                  </pic:nvPicPr>
+                  <pic:blipFill>
+                    <a:blip r:embed="rId27"/>
+                    <a:stretch>
+                      <a:fillRect/>
+                    </a:stretch>
+                  </pic:blipFill>
+                  <pic:spPr bwMode="auto">
+                    <a:xfrm>
+                      <a:off x="0" y="0"/>
+                      <a:ext cx="1600200" cy="1600200"/>
+                    </a:xfrm>
+                    <a:prstGeom prst="rect">
+                      <a:avLst/>
+                    </a:prstGeom>
+                    <a:noFill/>
+                    <a:ln w="9525">
+                      <a:noFill/>
+                      <a:headEnd/>
+                      <a:tailEnd/>
+                    </a:ln>
+                  </pic:spPr>
+                </pic:pic>
+              </a:graphicData>
+            </a:graphic>
+          </wp:inline>
+        </w:drawing>
+      </w:r>
+      <w:r>
+        <w:t xml:space="preserve"> </w:t>
+      </w:r>
+      <w:r>
+        <w:t xml:space="preserve">-</w:t>
+      </w:r>
+      <w:r>
+        <w:t xml:space="preserve"> </w:t>
+      </w:r>
       <w:r>
         <w:rPr>
           <w:b/>
@@ -718,7 +765,7 @@
       <w:r>
         <w:t xml:space="preserve"> </w:t>
       </w:r>
-      <w:hyperlink r:id="rId27">
+      <w:hyperlink r:id="rId30">
         <w:r>
           <w:rPr>
             <w:rStyle w:val="Hyperlink"/>
@@ -732,15 +779,15 @@
       <w:r>
         <w:t xml:space="preserve">serves as a hub for our mission, focus areas, and resources</w:t>
       </w:r>
-    </w:p>
-    <w:p>
-      <w:pPr>
-        <w:pStyle w:val="Compact"/>
-        <w:numPr>
-          <w:ilvl w:val="0"/>
-          <w:numId w:val="1002"/>
-        </w:numPr>
-      </w:pPr>
+      <w:r>
+        <w:t xml:space="preserve"> </w:t>
+      </w:r>
+      <w:r>
+        <w:t xml:space="preserve">-</w:t>
+      </w:r>
+      <w:r>
+        <w:t xml:space="preserve"> </w:t>
+      </w:r>
       <w:r>
         <w:rPr>
           <w:b/>
@@ -754,7 +801,7 @@
       <w:r>
         <w:t xml:space="preserve"> </w:t>
       </w:r>
-      <w:hyperlink r:id="rId28">
+      <w:hyperlink r:id="rId31">
         <w:r>
           <w:rPr>
             <w:rStyle w:val="Hyperlink"/>
@@ -771,14 +818,14 @@
     </w:p>
     <w:p>
       <w:pPr>
-        <w:pStyle w:val="FirstParagraph"/>
+        <w:pStyle w:val="BodyText"/>
       </w:pPr>
       <w:r>
         <w:t xml:space="preserve">We promote our work through these channels and through the ASA BIOP section’s own communications, including the AMSTAT newsletter and conference announcements.</w:t>
       </w:r>
     </w:p>
-    <w:bookmarkEnd w:id="29"/>
-    <w:bookmarkStart w:id="30" w:name="where-we-are-headed"/>
+    <w:bookmarkEnd w:id="32"/>
+    <w:bookmarkStart w:id="33" w:name="where-we-are-headed"/>
     <w:p>
       <w:pPr>
         <w:pStyle w:val="Heading2"/>
@@ -883,8 +930,8 @@
         <w:t xml:space="preserve">- working with other ASA BIOP SWGs (e.g., Safety, Bayesian, Software Engineering) on shared challenges</w:t>
       </w:r>
     </w:p>
-    <w:bookmarkEnd w:id="30"/>
-    <w:bookmarkStart w:id="32" w:name="join-us"/>
+    <w:bookmarkEnd w:id="33"/>
+    <w:bookmarkStart w:id="35" w:name="join-us"/>
     <w:p>
       <w:pPr>
         <w:pStyle w:val="Heading2"/>
@@ -975,7 +1022,7 @@
       <w:r>
         <w:t xml:space="preserve"> </w:t>
       </w:r>
-      <w:hyperlink r:id="rId31">
+      <w:hyperlink r:id="rId34">
         <w:r>
           <w:rPr>
             <w:rStyle w:val="Hyperlink"/>
@@ -989,7 +1036,7 @@
       <w:r>
         <w:t xml:space="preserve"> </w:t>
       </w:r>
-      <w:hyperlink r:id="rId27">
+      <w:hyperlink r:id="rId30">
         <w:r>
           <w:rPr>
             <w:rStyle w:val="Hyperlink"/>
@@ -1001,8 +1048,8 @@
         <w:t xml:space="preserve">, or find us at any of our upcoming conference sessions. We are building something that we believe can genuinely change how our industry runs clinical trials. The more perspectives we have at the table, the better.</w:t>
       </w:r>
     </w:p>
-    <w:bookmarkEnd w:id="32"/>
-    <w:bookmarkStart w:id="33" w:name="acknowledgments"/>
+    <w:bookmarkEnd w:id="35"/>
+    <w:bookmarkStart w:id="36" w:name="acknowledgments"/>
     <w:p>
       <w:pPr>
         <w:pStyle w:val="Heading2"/>
@@ -1021,7 +1068,7 @@
       <w:r>
         <w:t xml:space="preserve"> </w:t>
       </w:r>
-      <w:hyperlink r:id="rId28">
+      <w:hyperlink r:id="rId31">
         <w:r>
           <w:rPr>
             <w:rStyle w:val="Hyperlink"/>
@@ -1033,8 +1080,8 @@
         <w:t xml:space="preserve">.</w:t>
       </w:r>
     </w:p>
-    <w:bookmarkEnd w:id="33"/>
-    <w:bookmarkStart w:id="42" w:name="references"/>
+    <w:bookmarkEnd w:id="36"/>
+    <w:bookmarkStart w:id="45" w:name="references"/>
     <w:p>
       <w:pPr>
         <w:pStyle w:val="Heading2"/>
@@ -1043,8 +1090,8 @@
         <w:t xml:space="preserve">References</w:t>
       </w:r>
     </w:p>
-    <w:bookmarkStart w:id="41" w:name="refs"/>
-    <w:bookmarkStart w:id="35" w:name="ref-anisimov2020"/>
+    <w:bookmarkStart w:id="44" w:name="refs"/>
+    <w:bookmarkStart w:id="38" w:name="ref-anisimov2020"/>
     <w:p>
       <w:pPr>
         <w:pStyle w:val="Bibliography"/>
@@ -1071,7 +1118,7 @@
       <w:r>
         <w:t xml:space="preserve"> </w:t>
       </w:r>
-      <w:hyperlink r:id="rId34">
+      <w:hyperlink r:id="rId37">
         <w:r>
           <w:rPr>
             <w:rStyle w:val="Hyperlink"/>
@@ -1080,8 +1127,8 @@
         </w:r>
       </w:hyperlink>
     </w:p>
-    <w:bookmarkEnd w:id="35"/>
-    <w:bookmarkStart w:id="36" w:name="ref-efficiencyplus_website"/>
+    <w:bookmarkEnd w:id="38"/>
+    <w:bookmarkStart w:id="39" w:name="ref-efficiencyplus_website"/>
     <w:p>
       <w:pPr>
         <w:pStyle w:val="Bibliography"/>
@@ -1105,7 +1152,7 @@
       <w:r>
         <w:t xml:space="preserve"> </w:t>
       </w:r>
-      <w:hyperlink r:id="rId27">
+      <w:hyperlink r:id="rId30">
         <w:r>
           <w:rPr>
             <w:rStyle w:val="Hyperlink"/>
@@ -1114,8 +1161,8 @@
         </w:r>
       </w:hyperlink>
     </w:p>
-    <w:bookmarkEnd w:id="36"/>
-    <w:bookmarkStart w:id="38" w:name="ref-lamberti2024"/>
+    <w:bookmarkEnd w:id="39"/>
+    <w:bookmarkStart w:id="41" w:name="ref-lamberti2024"/>
     <w:p>
       <w:pPr>
         <w:pStyle w:val="Bibliography"/>
@@ -1152,7 +1199,7 @@
       <w:r>
         <w:t xml:space="preserve"> </w:t>
       </w:r>
-      <w:hyperlink r:id="rId37">
+      <w:hyperlink r:id="rId40">
         <w:r>
           <w:rPr>
             <w:rStyle w:val="Hyperlink"/>
@@ -1161,8 +1208,8 @@
         </w:r>
       </w:hyperlink>
     </w:p>
-    <w:bookmarkEnd w:id="38"/>
-    <w:bookmarkStart w:id="40" w:name="ref-mckinsey2021"/>
+    <w:bookmarkEnd w:id="41"/>
+    <w:bookmarkStart w:id="43" w:name="ref-mckinsey2021"/>
     <w:p>
       <w:pPr>
         <w:pStyle w:val="Bibliography"/>
@@ -1186,7 +1233,7 @@
       <w:r>
         <w:t xml:space="preserve"> </w:t>
       </w:r>
-      <w:hyperlink r:id="rId39">
+      <w:hyperlink r:id="rId42">
         <w:r>
           <w:rPr>
             <w:rStyle w:val="Hyperlink"/>
@@ -1195,9 +1242,9 @@
         </w:r>
       </w:hyperlink>
     </w:p>
-    <w:bookmarkEnd w:id="40"/>
-    <w:bookmarkEnd w:id="41"/>
-    <w:bookmarkEnd w:id="42"/>
+    <w:bookmarkEnd w:id="43"/>
+    <w:bookmarkEnd w:id="44"/>
+    <w:bookmarkEnd w:id="45"/>
     <w:sectPr>
       <w:footnotePr>
         <w:numRestart w:val="eachSect"/>

</xml_diff>

<commit_message>
Move QR code under author line, centered
</commit_message>
<xml_diff>
--- a/publications/biopharm_report_spring2026/article.docx
+++ b/publications/biopharm_report_spring2026/article.docx
@@ -42,682 +42,28 @@
         <w:t xml:space="preserve">On behalf of the Efficiency+ Scientific Working Group</w:t>
       </w:r>
     </w:p>
-    <w:bookmarkStart w:id="20" w:name="X0638d9fe13537368e9017707d49a40cb9515584"/>
-    <w:p>
-      <w:pPr>
-        <w:pStyle w:val="Heading2"/>
-      </w:pPr>
-      <w:r>
-        <w:t xml:space="preserve">Why Clinical Trial Operations Needs Statisticians</w:t>
-      </w:r>
-    </w:p>
-    <w:p>
-      <w:pPr>
-        <w:pStyle w:val="FirstParagraph"/>
-      </w:pPr>
-      <w:r>
-        <w:t xml:space="preserve">Most clinical trial statisticians have probably never been asked:</w:t>
-      </w:r>
-      <w:r>
-        <w:t xml:space="preserve"> </w:t>
-      </w:r>
-      <w:r>
-        <w:rPr>
-          <w:i/>
-          <w:iCs/>
-        </w:rPr>
-        <w:t xml:space="preserve">How many vials of drug should we ship to a site in Brazil next month?</w:t>
-      </w:r>
-      <w:r>
-        <w:t xml:space="preserve"> </w:t>
-      </w:r>
-      <w:r>
-        <w:t xml:space="preserve">Or:</w:t>
-      </w:r>
-      <w:r>
-        <w:t xml:space="preserve"> </w:t>
-      </w:r>
-      <w:r>
-        <w:rPr>
-          <w:i/>
-          <w:iCs/>
-        </w:rPr>
-        <w:t xml:space="preserve">Should we activate five more sites in Japan to stay on track for enrollment?</w:t>
-      </w:r>
-    </w:p>
-    <w:p>
-      <w:pPr>
-        <w:pStyle w:val="BodyText"/>
-      </w:pPr>
-      <w:r>
-        <w:t xml:space="preserve">These are clinical operations questions, but they are fundamentally statistical problems. For decades, operational decisions have been made largely by deterministic rules of thumb, spreadsheets, previous experience, and gut instinct. The result? sites are selected based on relationships rather than data; more than half of clinical trials globally fail to enroll on time, leading to costly extensions and opening of additional sites</w:t>
-      </w:r>
-      <w:r>
-        <w:t xml:space="preserve"> </w:t>
-      </w:r>
-      <w:r>
-        <w:t xml:space="preserve">(Lamberti et al., 2024)</w:t>
-      </w:r>
-      <w:r>
-        <w:t xml:space="preserve">; and drug supply waste in clinical trials is estimated at 50%</w:t>
-      </w:r>
-      <w:r>
-        <w:t xml:space="preserve"> </w:t>
-      </w:r>
-      <w:r>
-        <w:t xml:space="preserve">(McKinsey &amp; Company, 2021)</w:t>
-      </w:r>
-      <w:r>
-        <w:t xml:space="preserve">. The cost of these inefficiencies is staggering as delays alone can cost sponsors millions of dollars per day for a late-stage program.</w:t>
-      </w:r>
-    </w:p>
-    <w:p>
-      <w:pPr>
-        <w:pStyle w:val="BodyText"/>
-      </w:pPr>
-      <w:r>
-        <w:t xml:space="preserve">Statisticians are well-equipped to contribute innovative solutions to address operational inefficiencies. This motivated the formation of</w:t>
-      </w:r>
-      <w:r>
-        <w:t xml:space="preserve"> </w:t>
-      </w:r>
-      <w:r>
-        <w:rPr>
-          <w:b/>
-          <w:bCs/>
-        </w:rPr>
-        <w:t xml:space="preserve">Efficiency+</w:t>
-      </w:r>
-      <w:r>
-        <w:t xml:space="preserve">.</w:t>
-      </w:r>
-    </w:p>
-    <w:bookmarkEnd w:id="20"/>
-    <w:bookmarkStart w:id="21" w:name="how-we-got-here"/>
-    <w:p>
-      <w:pPr>
-        <w:pStyle w:val="Heading2"/>
-      </w:pPr>
-      <w:r>
-        <w:t xml:space="preserve">How We Got Here</w:t>
-      </w:r>
-    </w:p>
-    <w:p>
-      <w:pPr>
-        <w:pStyle w:val="FirstParagraph"/>
-      </w:pPr>
-      <w:r>
-        <w:t xml:space="preserve">The idea for Efficiency+ grew out of conversations among statisticians who found themselves increasingly involved in several aspects of operational decisions, including enrollment forecasting, site selection, and drug supply planning. Yet, there is no organized statistical community to share methods, compare approaches, or develop best practices.</w:t>
-      </w:r>
-    </w:p>
-    <w:p>
-      <w:pPr>
-        <w:pStyle w:val="BodyText"/>
-      </w:pPr>
-      <w:r>
-        <w:t xml:space="preserve">In early 2025, we submitted a proposal to the ASA Biopharmaceutical Section to form a new Scientific Working Group (SWG) focused on clinical trial operational efficiency. The proposal was approved and in July 2025 we held our kickoff meeting with about 20 members from over 10 pharmaceutical and biotech companies.</w:t>
-      </w:r>
-    </w:p>
-    <w:p>
-      <w:pPr>
-        <w:pStyle w:val="BodyText"/>
-      </w:pPr>
-      <w:r>
-        <w:t xml:space="preserve">From the start, we wanted Efficiency+ to be different from a typical methods-focused working group. Our scope is deliberately cross-functional, emphasizing the intersection of statistics with clinical operations, drug supply, regulatory planning, data management, and functions supporting other clinical operations. The</w:t>
-      </w:r>
-      <w:r>
-        <w:t xml:space="preserve"> </w:t>
-      </w:r>
-      <w:r>
-        <w:t xml:space="preserve">“+”</w:t>
-      </w:r>
-      <w:r>
-        <w:t xml:space="preserve"> </w:t>
-      </w:r>
-      <w:r>
-        <w:t xml:space="preserve">in our name reflects the statisticians plus the collaborators and domains needed to move the needle.</w:t>
-      </w:r>
-    </w:p>
-    <w:bookmarkEnd w:id="21"/>
-    <w:bookmarkStart w:id="22" w:name="our-mission"/>
-    <w:p>
-      <w:pPr>
-        <w:pStyle w:val="Heading2"/>
-      </w:pPr>
-      <w:r>
-        <w:t xml:space="preserve">Our Mission</w:t>
-      </w:r>
-    </w:p>
-    <w:p>
-      <w:pPr>
-        <w:pStyle w:val="FirstParagraph"/>
-      </w:pPr>
-      <w:r>
-        <w:t xml:space="preserve">Our mission is to advance clinical trial operations by championing cross-pharma and cross-functional collaborative research to drive statistical innovations. We are dedicated to fostering interdisciplinary progress in trial design and execution, ensuring the highest standards of study conduct. Through sharing insights, identifying gaps, and learning from one another, we aim to optimize efficiency, reduce waste, and ultimately accelerate the path from lab to patient</w:t>
-      </w:r>
-      <w:r>
-        <w:t xml:space="preserve"> </w:t>
-      </w:r>
-      <w:r>
-        <w:t xml:space="preserve">(Efficiency+ Scientific Working Group, 2025)</w:t>
-      </w:r>
-      <w:r>
-        <w:t xml:space="preserve">.</w:t>
-      </w:r>
-    </w:p>
-    <w:bookmarkEnd w:id="22"/>
-    <w:bookmarkStart w:id="23" w:name="workstreams"/>
-    <w:p>
-      <w:pPr>
-        <w:pStyle w:val="Heading2"/>
-      </w:pPr>
-      <w:r>
-        <w:t xml:space="preserve">Workstreams</w:t>
-      </w:r>
-    </w:p>
-    <w:p>
-      <w:pPr>
-        <w:pStyle w:val="FirstParagraph"/>
-      </w:pPr>
-      <w:r>
-        <w:t xml:space="preserve">After our kickoff, we surveyed members to identify the most pressing topics. Four focus areas emerged, and the group was organized into the corresponding workstreams:</w:t>
-      </w:r>
-    </w:p>
-    <w:p>
-      <w:pPr>
-        <w:pStyle w:val="BodyText"/>
-      </w:pPr>
-      <w:r>
-        <w:rPr>
-          <w:b/>
-          <w:bCs/>
-        </w:rPr>
-        <w:t xml:space="preserve">1. Patient Recruitment Monitoring and Forecasting, Site Selection</w:t>
-      </w:r>
-      <w:r>
-        <w:t xml:space="preserve"> </w:t>
-      </w:r>
-      <w:r>
-        <w:rPr>
-          <w:i/>
-          <w:iCs/>
-        </w:rPr>
-        <w:t xml:space="preserve">Led by Clara Cali Mella (Bayer) and Vlad Anisimov (Amgen)</w:t>
-      </w:r>
-    </w:p>
-    <w:p>
-      <w:pPr>
-        <w:pStyle w:val="BodyText"/>
-      </w:pPr>
-      <w:r>
-        <w:t xml:space="preserve">This topic drew the most interest. The team is tackling questions like: What are the best statistical models for enrollment forecasting? How do you combine historical data, real-world data, and accumulating trial data into a single forecast? How should site selection leverage predictive analytics rather than just investigator relationships? Vlad brings deep expertise in Poisson-gamma modeling for recruitment</w:t>
-      </w:r>
-      <w:r>
-        <w:t xml:space="preserve"> </w:t>
-      </w:r>
-      <w:r>
-        <w:t xml:space="preserve">(Anisimov, 2020)</w:t>
-      </w:r>
-      <w:r>
-        <w:t xml:space="preserve">, and the team is working toward a comparative review of forecasting methodologies.</w:t>
-      </w:r>
-    </w:p>
-    <w:p>
-      <w:pPr>
-        <w:pStyle w:val="BodyText"/>
-      </w:pPr>
-      <w:r>
-        <w:rPr>
-          <w:b/>
-          <w:bCs/>
-        </w:rPr>
-        <w:t xml:space="preserve">2. Dynamic Trial Monitoring and Data Quality</w:t>
-      </w:r>
-      <w:r>
-        <w:t xml:space="preserve"> </w:t>
-      </w:r>
-      <w:r>
-        <w:rPr>
-          <w:i/>
-          <w:iCs/>
-        </w:rPr>
-        <w:t xml:space="preserve">Led by Palanikumar Ravindran (BMS)</w:t>
-      </w:r>
-    </w:p>
-    <w:p>
-      <w:pPr>
-        <w:pStyle w:val="BodyText"/>
-      </w:pPr>
-      <w:r>
-        <w:t xml:space="preserve">This workstream focuses on using AI/ML and statistical methods for real-time risk detection during trial conduct, identifying underperforming sites early, predicting dropout patterns, and monitoring data quality signals. The goal is to move from reactive to proactive trial oversight.</w:t>
-      </w:r>
-    </w:p>
-    <w:p>
-      <w:pPr>
-        <w:pStyle w:val="BodyText"/>
-      </w:pPr>
-      <w:r>
-        <w:rPr>
-          <w:b/>
-          <w:bCs/>
-        </w:rPr>
-        <w:t xml:space="preserve">3. Study Design and Operations Impact</w:t>
-      </w:r>
-      <w:r>
-        <w:t xml:space="preserve"> </w:t>
-      </w:r>
-      <w:r>
-        <w:rPr>
-          <w:i/>
-          <w:iCs/>
-        </w:rPr>
-        <w:t xml:space="preserve">Led by Dooti Roy (Boehringer Ingelheim)</w:t>
-      </w:r>
-    </w:p>
-    <w:p>
-      <w:pPr>
-        <w:pStyle w:val="BodyText"/>
-      </w:pPr>
-      <w:r>
-        <w:t xml:space="preserve">Innovative trial designs (adaptive, platform, seamless) are statistically exciting but can create operational nightmares. This team examines the two-way relationship between design choices and operational execution, such as how design decisions affect timelines and resources, and how operational realities should inform design.</w:t>
-      </w:r>
-    </w:p>
-    <w:p>
-      <w:pPr>
-        <w:pStyle w:val="BodyText"/>
-      </w:pPr>
-      <w:r>
-        <w:rPr>
-          <w:b/>
-          <w:bCs/>
-        </w:rPr>
-        <w:t xml:space="preserve">4. Clinical Supply Chain</w:t>
-      </w:r>
-      <w:r>
-        <w:t xml:space="preserve"> </w:t>
-      </w:r>
-      <w:r>
-        <w:rPr>
-          <w:i/>
-          <w:iCs/>
-        </w:rPr>
-        <w:t xml:space="preserve">Led by Christi Kleoudis (AstraZeneca)</w:t>
-      </w:r>
-    </w:p>
-    <w:p>
-      <w:pPr>
-        <w:pStyle w:val="BodyText"/>
-      </w:pPr>
-      <w:r>
-        <w:t xml:space="preserve">Drug supply planning is one of the most impactful yet underappreciated areas where statistical innovation can make a difference. This workstream is developing simulation-based approaches to forecast drug demand, optimize vial configurations, and reduce waste, potentially saving millions of dollars per program.</w:t>
-      </w:r>
-    </w:p>
-    <w:bookmarkEnd w:id="23"/>
-    <w:bookmarkStart w:id="24" w:name="our-members"/>
-    <w:p>
-      <w:pPr>
-        <w:pStyle w:val="Heading2"/>
-      </w:pPr>
-      <w:r>
-        <w:t xml:space="preserve">Our Members</w:t>
-      </w:r>
-    </w:p>
-    <w:p>
-      <w:pPr>
-        <w:pStyle w:val="FirstParagraph"/>
-      </w:pPr>
-      <w:r>
-        <w:t xml:space="preserve">We are proud of the breadth of our membership, which exemplifies our vision for cross-industry, cross-functional collaboration. Efficiency+ currently includes about 20 active members from AbbVie, Amgen, AstraZeneca, Bayer, Beonemed, Boehringer Ingelheim, BMS, Cytel, Johnson &amp; Johnson, Eli Lilly, Regeneron, and Sanofi. Our membership comprises statisticians, data scientists, and clinical operations professionals, exactly the kind of cross-functional mix needed to make real progress.</w:t>
-      </w:r>
-    </w:p>
-    <w:bookmarkEnd w:id="24"/>
-    <w:bookmarkStart w:id="25" w:name="what-we-have-done-so-far"/>
-    <w:p>
-      <w:pPr>
-        <w:pStyle w:val="Heading2"/>
-      </w:pPr>
-      <w:r>
-        <w:t xml:space="preserve">What We Have Done So Far</w:t>
-      </w:r>
-    </w:p>
-    <w:p>
-      <w:pPr>
-        <w:pStyle w:val="FirstParagraph"/>
-      </w:pPr>
-      <w:r>
-        <w:t xml:space="preserve">It has been less than a year since our kickoff, but Efficiency+ has been quite productive in building presence in the research community:</w:t>
-      </w:r>
-    </w:p>
-    <w:p>
-      <w:pPr>
-        <w:pStyle w:val="BodyText"/>
-      </w:pPr>
-      <w:r>
-        <w:rPr>
-          <w:b/>
-          <w:bCs/>
-        </w:rPr>
-        <w:t xml:space="preserve">Conference Presence.</w:t>
-      </w:r>
-      <w:r>
-        <w:t xml:space="preserve"> </w:t>
-      </w:r>
-      <w:r>
-        <w:t xml:space="preserve">We just wrapped up a successful invited session at</w:t>
-      </w:r>
-      <w:r>
-        <w:t xml:space="preserve"> </w:t>
-      </w:r>
-      <w:r>
-        <w:rPr>
-          <w:b/>
-          <w:bCs/>
-        </w:rPr>
-        <w:t xml:space="preserve">ENAR 2026</w:t>
-      </w:r>
-      <w:r>
-        <w:t xml:space="preserve"> </w:t>
-      </w:r>
-      <w:r>
-        <w:t xml:space="preserve">(March 15-18, Indianapolis) titled</w:t>
-      </w:r>
-      <w:r>
-        <w:t xml:space="preserve"> </w:t>
-      </w:r>
-      <w:r>
-        <w:rPr>
-          <w:i/>
-          <w:iCs/>
-        </w:rPr>
-        <w:t xml:space="preserve">“Enhancing Clinical Trial Efficiency through Statistics, AI, and Collaborative Innovation.”</w:t>
-      </w:r>
-      <w:r>
-        <w:t xml:space="preserve"> </w:t>
-      </w:r>
-      <w:r>
-        <w:t xml:space="preserve">The session featured talks by Inna Perevozskaya (BMS) on trial monitoring methods, Vlad Anisimov (Amgen) on recruitment forecasting, Forrest Williamson (Eli Lilly) on pediatric trial challenges, and Ziqian Geng (AbbVie) on randomization in platform trials, with Kyle Wathen (Cytel) chairing. We generated great discussion with the ENAR audience, and we look forward to more conversations at these upcoming Efficiency+ sessions:</w:t>
-      </w:r>
-    </w:p>
-    <w:p>
-      <w:pPr>
-        <w:pStyle w:val="Compact"/>
-        <w:numPr>
-          <w:ilvl w:val="0"/>
-          <w:numId w:val="1001"/>
-        </w:numPr>
-      </w:pPr>
-      <w:r>
-        <w:rPr>
-          <w:b/>
-          <w:bCs/>
-        </w:rPr>
-        <w:t xml:space="preserve">IBC 2026</w:t>
-      </w:r>
-      <w:r>
-        <w:t xml:space="preserve"> </w:t>
-      </w:r>
-      <w:r>
-        <w:t xml:space="preserve">(July, Seoul) - Invited session introducing Efficiency+ and showcasing member research on enrollment forecasting, AI-driven monitoring, and statistical leadership in operations</w:t>
-      </w:r>
-    </w:p>
-    <w:p>
-      <w:pPr>
-        <w:pStyle w:val="Compact"/>
-        <w:numPr>
-          <w:ilvl w:val="0"/>
-          <w:numId w:val="1001"/>
-        </w:numPr>
-      </w:pPr>
-      <w:r>
-        <w:rPr>
-          <w:b/>
-          <w:bCs/>
-        </w:rPr>
-        <w:t xml:space="preserve">JSM 2026</w:t>
-      </w:r>
-      <w:r>
-        <w:t xml:space="preserve"> </w:t>
-      </w:r>
-      <w:r>
-        <w:t xml:space="preserve">(August, Boston) - Accepted invited session on</w:t>
-      </w:r>
-      <w:r>
-        <w:t xml:space="preserve"> </w:t>
-      </w:r>
-      <w:r>
-        <w:rPr>
-          <w:i/>
-          <w:iCs/>
-        </w:rPr>
-        <w:t xml:space="preserve">“Advancing Clinical Trial Operations through Innovative Statistical Methodologies”</w:t>
-      </w:r>
-    </w:p>
-    <w:p>
-      <w:pPr>
-        <w:pStyle w:val="Compact"/>
-        <w:numPr>
-          <w:ilvl w:val="0"/>
-          <w:numId w:val="1001"/>
-        </w:numPr>
-      </w:pPr>
-      <w:r>
-        <w:rPr>
-          <w:b/>
-          <w:bCs/>
-        </w:rPr>
-        <w:t xml:space="preserve">RISW 2026</w:t>
-      </w:r>
-      <w:r>
-        <w:t xml:space="preserve"> </w:t>
-      </w:r>
-      <w:r>
-        <w:t xml:space="preserve">(September, Rockville, MD) - Accepted invited session on</w:t>
-      </w:r>
-      <w:r>
-        <w:t xml:space="preserve"> </w:t>
-      </w:r>
-      <w:r>
-        <w:rPr>
-          <w:i/>
-          <w:iCs/>
-        </w:rPr>
-        <w:t xml:space="preserve">“Advanced Analytics for Operational Excellence”</w:t>
-      </w:r>
-      <w:r>
-        <w:t xml:space="preserve"> </w:t>
-      </w:r>
-      <w:r>
-        <w:t xml:space="preserve">covering recruitment, monitoring, design-operations interplay, and supply chain optimization</w:t>
-      </w:r>
-    </w:p>
-    <w:p>
-      <w:pPr>
-        <w:pStyle w:val="Compact"/>
-        <w:numPr>
-          <w:ilvl w:val="0"/>
-          <w:numId w:val="1001"/>
-        </w:numPr>
-      </w:pPr>
-      <w:r>
-        <w:rPr>
-          <w:b/>
-          <w:bCs/>
-        </w:rPr>
-        <w:t xml:space="preserve">SCOPE Europe 2026</w:t>
-      </w:r>
-      <w:r>
-        <w:t xml:space="preserve"> </w:t>
-      </w:r>
-      <w:r>
-        <w:t xml:space="preserve">(October, Barcelona) - Planning to submit a session proposal to this premier clinical operations summit, bringing our work directly to the operations community</w:t>
-      </w:r>
-    </w:p>
-    <w:p>
-      <w:pPr>
-        <w:pStyle w:val="FirstParagraph"/>
-      </w:pPr>
-      <w:r>
-        <w:rPr>
-          <w:b/>
-          <w:bCs/>
-        </w:rPr>
-        <w:t xml:space="preserve">Simulation Tools.</w:t>
-      </w:r>
-      <w:r>
-        <w:t xml:space="preserve"> </w:t>
-      </w:r>
-      <w:r>
-        <w:t xml:space="preserve">We are developing a clinical trial simulation engine in R (the</w:t>
-      </w:r>
-      <w:r>
-        <w:t xml:space="preserve"> </w:t>
-      </w:r>
-      <w:r>
-        <w:t xml:space="preserve">“CSC”</w:t>
-      </w:r>
-      <w:r>
-        <w:t xml:space="preserve"> </w:t>
-      </w:r>
-      <w:r>
-        <w:t xml:space="preserve">project) that provides end-to-end simulation capabilities, from site activation and patient enrollment through randomization, visit scheduling, and drug supply forecasting. The engine features 31 country-specific parameter types and Bayesian forecasting with JAGS integration. A key strength of the tool is its scenario planning capability: supply chain planners can explore the trade-off between probability of stock-out and amount of drug waste under different study designs and forecast/supply strategies, enabling more informed decision-making before and during a trial.</w:t>
-      </w:r>
-    </w:p>
-    <w:p>
-      <w:pPr>
-        <w:pStyle w:val="BodyText"/>
-      </w:pPr>
-      <w:r>
-        <w:t xml:space="preserve">Importantly, the CSC platform is not just a standalone tool. It is our integration backbone. Each of our four topic teams works on different aspects of trial operations, and the simulation engine serves as the common platform that ties all their work together. The approach is</w:t>
-      </w:r>
-      <w:r>
-        <w:t xml:space="preserve"> </w:t>
-      </w:r>
-      <w:r>
-        <w:t xml:space="preserve">“specification-first”</w:t>
-      </w:r>
-      <w:r>
-        <w:t xml:space="preserve">: each team defines</w:t>
-      </w:r>
-      <w:r>
-        <w:t xml:space="preserve"> </w:t>
-      </w:r>
-      <w:r>
-        <w:rPr>
-          <w:i/>
-          <w:iCs/>
-        </w:rPr>
-        <w:t xml:space="preserve">what</w:t>
-      </w:r>
-      <w:r>
-        <w:t xml:space="preserve"> </w:t>
-      </w:r>
-      <w:r>
-        <w:t xml:space="preserve">their methodology improves (e.g., adaptive site activation, ML-based enrollment forecasting, kit-specific safety stock policies) as structured specifications, and AI-assisted coding tools translate those specs into working simulation modules. This allows methodology experts to contribute without the necessity of writing code, while enabling rigorous comparison of isolated versus integrated improvements. The vision is one platform, four teams, infinite scenarios, where simulation becomes the common language that proves the value of each team’s contribution and reveals synergies across them. This tool is still work in progress, with active development ongoing across the working group.</w:t>
-      </w:r>
-    </w:p>
-    <w:p>
-      <w:pPr>
-        <w:pStyle w:val="BodyText"/>
-      </w:pPr>
-      <w:r>
-        <w:rPr>
-          <w:b/>
-          <w:bCs/>
-        </w:rPr>
-        <w:t xml:space="preserve">Reading Group.</w:t>
-      </w:r>
-      <w:r>
-        <w:t xml:space="preserve"> </w:t>
-      </w:r>
-      <w:r>
-        <w:t xml:space="preserve">We run a regular reading group where members discuss recent literature on clinical trial operations, keeping the group current on methods and sparking new research ideas.</w:t>
-      </w:r>
-    </w:p>
-    <w:bookmarkEnd w:id="25"/>
-    <w:bookmarkStart w:id="32" w:name="find-us-online"/>
-    <w:p>
-      <w:pPr>
-        <w:pStyle w:val="Heading2"/>
-      </w:pPr>
-      <w:r>
-        <w:t xml:space="preserve">Find Us Online</w:t>
-      </w:r>
-    </w:p>
-    <w:p>
-      <w:pPr>
-        <w:pStyle w:val="FirstParagraph"/>
-      </w:pPr>
-      <w:r>
-        <w:t xml:space="preserve">We are actively building our community presence beyond conferences:</w:t>
-      </w:r>
-    </w:p>
-    <w:p>
-      <w:pPr>
-        <w:pStyle w:val="Compact"/>
-        <w:numPr>
-          <w:ilvl w:val="0"/>
-          <w:numId w:val="1002"/>
-        </w:numPr>
-      </w:pPr>
-      <w:r>
-        <w:rPr>
-          <w:b/>
-          <w:bCs/>
-        </w:rPr>
-        <w:t xml:space="preserve">LinkedIn</w:t>
-      </w:r>
-      <w:r>
-        <w:t xml:space="preserve">: Connect with us at</w:t>
-      </w:r>
-      <w:r>
-        <w:t xml:space="preserve"> </w:t>
-      </w:r>
-      <w:r>
-        <w:rPr>
-          <w:b/>
-          <w:bCs/>
-        </w:rPr>
-        <w:t xml:space="preserve">@efficiency-plus-trials</w:t>
-      </w:r>
-      <w:r>
-        <w:t xml:space="preserve"> </w:t>
-      </w:r>
-      <w:r>
-        <w:t xml:space="preserve">(</w:t>
-      </w:r>
-      <w:hyperlink r:id="rId26">
-        <w:r>
-          <w:rPr>
-            <w:rStyle w:val="Hyperlink"/>
-          </w:rPr>
-          <w:t xml:space="preserve">linkedin.com/company/efficiency-plus-trials</w:t>
-        </w:r>
-      </w:hyperlink>
-      <w:r>
-        <w:t xml:space="preserve">) for updates on conference sessions, working group news, and member spotlights</w:t>
-      </w:r>
-    </w:p>
-    <w:p>
-      <w:pPr>
-        <w:pStyle w:val="FirstParagraph"/>
+    <w:p>
+      <w:pPr>
+        <w:pStyle w:val="CaptionedFigure"/>
+        <w:jc w:val="center"/>
       </w:pPr>
       <w:r>
         <w:drawing>
           <wp:inline>
-            <wp:extent cx="1600200" cy="1600200"/>
+            <wp:extent cx="1371600" cy="1371600"/>
             <wp:effectExtent b="0" l="0" r="0" t="0"/>
-            <wp:docPr descr="Scan to follow Efficiency+ on LinkedIn" title="" id="28" name="Picture"/>
+            <wp:docPr descr="Scan to follow Efficiency+ on LinkedIn" title="" id="21" name="Picture"/>
             <a:graphic>
               <a:graphicData uri="http://schemas.openxmlformats.org/drawingml/2006/picture">
                 <pic:pic>
                   <pic:nvPicPr>
-                    <pic:cNvPr descr="QR.png" id="29" name="Picture"/>
+                    <pic:cNvPr descr="QR.png" id="22" name="Picture"/>
                     <pic:cNvPicPr>
                       <a:picLocks noChangeArrowheads="1" noChangeAspect="1"/>
                     </pic:cNvPicPr>
                   </pic:nvPicPr>
                   <pic:blipFill>
-                    <a:blip r:embed="rId27"/>
+                    <a:blip r:embed="rId20"/>
                     <a:stretch>
                       <a:fillRect/>
                     </a:stretch>
@@ -725,7 +71,7 @@
                   <pic:spPr bwMode="auto">
                     <a:xfrm>
                       <a:off x="0" y="0"/>
-                      <a:ext cx="1600200" cy="1600200"/>
+                      <a:ext cx="1371600" cy="1371600"/>
                     </a:xfrm>
                     <a:prstGeom prst="rect">
                       <a:avLst/>
@@ -743,15 +89,678 @@
           </wp:inline>
         </w:drawing>
       </w:r>
-      <w:r>
-        <w:t xml:space="preserve"> </w:t>
-      </w:r>
-      <w:r>
-        <w:t xml:space="preserve">-</w:t>
-      </w:r>
-      <w:r>
-        <w:t xml:space="preserve"> </w:t>
-      </w:r>
+    </w:p>
+    <w:p>
+      <w:pPr>
+        <w:pStyle w:val="ImageCaption"/>
+      </w:pPr>
+      <w:r>
+        <w:t xml:space="preserve">Scan to follow Efficiency+ on LinkedIn</w:t>
+      </w:r>
+    </w:p>
+    <w:bookmarkStart w:id="23" w:name="X0638d9fe13537368e9017707d49a40cb9515584"/>
+    <w:p>
+      <w:pPr>
+        <w:pStyle w:val="Heading2"/>
+      </w:pPr>
+      <w:r>
+        <w:t xml:space="preserve">Why Clinical Trial Operations Needs Statisticians</w:t>
+      </w:r>
+    </w:p>
+    <w:p>
+      <w:pPr>
+        <w:pStyle w:val="FirstParagraph"/>
+      </w:pPr>
+      <w:r>
+        <w:t xml:space="preserve">Most clinical trial statisticians have probably never been asked:</w:t>
+      </w:r>
+      <w:r>
+        <w:t xml:space="preserve"> </w:t>
+      </w:r>
+      <w:r>
+        <w:rPr>
+          <w:i/>
+          <w:iCs/>
+        </w:rPr>
+        <w:t xml:space="preserve">How many vials of drug should we ship to a site in Brazil next month?</w:t>
+      </w:r>
+      <w:r>
+        <w:t xml:space="preserve"> </w:t>
+      </w:r>
+      <w:r>
+        <w:t xml:space="preserve">Or:</w:t>
+      </w:r>
+      <w:r>
+        <w:t xml:space="preserve"> </w:t>
+      </w:r>
+      <w:r>
+        <w:rPr>
+          <w:i/>
+          <w:iCs/>
+        </w:rPr>
+        <w:t xml:space="preserve">Should we activate five more sites in Japan to stay on track for enrollment?</w:t>
+      </w:r>
+    </w:p>
+    <w:p>
+      <w:pPr>
+        <w:pStyle w:val="BodyText"/>
+      </w:pPr>
+      <w:r>
+        <w:t xml:space="preserve">These are clinical operations questions, but they are fundamentally statistical problems. For decades, operational decisions have been made largely by deterministic rules of thumb, spreadsheets, previous experience, and gut instinct. The result? sites are selected based on relationships rather than data; more than half of clinical trials globally fail to enroll on time, leading to costly extensions and opening of additional sites</w:t>
+      </w:r>
+      <w:r>
+        <w:t xml:space="preserve"> </w:t>
+      </w:r>
+      <w:r>
+        <w:t xml:space="preserve">(Lamberti et al., 2024)</w:t>
+      </w:r>
+      <w:r>
+        <w:t xml:space="preserve">; and drug supply waste in clinical trials is estimated at 50%</w:t>
+      </w:r>
+      <w:r>
+        <w:t xml:space="preserve"> </w:t>
+      </w:r>
+      <w:r>
+        <w:t xml:space="preserve">(McKinsey &amp; Company, 2021)</w:t>
+      </w:r>
+      <w:r>
+        <w:t xml:space="preserve">. The cost of these inefficiencies is staggering as delays alone can cost sponsors millions of dollars per day for a late-stage program.</w:t>
+      </w:r>
+    </w:p>
+    <w:p>
+      <w:pPr>
+        <w:pStyle w:val="BodyText"/>
+      </w:pPr>
+      <w:r>
+        <w:t xml:space="preserve">Statisticians are well-equipped to contribute innovative solutions to address operational inefficiencies. This motivated the formation of</w:t>
+      </w:r>
+      <w:r>
+        <w:t xml:space="preserve"> </w:t>
+      </w:r>
+      <w:r>
+        <w:rPr>
+          <w:b/>
+          <w:bCs/>
+        </w:rPr>
+        <w:t xml:space="preserve">Efficiency+</w:t>
+      </w:r>
+      <w:r>
+        <w:t xml:space="preserve">.</w:t>
+      </w:r>
+    </w:p>
+    <w:bookmarkEnd w:id="23"/>
+    <w:bookmarkStart w:id="24" w:name="how-we-got-here"/>
+    <w:p>
+      <w:pPr>
+        <w:pStyle w:val="Heading2"/>
+      </w:pPr>
+      <w:r>
+        <w:t xml:space="preserve">How We Got Here</w:t>
+      </w:r>
+    </w:p>
+    <w:p>
+      <w:pPr>
+        <w:pStyle w:val="FirstParagraph"/>
+      </w:pPr>
+      <w:r>
+        <w:t xml:space="preserve">The idea for Efficiency+ grew out of conversations among statisticians who found themselves increasingly involved in several aspects of operational decisions, including enrollment forecasting, site selection, and drug supply planning. Yet, there is no organized statistical community to share methods, compare approaches, or develop best practices.</w:t>
+      </w:r>
+    </w:p>
+    <w:p>
+      <w:pPr>
+        <w:pStyle w:val="BodyText"/>
+      </w:pPr>
+      <w:r>
+        <w:t xml:space="preserve">In early 2025, we submitted a proposal to the ASA Biopharmaceutical Section to form a new Scientific Working Group (SWG) focused on clinical trial operational efficiency. The proposal was approved and in July 2025 we held our kickoff meeting with about 20 members from over 10 pharmaceutical and biotech companies.</w:t>
+      </w:r>
+    </w:p>
+    <w:p>
+      <w:pPr>
+        <w:pStyle w:val="BodyText"/>
+      </w:pPr>
+      <w:r>
+        <w:t xml:space="preserve">From the start, we wanted Efficiency+ to be different from a typical methods-focused working group. Our scope is deliberately cross-functional, emphasizing the intersection of statistics with clinical operations, drug supply, regulatory planning, data management, and functions supporting other clinical operations. The</w:t>
+      </w:r>
+      <w:r>
+        <w:t xml:space="preserve"> </w:t>
+      </w:r>
+      <w:r>
+        <w:t xml:space="preserve">“+”</w:t>
+      </w:r>
+      <w:r>
+        <w:t xml:space="preserve"> </w:t>
+      </w:r>
+      <w:r>
+        <w:t xml:space="preserve">in our name reflects the statisticians plus the collaborators and domains needed to move the needle.</w:t>
+      </w:r>
+    </w:p>
+    <w:bookmarkEnd w:id="24"/>
+    <w:bookmarkStart w:id="25" w:name="our-mission"/>
+    <w:p>
+      <w:pPr>
+        <w:pStyle w:val="Heading2"/>
+      </w:pPr>
+      <w:r>
+        <w:t xml:space="preserve">Our Mission</w:t>
+      </w:r>
+    </w:p>
+    <w:p>
+      <w:pPr>
+        <w:pStyle w:val="FirstParagraph"/>
+      </w:pPr>
+      <w:r>
+        <w:t xml:space="preserve">Our mission is to advance clinical trial operations by championing cross-pharma and cross-functional collaborative research to drive statistical innovations. We are dedicated to fostering interdisciplinary progress in trial design and execution, ensuring the highest standards of study conduct. Through sharing insights, identifying gaps, and learning from one another, we aim to optimize efficiency, reduce waste, and ultimately accelerate the path from lab to patient</w:t>
+      </w:r>
+      <w:r>
+        <w:t xml:space="preserve"> </w:t>
+      </w:r>
+      <w:r>
+        <w:t xml:space="preserve">(Efficiency+ Scientific Working Group, 2025)</w:t>
+      </w:r>
+      <w:r>
+        <w:t xml:space="preserve">.</w:t>
+      </w:r>
+    </w:p>
+    <w:bookmarkEnd w:id="25"/>
+    <w:bookmarkStart w:id="26" w:name="workstreams"/>
+    <w:p>
+      <w:pPr>
+        <w:pStyle w:val="Heading2"/>
+      </w:pPr>
+      <w:r>
+        <w:t xml:space="preserve">Workstreams</w:t>
+      </w:r>
+    </w:p>
+    <w:p>
+      <w:pPr>
+        <w:pStyle w:val="FirstParagraph"/>
+      </w:pPr>
+      <w:r>
+        <w:t xml:space="preserve">After our kickoff, we surveyed members to identify the most pressing topics. Four focus areas emerged, and the group was organized into the corresponding workstreams:</w:t>
+      </w:r>
+    </w:p>
+    <w:p>
+      <w:pPr>
+        <w:pStyle w:val="BodyText"/>
+      </w:pPr>
+      <w:r>
+        <w:rPr>
+          <w:b/>
+          <w:bCs/>
+        </w:rPr>
+        <w:t xml:space="preserve">1. Patient Recruitment Monitoring and Forecasting, Site Selection</w:t>
+      </w:r>
+      <w:r>
+        <w:t xml:space="preserve"> </w:t>
+      </w:r>
+      <w:r>
+        <w:rPr>
+          <w:i/>
+          <w:iCs/>
+        </w:rPr>
+        <w:t xml:space="preserve">Led by Clara Cali Mella (Bayer) and Vlad Anisimov (Amgen)</w:t>
+      </w:r>
+    </w:p>
+    <w:p>
+      <w:pPr>
+        <w:pStyle w:val="BodyText"/>
+      </w:pPr>
+      <w:r>
+        <w:t xml:space="preserve">This topic drew the most interest. The team is tackling questions like: What are the best statistical models for enrollment forecasting? How do you combine historical data, real-world data, and accumulating trial data into a single forecast? How should site selection leverage predictive analytics rather than just investigator relationships? Vlad brings deep expertise in Poisson-gamma modeling for recruitment</w:t>
+      </w:r>
+      <w:r>
+        <w:t xml:space="preserve"> </w:t>
+      </w:r>
+      <w:r>
+        <w:t xml:space="preserve">(Anisimov, 2020)</w:t>
+      </w:r>
+      <w:r>
+        <w:t xml:space="preserve">, and the team is working toward a comparative review of forecasting methodologies.</w:t>
+      </w:r>
+    </w:p>
+    <w:p>
+      <w:pPr>
+        <w:pStyle w:val="BodyText"/>
+      </w:pPr>
+      <w:r>
+        <w:rPr>
+          <w:b/>
+          <w:bCs/>
+        </w:rPr>
+        <w:t xml:space="preserve">2. Dynamic Trial Monitoring and Data Quality</w:t>
+      </w:r>
+      <w:r>
+        <w:t xml:space="preserve"> </w:t>
+      </w:r>
+      <w:r>
+        <w:rPr>
+          <w:i/>
+          <w:iCs/>
+        </w:rPr>
+        <w:t xml:space="preserve">Led by Palanikumar Ravindran (BMS)</w:t>
+      </w:r>
+    </w:p>
+    <w:p>
+      <w:pPr>
+        <w:pStyle w:val="BodyText"/>
+      </w:pPr>
+      <w:r>
+        <w:t xml:space="preserve">This workstream focuses on using AI/ML and statistical methods for real-time risk detection during trial conduct, identifying underperforming sites early, predicting dropout patterns, and monitoring data quality signals. The goal is to move from reactive to proactive trial oversight.</w:t>
+      </w:r>
+    </w:p>
+    <w:p>
+      <w:pPr>
+        <w:pStyle w:val="BodyText"/>
+      </w:pPr>
+      <w:r>
+        <w:rPr>
+          <w:b/>
+          <w:bCs/>
+        </w:rPr>
+        <w:t xml:space="preserve">3. Study Design and Operations Impact</w:t>
+      </w:r>
+      <w:r>
+        <w:t xml:space="preserve"> </w:t>
+      </w:r>
+      <w:r>
+        <w:rPr>
+          <w:i/>
+          <w:iCs/>
+        </w:rPr>
+        <w:t xml:space="preserve">Led by Dooti Roy (Boehringer Ingelheim)</w:t>
+      </w:r>
+    </w:p>
+    <w:p>
+      <w:pPr>
+        <w:pStyle w:val="BodyText"/>
+      </w:pPr>
+      <w:r>
+        <w:t xml:space="preserve">Innovative trial designs (adaptive, platform, seamless) are statistically exciting but can create operational nightmares. This team examines the two-way relationship between design choices and operational execution, such as how design decisions affect timelines and resources, and how operational realities should inform design.</w:t>
+      </w:r>
+    </w:p>
+    <w:p>
+      <w:pPr>
+        <w:pStyle w:val="BodyText"/>
+      </w:pPr>
+      <w:r>
+        <w:rPr>
+          <w:b/>
+          <w:bCs/>
+        </w:rPr>
+        <w:t xml:space="preserve">4. Clinical Supply Chain</w:t>
+      </w:r>
+      <w:r>
+        <w:t xml:space="preserve"> </w:t>
+      </w:r>
+      <w:r>
+        <w:rPr>
+          <w:i/>
+          <w:iCs/>
+        </w:rPr>
+        <w:t xml:space="preserve">Led by Christi Kleoudis (AstraZeneca)</w:t>
+      </w:r>
+    </w:p>
+    <w:p>
+      <w:pPr>
+        <w:pStyle w:val="BodyText"/>
+      </w:pPr>
+      <w:r>
+        <w:t xml:space="preserve">Drug supply planning is one of the most impactful yet underappreciated areas where statistical innovation can make a difference. This workstream is developing simulation-based approaches to forecast drug demand, optimize vial configurations, and reduce waste, potentially saving millions of dollars per program.</w:t>
+      </w:r>
+    </w:p>
+    <w:bookmarkEnd w:id="26"/>
+    <w:bookmarkStart w:id="27" w:name="our-members"/>
+    <w:p>
+      <w:pPr>
+        <w:pStyle w:val="Heading2"/>
+      </w:pPr>
+      <w:r>
+        <w:t xml:space="preserve">Our Members</w:t>
+      </w:r>
+    </w:p>
+    <w:p>
+      <w:pPr>
+        <w:pStyle w:val="FirstParagraph"/>
+      </w:pPr>
+      <w:r>
+        <w:t xml:space="preserve">We are proud of the breadth of our membership, which exemplifies our vision for cross-industry, cross-functional collaboration. Efficiency+ currently includes about 20 active members from AbbVie, Amgen, AstraZeneca, Bayer, Beonemed, Boehringer Ingelheim, BMS, Cytel, Johnson &amp; Johnson, Eli Lilly, Regeneron, and Sanofi. Our membership comprises statisticians, data scientists, and clinical operations professionals, exactly the kind of cross-functional mix needed to make real progress.</w:t>
+      </w:r>
+    </w:p>
+    <w:bookmarkEnd w:id="27"/>
+    <w:bookmarkStart w:id="28" w:name="what-we-have-done-so-far"/>
+    <w:p>
+      <w:pPr>
+        <w:pStyle w:val="Heading2"/>
+      </w:pPr>
+      <w:r>
+        <w:t xml:space="preserve">What We Have Done So Far</w:t>
+      </w:r>
+    </w:p>
+    <w:p>
+      <w:pPr>
+        <w:pStyle w:val="FirstParagraph"/>
+      </w:pPr>
+      <w:r>
+        <w:t xml:space="preserve">It has been less than a year since our kickoff, but Efficiency+ has been quite productive in building presence in the research community:</w:t>
+      </w:r>
+    </w:p>
+    <w:p>
+      <w:pPr>
+        <w:pStyle w:val="BodyText"/>
+      </w:pPr>
+      <w:r>
+        <w:rPr>
+          <w:b/>
+          <w:bCs/>
+        </w:rPr>
+        <w:t xml:space="preserve">Conference Presence.</w:t>
+      </w:r>
+      <w:r>
+        <w:t xml:space="preserve"> </w:t>
+      </w:r>
+      <w:r>
+        <w:t xml:space="preserve">We just wrapped up a successful invited session at</w:t>
+      </w:r>
+      <w:r>
+        <w:t xml:space="preserve"> </w:t>
+      </w:r>
+      <w:r>
+        <w:rPr>
+          <w:b/>
+          <w:bCs/>
+        </w:rPr>
+        <w:t xml:space="preserve">ENAR 2026</w:t>
+      </w:r>
+      <w:r>
+        <w:t xml:space="preserve"> </w:t>
+      </w:r>
+      <w:r>
+        <w:t xml:space="preserve">(March 15-18, Indianapolis) titled</w:t>
+      </w:r>
+      <w:r>
+        <w:t xml:space="preserve"> </w:t>
+      </w:r>
+      <w:r>
+        <w:rPr>
+          <w:i/>
+          <w:iCs/>
+        </w:rPr>
+        <w:t xml:space="preserve">“Enhancing Clinical Trial Efficiency through Statistics, AI, and Collaborative Innovation.”</w:t>
+      </w:r>
+      <w:r>
+        <w:t xml:space="preserve"> </w:t>
+      </w:r>
+      <w:r>
+        <w:t xml:space="preserve">The session featured talks by Inna Perevozskaya (BMS) on trial monitoring methods, Vlad Anisimov (Amgen) on recruitment forecasting, Forrest Williamson (Eli Lilly) on pediatric trial challenges, and Ziqian Geng (AbbVie) on randomization in platform trials, with Kyle Wathen (Cytel) chairing. We generated great discussion with the ENAR audience, and we look forward to more conversations at these upcoming Efficiency+ sessions:</w:t>
+      </w:r>
+    </w:p>
+    <w:p>
+      <w:pPr>
+        <w:pStyle w:val="Compact"/>
+        <w:numPr>
+          <w:ilvl w:val="0"/>
+          <w:numId w:val="1001"/>
+        </w:numPr>
+      </w:pPr>
+      <w:r>
+        <w:rPr>
+          <w:b/>
+          <w:bCs/>
+        </w:rPr>
+        <w:t xml:space="preserve">IBC 2026</w:t>
+      </w:r>
+      <w:r>
+        <w:t xml:space="preserve"> </w:t>
+      </w:r>
+      <w:r>
+        <w:t xml:space="preserve">(July, Seoul) - Invited session introducing Efficiency+ and showcasing member research on enrollment forecasting, AI-driven monitoring, and statistical leadership in operations</w:t>
+      </w:r>
+    </w:p>
+    <w:p>
+      <w:pPr>
+        <w:pStyle w:val="Compact"/>
+        <w:numPr>
+          <w:ilvl w:val="0"/>
+          <w:numId w:val="1001"/>
+        </w:numPr>
+      </w:pPr>
+      <w:r>
+        <w:rPr>
+          <w:b/>
+          <w:bCs/>
+        </w:rPr>
+        <w:t xml:space="preserve">JSM 2026</w:t>
+      </w:r>
+      <w:r>
+        <w:t xml:space="preserve"> </w:t>
+      </w:r>
+      <w:r>
+        <w:t xml:space="preserve">(August, Boston) - Accepted invited session on</w:t>
+      </w:r>
+      <w:r>
+        <w:t xml:space="preserve"> </w:t>
+      </w:r>
+      <w:r>
+        <w:rPr>
+          <w:i/>
+          <w:iCs/>
+        </w:rPr>
+        <w:t xml:space="preserve">“Advancing Clinical Trial Operations through Innovative Statistical Methodologies”</w:t>
+      </w:r>
+    </w:p>
+    <w:p>
+      <w:pPr>
+        <w:pStyle w:val="Compact"/>
+        <w:numPr>
+          <w:ilvl w:val="0"/>
+          <w:numId w:val="1001"/>
+        </w:numPr>
+      </w:pPr>
+      <w:r>
+        <w:rPr>
+          <w:b/>
+          <w:bCs/>
+        </w:rPr>
+        <w:t xml:space="preserve">RISW 2026</w:t>
+      </w:r>
+      <w:r>
+        <w:t xml:space="preserve"> </w:t>
+      </w:r>
+      <w:r>
+        <w:t xml:space="preserve">(September, Rockville, MD) - Accepted invited session on</w:t>
+      </w:r>
+      <w:r>
+        <w:t xml:space="preserve"> </w:t>
+      </w:r>
+      <w:r>
+        <w:rPr>
+          <w:i/>
+          <w:iCs/>
+        </w:rPr>
+        <w:t xml:space="preserve">“Advanced Analytics for Operational Excellence”</w:t>
+      </w:r>
+      <w:r>
+        <w:t xml:space="preserve"> </w:t>
+      </w:r>
+      <w:r>
+        <w:t xml:space="preserve">covering recruitment, monitoring, design-operations interplay, and supply chain optimization</w:t>
+      </w:r>
+    </w:p>
+    <w:p>
+      <w:pPr>
+        <w:pStyle w:val="Compact"/>
+        <w:numPr>
+          <w:ilvl w:val="0"/>
+          <w:numId w:val="1001"/>
+        </w:numPr>
+      </w:pPr>
+      <w:r>
+        <w:rPr>
+          <w:b/>
+          <w:bCs/>
+        </w:rPr>
+        <w:t xml:space="preserve">SCOPE Europe 2026</w:t>
+      </w:r>
+      <w:r>
+        <w:t xml:space="preserve"> </w:t>
+      </w:r>
+      <w:r>
+        <w:t xml:space="preserve">(October, Barcelona) - Planning to submit a session proposal to this premier clinical operations summit, bringing our work directly to the operations community</w:t>
+      </w:r>
+    </w:p>
+    <w:p>
+      <w:pPr>
+        <w:pStyle w:val="FirstParagraph"/>
+      </w:pPr>
+      <w:r>
+        <w:rPr>
+          <w:b/>
+          <w:bCs/>
+        </w:rPr>
+        <w:t xml:space="preserve">Simulation Tools.</w:t>
+      </w:r>
+      <w:r>
+        <w:t xml:space="preserve"> </w:t>
+      </w:r>
+      <w:r>
+        <w:t xml:space="preserve">We are developing a clinical trial simulation engine in R (the</w:t>
+      </w:r>
+      <w:r>
+        <w:t xml:space="preserve"> </w:t>
+      </w:r>
+      <w:r>
+        <w:t xml:space="preserve">“CSC”</w:t>
+      </w:r>
+      <w:r>
+        <w:t xml:space="preserve"> </w:t>
+      </w:r>
+      <w:r>
+        <w:t xml:space="preserve">project) that provides end-to-end simulation capabilities, from site activation and patient enrollment through randomization, visit scheduling, and drug supply forecasting. The engine features 31 country-specific parameter types and Bayesian forecasting with JAGS integration. A key strength of the tool is its scenario planning capability: supply chain planners can explore the trade-off between probability of stock-out and amount of drug waste under different study designs and forecast/supply strategies, enabling more informed decision-making before and during a trial.</w:t>
+      </w:r>
+    </w:p>
+    <w:p>
+      <w:pPr>
+        <w:pStyle w:val="BodyText"/>
+      </w:pPr>
+      <w:r>
+        <w:t xml:space="preserve">Importantly, the CSC platform is not just a standalone tool. It is our integration backbone. Each of our four topic teams works on different aspects of trial operations, and the simulation engine serves as the common platform that ties all their work together. The approach is</w:t>
+      </w:r>
+      <w:r>
+        <w:t xml:space="preserve"> </w:t>
+      </w:r>
+      <w:r>
+        <w:t xml:space="preserve">“specification-first”</w:t>
+      </w:r>
+      <w:r>
+        <w:t xml:space="preserve">: each team defines</w:t>
+      </w:r>
+      <w:r>
+        <w:t xml:space="preserve"> </w:t>
+      </w:r>
+      <w:r>
+        <w:rPr>
+          <w:i/>
+          <w:iCs/>
+        </w:rPr>
+        <w:t xml:space="preserve">what</w:t>
+      </w:r>
+      <w:r>
+        <w:t xml:space="preserve"> </w:t>
+      </w:r>
+      <w:r>
+        <w:t xml:space="preserve">their methodology improves (e.g., adaptive site activation, ML-based enrollment forecasting, kit-specific safety stock policies) as structured specifications, and AI-assisted coding tools translate those specs into working simulation modules. This allows methodology experts to contribute without the necessity of writing code, while enabling rigorous comparison of isolated versus integrated improvements. The vision is one platform, four teams, infinite scenarios, where simulation becomes the common language that proves the value of each team’s contribution and reveals synergies across them. This tool is still work in progress, with active development ongoing across the working group.</w:t>
+      </w:r>
+    </w:p>
+    <w:p>
+      <w:pPr>
+        <w:pStyle w:val="BodyText"/>
+      </w:pPr>
+      <w:r>
+        <w:rPr>
+          <w:b/>
+          <w:bCs/>
+        </w:rPr>
+        <w:t xml:space="preserve">Reading Group.</w:t>
+      </w:r>
+      <w:r>
+        <w:t xml:space="preserve"> </w:t>
+      </w:r>
+      <w:r>
+        <w:t xml:space="preserve">We run a regular reading group where members discuss recent literature on clinical trial operations, keeping the group current on methods and sparking new research ideas.</w:t>
+      </w:r>
+    </w:p>
+    <w:bookmarkEnd w:id="28"/>
+    <w:bookmarkStart w:id="32" w:name="find-us-online"/>
+    <w:p>
+      <w:pPr>
+        <w:pStyle w:val="Heading2"/>
+      </w:pPr>
+      <w:r>
+        <w:t xml:space="preserve">Find Us Online</w:t>
+      </w:r>
+    </w:p>
+    <w:p>
+      <w:pPr>
+        <w:pStyle w:val="FirstParagraph"/>
+      </w:pPr>
+      <w:r>
+        <w:t xml:space="preserve">We are actively building our community presence beyond conferences:</w:t>
+      </w:r>
+    </w:p>
+    <w:p>
+      <w:pPr>
+        <w:pStyle w:val="Compact"/>
+        <w:numPr>
+          <w:ilvl w:val="0"/>
+          <w:numId w:val="1002"/>
+        </w:numPr>
+      </w:pPr>
+      <w:r>
+        <w:rPr>
+          <w:b/>
+          <w:bCs/>
+        </w:rPr>
+        <w:t xml:space="preserve">LinkedIn</w:t>
+      </w:r>
+      <w:r>
+        <w:t xml:space="preserve">: Connect with us at</w:t>
+      </w:r>
+      <w:r>
+        <w:t xml:space="preserve"> </w:t>
+      </w:r>
+      <w:r>
+        <w:rPr>
+          <w:b/>
+          <w:bCs/>
+        </w:rPr>
+        <w:t xml:space="preserve">@efficiency-plus-trials</w:t>
+      </w:r>
+      <w:r>
+        <w:t xml:space="preserve"> </w:t>
+      </w:r>
+      <w:r>
+        <w:t xml:space="preserve">(</w:t>
+      </w:r>
+      <w:hyperlink r:id="rId29">
+        <w:r>
+          <w:rPr>
+            <w:rStyle w:val="Hyperlink"/>
+          </w:rPr>
+          <w:t xml:space="preserve">linkedin.com/company/efficiency-plus-trials</w:t>
+        </w:r>
+      </w:hyperlink>
+      <w:r>
+        <w:t xml:space="preserve">) for updates on conference sessions, working group news, and member spotlights</w:t>
+      </w:r>
+    </w:p>
+    <w:p>
+      <w:pPr>
+        <w:pStyle w:val="Compact"/>
+        <w:numPr>
+          <w:ilvl w:val="0"/>
+          <w:numId w:val="1002"/>
+        </w:numPr>
+      </w:pPr>
       <w:r>
         <w:rPr>
           <w:b/>
@@ -779,15 +788,15 @@
       <w:r>
         <w:t xml:space="preserve">serves as a hub for our mission, focus areas, and resources</w:t>
       </w:r>
-      <w:r>
-        <w:t xml:space="preserve"> </w:t>
-      </w:r>
-      <w:r>
-        <w:t xml:space="preserve">-</w:t>
-      </w:r>
-      <w:r>
-        <w:t xml:space="preserve"> </w:t>
-      </w:r>
+    </w:p>
+    <w:p>
+      <w:pPr>
+        <w:pStyle w:val="Compact"/>
+        <w:numPr>
+          <w:ilvl w:val="0"/>
+          <w:numId w:val="1002"/>
+        </w:numPr>
+      </w:pPr>
       <w:r>
         <w:rPr>
           <w:b/>
@@ -818,7 +827,7 @@
     </w:p>
     <w:p>
       <w:pPr>
-        <w:pStyle w:val="BodyText"/>
+        <w:pStyle w:val="FirstParagraph"/>
       </w:pPr>
       <w:r>
         <w:t xml:space="preserve">We promote our work through these channels and through the ASA BIOP section’s own communications, including the AMSTAT newsletter and conference announcements.</w:t>

</xml_diff>

<commit_message>
Color all Efficiency+ mentions in red font
</commit_message>
<xml_diff>
--- a/publications/biopharm_report_spring2026/article.docx
+++ b/publications/biopharm_report_spring2026/article.docx
@@ -7,7 +7,16 @@
         <w:pStyle w:val="Title"/>
       </w:pPr>
       <w:r>
-        <w:t xml:space="preserve">How Many Vials for Brazil? Efficiency+ Brings Statistical Innovation to Trial Operations</w:t>
+        <w:t xml:space="preserve">How Many Vials for Brazil? </w:t>
+      </w:r>
+      <w:r>
+        <w:rPr>
+          <w:color w:val="FF0000"/>
+        </w:rPr>
+        <w:t>Efficiency+</w:t>
+      </w:r>
+      <w:r>
+        <w:t xml:space="preserve"> Brings Statistical Innovation to Trial Operations</w:t>
       </w:r>
     </w:p>
     <w:p>
@@ -39,7 +48,22 @@
           <w:i/>
           <w:iCs/>
         </w:rPr>
-        <w:t xml:space="preserve">On behalf of the Efficiency+ Scientific Working Group</w:t>
+        <w:t xml:space="preserve">On behalf of the </w:t>
+      </w:r>
+      <w:r>
+        <w:rPr>
+          <w:i/>
+          <w:iCs/>
+          <w:color w:val="FF0000"/>
+        </w:rPr>
+        <w:t>Efficiency+</w:t>
+      </w:r>
+      <w:r>
+        <w:rPr>
+          <w:i/>
+          <w:iCs/>
+        </w:rPr>
+        <w:t xml:space="preserve"> Scientific Working Group</w:t>
       </w:r>
     </w:p>
     <w:p>
@@ -95,7 +119,16 @@
         <w:pStyle w:val="ImageCaption"/>
       </w:pPr>
       <w:r>
-        <w:t xml:space="preserve">Scan to follow Efficiency+ on LinkedIn</w:t>
+        <w:t xml:space="preserve">Scan to follow </w:t>
+      </w:r>
+      <w:r>
+        <w:rPr>
+          <w:color w:val="FF0000"/>
+        </w:rPr>
+        <w:t>Efficiency+</w:t>
+      </w:r>
+      <w:r>
+        <w:t xml:space="preserve"> on LinkedIn</w:t>
       </w:r>
     </w:p>
     <w:bookmarkStart w:id="23" w:name="X0638d9fe13537368e9017707d49a40cb9515584"/>
@@ -181,6 +214,7 @@
         <w:rPr>
           <w:b/>
           <w:bCs/>
+          <w:color w:val="FF0000"/>
         </w:rPr>
         <w:t xml:space="preserve">Efficiency+</w:t>
       </w:r>
@@ -203,7 +237,16 @@
         <w:pStyle w:val="FirstParagraph"/>
       </w:pPr>
       <w:r>
-        <w:t xml:space="preserve">The idea for Efficiency+ grew out of conversations among statisticians who found themselves increasingly involved in several aspects of operational decisions, including enrollment forecasting, site selection, and drug supply planning. Yet, there is no organized statistical community to share methods, compare approaches, or develop best practices.</w:t>
+        <w:t xml:space="preserve">The idea for </w:t>
+      </w:r>
+      <w:r>
+        <w:rPr>
+          <w:color w:val="FF0000"/>
+        </w:rPr>
+        <w:t>Efficiency+</w:t>
+      </w:r>
+      <w:r>
+        <w:t xml:space="preserve"> grew out of conversations among statisticians who found themselves increasingly involved in several aspects of operational decisions, including enrollment forecasting, site selection, and drug supply planning. Yet, there is no organized statistical community to share methods, compare approaches, or develop best practices.</w:t>
       </w:r>
     </w:p>
     <w:p>
@@ -219,7 +262,16 @@
         <w:pStyle w:val="BodyText"/>
       </w:pPr>
       <w:r>
-        <w:t xml:space="preserve">From the start, we wanted Efficiency+ to be different from a typical methods-focused working group. Our scope is deliberately cross-functional, emphasizing the intersection of statistics with clinical operations, drug supply, regulatory planning, data management, and functions supporting other clinical operations. The</w:t>
+        <w:t xml:space="preserve">From the start, we wanted </w:t>
+      </w:r>
+      <w:r>
+        <w:rPr>
+          <w:color w:val="FF0000"/>
+        </w:rPr>
+        <w:t>Efficiency+</w:t>
+      </w:r>
+      <w:r>
+        <w:t xml:space="preserve"> to be different from a typical methods-focused working group. Our scope is deliberately cross-functional, emphasizing the intersection of statistics with clinical operations, drug supply, regulatory planning, data management, and functions supporting other clinical operations. The</w:t>
       </w:r>
       <w:r>
         <w:t xml:space="preserve"> </w:t>
@@ -255,7 +307,16 @@
         <w:t xml:space="preserve"> </w:t>
       </w:r>
       <w:r>
-        <w:t xml:space="preserve">(Efficiency+ Scientific Working Group, 2025)</w:t>
+        <w:t>(</w:t>
+      </w:r>
+      <w:r>
+        <w:rPr>
+          <w:color w:val="FF0000"/>
+        </w:rPr>
+        <w:t>Efficiency+</w:t>
+      </w:r>
+      <w:r>
+        <w:t xml:space="preserve"> Scientific Working Group, 2025)</w:t>
       </w:r>
       <w:r>
         <w:t xml:space="preserve">.</w:t>
@@ -423,7 +484,16 @@
         <w:pStyle w:val="FirstParagraph"/>
       </w:pPr>
       <w:r>
-        <w:t xml:space="preserve">We are proud of the breadth of our membership, which exemplifies our vision for cross-industry, cross-functional collaboration. Efficiency+ currently includes about 20 active members from AbbVie, Amgen, AstraZeneca, Bayer, Beonemed, Boehringer Ingelheim, BMS, Cytel, Johnson &amp; Johnson, Eli Lilly, Regeneron, and Sanofi. Our membership comprises statisticians, data scientists, and clinical operations professionals, exactly the kind of cross-functional mix needed to make real progress.</w:t>
+        <w:t xml:space="preserve">We are proud of the breadth of our membership, which exemplifies our vision for cross-industry, cross-functional collaboration. </w:t>
+      </w:r>
+      <w:r>
+        <w:rPr>
+          <w:color w:val="FF0000"/>
+        </w:rPr>
+        <w:t>Efficiency+</w:t>
+      </w:r>
+      <w:r>
+        <w:t xml:space="preserve"> currently includes about 20 active members from AbbVie, Amgen, AstraZeneca, Bayer, Beonemed, Boehringer Ingelheim, BMS, Cytel, Johnson &amp; Johnson, Eli Lilly, Regeneron, and Sanofi. Our membership comprises statisticians, data scientists, and clinical operations professionals, exactly the kind of cross-functional mix needed to make real progress.</w:t>
       </w:r>
     </w:p>
     <w:bookmarkEnd w:id="27"/>
@@ -441,7 +511,16 @@
         <w:pStyle w:val="FirstParagraph"/>
       </w:pPr>
       <w:r>
-        <w:t xml:space="preserve">It has been less than a year since our kickoff, but Efficiency+ has been quite productive in building presence in the research community:</w:t>
+        <w:t xml:space="preserve">It has been less than a year since our kickoff, but </w:t>
+      </w:r>
+      <w:r>
+        <w:rPr>
+          <w:color w:val="FF0000"/>
+        </w:rPr>
+        <w:t>Efficiency+</w:t>
+      </w:r>
+      <w:r>
+        <w:t xml:space="preserve"> has been quite productive in building presence in the research community:</w:t>
       </w:r>
     </w:p>
     <w:p>
@@ -491,7 +570,16 @@
         <w:t xml:space="preserve"> </w:t>
       </w:r>
       <w:r>
-        <w:t xml:space="preserve">The session featured talks by Inna Perevozskaya (BMS) on trial monitoring methods, Vlad Anisimov (Amgen) on recruitment forecasting, Forrest Williamson (Eli Lilly) on pediatric trial challenges, and Ziqian Geng (AbbVie) on randomization in platform trials, with Kyle Wathen (Cytel) chairing. We generated great discussion with the ENAR audience, and we look forward to more conversations at these upcoming Efficiency+ sessions:</w:t>
+        <w:t xml:space="preserve">The session featured talks by Inna Perevozskaya (BMS) on trial monitoring methods, Vlad Anisimov (Amgen) on recruitment forecasting, Forrest Williamson (Eli Lilly) on pediatric trial challenges, and Ziqian Geng (AbbVie) on randomization in platform trials, with Kyle Wathen (Cytel) chairing. We generated great discussion with the ENAR audience, and we look forward to more conversations at these upcoming </w:t>
+      </w:r>
+      <w:r>
+        <w:rPr>
+          <w:color w:val="FF0000"/>
+        </w:rPr>
+        <w:t>Efficiency+</w:t>
+      </w:r>
+      <w:r>
+        <w:t xml:space="preserve"> sessions:</w:t>
       </w:r>
     </w:p>
     <w:p>
@@ -513,7 +601,16 @@
         <w:t xml:space="preserve"> </w:t>
       </w:r>
       <w:r>
-        <w:t xml:space="preserve">(July, Seoul) - Invited session introducing Efficiency+ and showcasing member research on enrollment forecasting, AI-driven monitoring, and statistical leadership in operations</w:t>
+        <w:t xml:space="preserve">(July, Seoul) - Invited session introducing </w:t>
+      </w:r>
+      <w:r>
+        <w:rPr>
+          <w:color w:val="FF0000"/>
+        </w:rPr>
+        <w:t>Efficiency+</w:t>
+      </w:r>
+      <w:r>
+        <w:t xml:space="preserve"> and showcasing member research on enrollment forecasting, AI-driven monitoring, and statistical leadership in operations</w:t>
       </w:r>
     </w:p>
     <w:p>
@@ -1072,7 +1169,43 @@
         <w:pStyle w:val="FirstParagraph"/>
       </w:pPr>
       <w:r>
-        <w:t xml:space="preserve">The author thanks all members of the Efficiency+ Scientific Working Group for their contributions and enthusiasm in the group’s first year. Efficiency+ was co-founded by Fei Chen (Johnson &amp; Johnson) and Bohdana Ratitch (Bayer), who jointly developed the original proposal and led the working group through its formation. Bohdana has since stepped down from her co-chair role, and her contributions to launching this initiative are gratefully acknowledged. Clara Cali Mella (Bayer) has stepped in as co-chair to continue the partnership. Special thanks to our group advisors; Jose Pinheiro, Inna Perevozskaya (BMS), and Benjamin Hofner (PEI), for their guidance; to the workstream leads; Clara Cali Mella, Vlad Anisimov, Palanikumar Ravindran, Dooti Roy, and Christi Kleoudis; to our communication leads, Crystal Shaw and Leanne Goldstein (Amgen), for building our presence on LinkedIn; and to Kyle Wathen (Cytel) for chairing our ENAR session. Thanks also to the ASA Biopharmaceutical Section for supporting this initiative. We are grateful to each of our member companies for investing their people’s time and expertise in this initiative - Efficiency+ exists because our sponsors recognize that improving trial operations is a shared challenge worth solving together. A full list of Efficiency+ members and their affiliations can be found on our GitHub repository at</w:t>
+        <w:t xml:space="preserve">The author thanks all members of the </w:t>
+      </w:r>
+      <w:r>
+        <w:rPr>
+          <w:color w:val="FF0000"/>
+        </w:rPr>
+        <w:t>Efficiency+</w:t>
+      </w:r>
+      <w:r>
+        <w:t xml:space="preserve"> Scientific Working Group for their contributions and enthusiasm in the group’s first year. </w:t>
+      </w:r>
+      <w:r>
+        <w:rPr>
+          <w:color w:val="FF0000"/>
+        </w:rPr>
+        <w:t>Efficiency+</w:t>
+      </w:r>
+      <w:r>
+        <w:t xml:space="preserve"> was co-founded by Fei Chen (Johnson &amp; Johnson) and Bohdana Ratitch (Bayer), who jointly developed the original proposal and led the working group through its formation. Bohdana has since stepped down from her co-chair role, and her contributions to launching this initiative are gratefully acknowledged. Clara Cali Mella (Bayer) has stepped in as co-chair to continue the partnership. Special thanks to our group advisors; Jose Pinheiro, Inna Perevozskaya (BMS), and Benjamin Hofner (PEI), for their guidance; to the workstream leads; Clara Cali Mella, Vlad Anisimov, Palanikumar Ravindran, Dooti Roy, and Christi Kleoudis; to our communication leads, Crystal Shaw and Leanne Goldstein (Amgen), for building our presence on LinkedIn; and to Kyle Wathen (Cytel) for chairing our ENAR session. Thanks also to the ASA Biopharmaceutical Section for supporting this initiative. We are grateful to each of our member companies for investing their people’s time and expertise in this initiative - </w:t>
+      </w:r>
+      <w:r>
+        <w:rPr>
+          <w:color w:val="FF0000"/>
+        </w:rPr>
+        <w:t>Efficiency+</w:t>
+      </w:r>
+      <w:r>
+        <w:t xml:space="preserve"> exists because our sponsors recognize that improving trial operations is a shared challenge worth solving together. A full list of </w:t>
+      </w:r>
+      <w:r>
+        <w:rPr>
+          <w:color w:val="FF0000"/>
+        </w:rPr>
+        <w:t>Efficiency+</w:t>
+      </w:r>
+      <w:r>
+        <w:t xml:space="preserve"> members and their affiliations can be found on our GitHub repository at</w:t>
       </w:r>
       <w:r>
         <w:t xml:space="preserve"> </w:t>
@@ -1143,7 +1276,13 @@
         <w:pStyle w:val="Bibliography"/>
       </w:pPr>
       <w:r>
-        <w:t xml:space="preserve">Efficiency+ Scientific Working Group. (2025).</w:t>
+        <w:rPr>
+          <w:color w:val="FF0000"/>
+        </w:rPr>
+        <w:t>Efficiency+</w:t>
+      </w:r>
+      <w:r>
+        <w:t xml:space="preserve"> Scientific Working Group. (2025).</w:t>
       </w:r>
       <w:r>
         <w:t xml:space="preserve"> </w:t>
@@ -1152,8 +1291,16 @@
         <w:rPr>
           <w:i/>
           <w:iCs/>
-        </w:rPr>
-        <w:t xml:space="preserve">Efficiency+: Enhancing clinical trial operations through advanced statistics</w:t>
+          <w:color w:val="FF0000"/>
+        </w:rPr>
+        <w:t>Efficiency+</w:t>
+      </w:r>
+      <w:r>
+        <w:rPr>
+          <w:i/>
+          <w:iCs/>
+        </w:rPr>
+        <w:t>: Enhancing clinical trial operations through advanced statistics</w:t>
       </w:r>
       <w:r>
         <w:t xml:space="preserve">.</w:t>

</xml_diff>

<commit_message>
Reduce red Efficiency+ to 2 key instances: formation and identity
</commit_message>
<xml_diff>
--- a/publications/biopharm_report_spring2026/article.docx
+++ b/publications/biopharm_report_spring2026/article.docx
@@ -7,16 +7,7 @@
         <w:pStyle w:val="Title"/>
       </w:pPr>
       <w:r>
-        <w:t xml:space="preserve">How Many Vials for Brazil? </w:t>
-      </w:r>
-      <w:r>
-        <w:rPr>
-          <w:color w:val="FF0000"/>
-        </w:rPr>
-        <w:t>Efficiency+</w:t>
-      </w:r>
-      <w:r>
-        <w:t xml:space="preserve"> Brings Statistical Innovation to Trial Operations</w:t>
+        <w:t xml:space="preserve">How Many Vials for Brazil? Efficiency+ Brings Statistical Innovation to Trial Operations</w:t>
       </w:r>
     </w:p>
     <w:p>
@@ -48,22 +39,7 @@
           <w:i/>
           <w:iCs/>
         </w:rPr>
-        <w:t xml:space="preserve">On behalf of the </w:t>
-      </w:r>
-      <w:r>
-        <w:rPr>
-          <w:i/>
-          <w:iCs/>
-          <w:color w:val="FF0000"/>
-        </w:rPr>
-        <w:t>Efficiency+</w:t>
-      </w:r>
-      <w:r>
-        <w:rPr>
-          <w:i/>
-          <w:iCs/>
-        </w:rPr>
-        <w:t xml:space="preserve"> Scientific Working Group</w:t>
+        <w:t xml:space="preserve">On behalf of the Efficiency+ Scientific Working Group</w:t>
       </w:r>
     </w:p>
     <w:p>
@@ -119,16 +95,7 @@
         <w:pStyle w:val="ImageCaption"/>
       </w:pPr>
       <w:r>
-        <w:t xml:space="preserve">Scan to follow </w:t>
-      </w:r>
-      <w:r>
-        <w:rPr>
-          <w:color w:val="FF0000"/>
-        </w:rPr>
-        <w:t>Efficiency+</w:t>
-      </w:r>
-      <w:r>
-        <w:t xml:space="preserve"> on LinkedIn</w:t>
+        <w:t xml:space="preserve">Scan to follow Efficiency+ on LinkedIn</w:t>
       </w:r>
     </w:p>
     <w:bookmarkStart w:id="23" w:name="X0638d9fe13537368e9017707d49a40cb9515584"/>
@@ -237,16 +204,7 @@
         <w:pStyle w:val="FirstParagraph"/>
       </w:pPr>
       <w:r>
-        <w:t xml:space="preserve">The idea for </w:t>
-      </w:r>
-      <w:r>
-        <w:rPr>
-          <w:color w:val="FF0000"/>
-        </w:rPr>
-        <w:t>Efficiency+</w:t>
-      </w:r>
-      <w:r>
-        <w:t xml:space="preserve"> grew out of conversations among statisticians who found themselves increasingly involved in several aspects of operational decisions, including enrollment forecasting, site selection, and drug supply planning. Yet, there is no organized statistical community to share methods, compare approaches, or develop best practices.</w:t>
+        <w:t xml:space="preserve">The idea for Efficiency+ grew out of conversations among statisticians who found themselves increasingly involved in several aspects of operational decisions, including enrollment forecasting, site selection, and drug supply planning. Yet, there is no organized statistical community to share methods, compare approaches, or develop best practices.</w:t>
       </w:r>
     </w:p>
     <w:p>
@@ -307,16 +265,7 @@
         <w:t xml:space="preserve"> </w:t>
       </w:r>
       <w:r>
-        <w:t>(</w:t>
-      </w:r>
-      <w:r>
-        <w:rPr>
-          <w:color w:val="FF0000"/>
-        </w:rPr>
-        <w:t>Efficiency+</w:t>
-      </w:r>
-      <w:r>
-        <w:t xml:space="preserve"> Scientific Working Group, 2025)</w:t>
+        <w:t xml:space="preserve">(Efficiency+ Scientific Working Group, 2025)</w:t>
       </w:r>
       <w:r>
         <w:t xml:space="preserve">.</w:t>
@@ -484,16 +433,7 @@
         <w:pStyle w:val="FirstParagraph"/>
       </w:pPr>
       <w:r>
-        <w:t xml:space="preserve">We are proud of the breadth of our membership, which exemplifies our vision for cross-industry, cross-functional collaboration. </w:t>
-      </w:r>
-      <w:r>
-        <w:rPr>
-          <w:color w:val="FF0000"/>
-        </w:rPr>
-        <w:t>Efficiency+</w:t>
-      </w:r>
-      <w:r>
-        <w:t xml:space="preserve"> currently includes about 20 active members from AbbVie, Amgen, AstraZeneca, Bayer, Beonemed, Boehringer Ingelheim, BMS, Cytel, Johnson &amp; Johnson, Eli Lilly, Regeneron, and Sanofi. Our membership comprises statisticians, data scientists, and clinical operations professionals, exactly the kind of cross-functional mix needed to make real progress.</w:t>
+        <w:t xml:space="preserve">We are proud of the breadth of our membership, which exemplifies our vision for cross-industry, cross-functional collaboration. Efficiency+ currently includes about 20 active members from AbbVie, Amgen, AstraZeneca, Bayer, Beonemed, Boehringer Ingelheim, BMS, Cytel, Johnson &amp; Johnson, Eli Lilly, Regeneron, and Sanofi. Our membership comprises statisticians, data scientists, and clinical operations professionals, exactly the kind of cross-functional mix needed to make real progress.</w:t>
       </w:r>
     </w:p>
     <w:bookmarkEnd w:id="27"/>
@@ -511,16 +451,7 @@
         <w:pStyle w:val="FirstParagraph"/>
       </w:pPr>
       <w:r>
-        <w:t xml:space="preserve">It has been less than a year since our kickoff, but </w:t>
-      </w:r>
-      <w:r>
-        <w:rPr>
-          <w:color w:val="FF0000"/>
-        </w:rPr>
-        <w:t>Efficiency+</w:t>
-      </w:r>
-      <w:r>
-        <w:t xml:space="preserve"> has been quite productive in building presence in the research community:</w:t>
+        <w:t xml:space="preserve">It has been less than a year since our kickoff, but Efficiency+ has been quite productive in building presence in the research community:</w:t>
       </w:r>
     </w:p>
     <w:p>
@@ -570,16 +501,7 @@
         <w:t xml:space="preserve"> </w:t>
       </w:r>
       <w:r>
-        <w:t xml:space="preserve">The session featured talks by Inna Perevozskaya (BMS) on trial monitoring methods, Vlad Anisimov (Amgen) on recruitment forecasting, Forrest Williamson (Eli Lilly) on pediatric trial challenges, and Ziqian Geng (AbbVie) on randomization in platform trials, with Kyle Wathen (Cytel) chairing. We generated great discussion with the ENAR audience, and we look forward to more conversations at these upcoming </w:t>
-      </w:r>
-      <w:r>
-        <w:rPr>
-          <w:color w:val="FF0000"/>
-        </w:rPr>
-        <w:t>Efficiency+</w:t>
-      </w:r>
-      <w:r>
-        <w:t xml:space="preserve"> sessions:</w:t>
+        <w:t xml:space="preserve">The session featured talks by Inna Perevozskaya (BMS) on trial monitoring methods, Vlad Anisimov (Amgen) on recruitment forecasting, Forrest Williamson (Eli Lilly) on pediatric trial challenges, and Ziqian Geng (AbbVie) on randomization in platform trials, with Kyle Wathen (Cytel) chairing. We generated great discussion with the ENAR audience, and we look forward to more conversations at these upcoming Efficiency+ sessions:</w:t>
       </w:r>
     </w:p>
     <w:p>
@@ -601,16 +523,7 @@
         <w:t xml:space="preserve"> </w:t>
       </w:r>
       <w:r>
-        <w:t xml:space="preserve">(July, Seoul) - Invited session introducing </w:t>
-      </w:r>
-      <w:r>
-        <w:rPr>
-          <w:color w:val="FF0000"/>
-        </w:rPr>
-        <w:t>Efficiency+</w:t>
-      </w:r>
-      <w:r>
-        <w:t xml:space="preserve"> and showcasing member research on enrollment forecasting, AI-driven monitoring, and statistical leadership in operations</w:t>
+        <w:t xml:space="preserve">(July, Seoul) - Invited session introducing Efficiency+ and showcasing member research on enrollment forecasting, AI-driven monitoring, and statistical leadership in operations</w:t>
       </w:r>
     </w:p>
     <w:p>
@@ -1169,43 +1082,7 @@
         <w:pStyle w:val="FirstParagraph"/>
       </w:pPr>
       <w:r>
-        <w:t xml:space="preserve">The author thanks all members of the </w:t>
-      </w:r>
-      <w:r>
-        <w:rPr>
-          <w:color w:val="FF0000"/>
-        </w:rPr>
-        <w:t>Efficiency+</w:t>
-      </w:r>
-      <w:r>
-        <w:t xml:space="preserve"> Scientific Working Group for their contributions and enthusiasm in the group’s first year. </w:t>
-      </w:r>
-      <w:r>
-        <w:rPr>
-          <w:color w:val="FF0000"/>
-        </w:rPr>
-        <w:t>Efficiency+</w:t>
-      </w:r>
-      <w:r>
-        <w:t xml:space="preserve"> was co-founded by Fei Chen (Johnson &amp; Johnson) and Bohdana Ratitch (Bayer), who jointly developed the original proposal and led the working group through its formation. Bohdana has since stepped down from her co-chair role, and her contributions to launching this initiative are gratefully acknowledged. Clara Cali Mella (Bayer) has stepped in as co-chair to continue the partnership. Special thanks to our group advisors; Jose Pinheiro, Inna Perevozskaya (BMS), and Benjamin Hofner (PEI), for their guidance; to the workstream leads; Clara Cali Mella, Vlad Anisimov, Palanikumar Ravindran, Dooti Roy, and Christi Kleoudis; to our communication leads, Crystal Shaw and Leanne Goldstein (Amgen), for building our presence on LinkedIn; and to Kyle Wathen (Cytel) for chairing our ENAR session. Thanks also to the ASA Biopharmaceutical Section for supporting this initiative. We are grateful to each of our member companies for investing their people’s time and expertise in this initiative - </w:t>
-      </w:r>
-      <w:r>
-        <w:rPr>
-          <w:color w:val="FF0000"/>
-        </w:rPr>
-        <w:t>Efficiency+</w:t>
-      </w:r>
-      <w:r>
-        <w:t xml:space="preserve"> exists because our sponsors recognize that improving trial operations is a shared challenge worth solving together. A full list of </w:t>
-      </w:r>
-      <w:r>
-        <w:rPr>
-          <w:color w:val="FF0000"/>
-        </w:rPr>
-        <w:t>Efficiency+</w:t>
-      </w:r>
-      <w:r>
-        <w:t xml:space="preserve"> members and their affiliations can be found on our GitHub repository at</w:t>
+        <w:t xml:space="preserve">The author thanks all members of the Efficiency+ Scientific Working Group for their contributions and enthusiasm in the group’s first year. Efficiency+ was co-founded by Fei Chen (Johnson &amp; Johnson) and Bohdana Ratitch (Bayer), who jointly developed the original proposal and led the working group through its formation. Bohdana has since stepped down from her co-chair role, and her contributions to launching this initiative are gratefully acknowledged. Clara Cali Mella (Bayer) has stepped in as co-chair to continue the partnership. Special thanks to our group advisors; Jose Pinheiro, Inna Perevozskaya (BMS), and Benjamin Hofner (PEI), for their guidance; to the workstream leads; Clara Cali Mella, Vlad Anisimov, Palanikumar Ravindran, Dooti Roy, and Christi Kleoudis; to our communication leads, Crystal Shaw and Leanne Goldstein (Amgen), for building our presence on LinkedIn; and to Kyle Wathen (Cytel) for chairing our ENAR session. Thanks also to the ASA Biopharmaceutical Section for supporting this initiative. We are grateful to each of our member companies for investing their people’s time and expertise in this initiative - Efficiency+ exists because our sponsors recognize that improving trial operations is a shared challenge worth solving together. A full list of Efficiency+ members and their affiliations can be found on our GitHub repository at</w:t>
       </w:r>
       <w:r>
         <w:t xml:space="preserve"> </w:t>
@@ -1276,13 +1153,7 @@
         <w:pStyle w:val="Bibliography"/>
       </w:pPr>
       <w:r>
-        <w:rPr>
-          <w:color w:val="FF0000"/>
-        </w:rPr>
-        <w:t>Efficiency+</w:t>
-      </w:r>
-      <w:r>
-        <w:t xml:space="preserve"> Scientific Working Group. (2025).</w:t>
+        <w:t xml:space="preserve">Efficiency+ Scientific Working Group. (2025).</w:t>
       </w:r>
       <w:r>
         <w:t xml:space="preserve"> </w:t>
@@ -1291,16 +1162,8 @@
         <w:rPr>
           <w:i/>
           <w:iCs/>
-          <w:color w:val="FF0000"/>
-        </w:rPr>
-        <w:t>Efficiency+</w:t>
-      </w:r>
-      <w:r>
-        <w:rPr>
-          <w:i/>
-          <w:iCs/>
-        </w:rPr>
-        <w:t>: Enhancing clinical trial operations through advanced statistics</w:t>
+        </w:rPr>
+        <w:t xml:space="preserve">Efficiency+: Enhancing clinical trial operations through advanced statistics</w:t>
       </w:r>
       <w:r>
         <w:t xml:space="preserve">.</w:t>

</xml_diff>

<commit_message>
Fix company names (BeOne Medicines, Bristol-Myers Squibb), remove MD from Rockville
</commit_message>
<xml_diff>
--- a/publications/biopharm_report_spring2026/article.docx
+++ b/publications/biopharm_report_spring2026/article.docx
@@ -433,7 +433,7 @@
         <w:pStyle w:val="FirstParagraph"/>
       </w:pPr>
       <w:r>
-        <w:t xml:space="preserve">We are proud of the breadth of our membership, which exemplifies our vision for cross-industry, cross-functional collaboration. Efficiency+ currently includes about 20 active members from AbbVie, Amgen, AstraZeneca, Bayer, Beonemed, Boehringer Ingelheim, BMS, Cytel, Johnson &amp; Johnson, Eli Lilly, Regeneron, and Sanofi. Our membership comprises statisticians, data scientists, and clinical operations professionals, exactly the kind of cross-functional mix needed to make real progress.</w:t>
+        <w:t xml:space="preserve">We are proud of the breadth of our membership, which exemplifies our vision for cross-industry, cross-functional collaboration. Efficiency+ currently includes about 20 active members from AbbVie, Amgen, AstraZeneca, Bayer, BeOne Medicines, Boehringer Ingelheim, Bristol-Myers Squibb, Cytel, Johnson &amp; Johnson, Eli Lilly, Regeneron, and Sanofi. Our membership comprises statisticians, data scientists, and clinical operations professionals, exactly the kind of cross-functional mix needed to make real progress.</w:t>
       </w:r>
     </w:p>
     <w:bookmarkEnd w:id="27"/>
@@ -577,7 +577,7 @@
         <w:t xml:space="preserve"> </w:t>
       </w:r>
       <w:r>
-        <w:t xml:space="preserve">(September, Rockville, MD) - Accepted invited session on</w:t>
+        <w:t xml:space="preserve">(September, Rockville) - Accepted invited session on</w:t>
       </w:r>
       <w:r>
         <w:t xml:space="preserve"> </w:t>

</xml_diff>

<commit_message>
Add SCT 2026 keynote by Cyrus Hoseyni
</commit_message>
<xml_diff>
--- a/publications/biopharm_report_spring2026/article.docx
+++ b/publications/biopharm_report_spring2026/article.docx
@@ -502,6 +502,28 @@
       </w:r>
       <w:r>
         <w:t xml:space="preserve">The session featured talks by Inna Perevozskaya (BMS) on trial monitoring methods, Vlad Anisimov (Amgen) on recruitment forecasting, Forrest Williamson (Eli Lilly) on pediatric trial challenges, and Ziqian Geng (AbbVie) on randomization in platform trials, with Kyle Wathen (Cytel) chairing. We generated great discussion with the ENAR audience, and we look forward to more conversations at these upcoming Efficiency+ sessions:</w:t>
+      </w:r>
+    </w:p>
+    <w:p>
+      <w:pPr>
+        <w:pStyle w:val="Compact"/>
+        <w:numPr>
+          <w:ilvl w:val="0"/>
+          <w:numId w:val="1001"/>
+        </w:numPr>
+      </w:pPr>
+      <w:r>
+        <w:rPr>
+          <w:b/>
+          <w:bCs/>
+        </w:rPr>
+        <w:t xml:space="preserve">SCT 2026</w:t>
+      </w:r>
+      <w:r>
+        <w:t xml:space="preserve"> </w:t>
+      </w:r>
+      <w:r>
+        <w:t xml:space="preserve">(May, Phoenix) - Cyrus Hoseyni, VP, Global Head of Quantitative Science and Clinical Pharmacology at Johnson &amp; Johnson Innovative Medicine, will deliver a keynote address that highlights Efficiency+ as part of a broader vision for statistical innovation in clinical trial operations</w:t>
       </w:r>
     </w:p>
     <w:p>

</xml_diff>

<commit_message>
Cyrus feedback: historical familiarity, simplify JAGS to Bayesian MCMC
</commit_message>
<xml_diff>
--- a/publications/biopharm_report_spring2026/article.docx
+++ b/publications/biopharm_report_spring2026/article.docx
@@ -146,7 +146,7 @@
         <w:pStyle w:val="BodyText"/>
       </w:pPr>
       <w:r>
-        <w:t xml:space="preserve">These are clinical operations questions, but they are fundamentally statistical problems. For decades, operational decisions have been made largely by deterministic rules of thumb, spreadsheets, previous experience, and gut instinct. The result? sites are selected based on relationships rather than data; more than half of clinical trials globally fail to enroll on time, leading to costly extensions and opening of additional sites</w:t>
+        <w:t xml:space="preserve">These are clinical operations questions, but they are fundamentally statistical problems. For decades, operational decisions have been made largely by deterministic rules of thumb, spreadsheets, previous experience, and gut instinct. The result? Sites are selected based on historical familiarity rather than data; more than half of clinical trials globally fail to enroll on time, leading to costly extensions and opening of additional sites</w:t>
       </w:r>
       <w:r>
         <w:t xml:space="preserve"> </w:t>
@@ -667,7 +667,7 @@
         <w:t xml:space="preserve"> </w:t>
       </w:r>
       <w:r>
-        <w:t xml:space="preserve">project) that provides end-to-end simulation capabilities, from site activation and patient enrollment through randomization, visit scheduling, and drug supply forecasting. The engine features 31 country-specific parameter types and Bayesian forecasting with JAGS integration. A key strength of the tool is its scenario planning capability: supply chain planners can explore the trade-off between probability of stock-out and amount of drug waste under different study designs and forecast/supply strategies, enabling more informed decision-making before and during a trial.</w:t>
+        <w:t xml:space="preserve">project) that provides end-to-end simulation capabilities, from site activation and patient enrollment through randomization, visit scheduling, and drug supply forecasting. The engine features 31 country-specific parameter types and Bayesian MCMC forecasting. A key strength of the tool is its scenario planning capability: supply chain planners can explore the trade-off between probability of stock-out and amount of drug waste under different study designs and forecast/supply strategies, enabling more informed decision-making before and during a trial.</w:t>
       </w:r>
     </w:p>
     <w:p>

</xml_diff>

<commit_message>
Rename first section title
</commit_message>
<xml_diff>
--- a/publications/biopharm_report_spring2026/article.docx
+++ b/publications/biopharm_report_spring2026/article.docx
@@ -98,13 +98,13 @@
         <w:t xml:space="preserve">Scan to follow Efficiency+ on LinkedIn</w:t>
       </w:r>
     </w:p>
-    <w:bookmarkStart w:id="23" w:name="X0638d9fe13537368e9017707d49a40cb9515584"/>
+    <w:bookmarkStart w:id="23" w:name="Xe69b82ad66c2e4d02971a5c3e98944aed7b6c3c"/>
     <w:p>
       <w:pPr>
         <w:pStyle w:val="Heading2"/>
       </w:pPr>
       <w:r>
-        <w:t xml:space="preserve">Why Clinical Trial Operations Needs Statisticians</w:t>
+        <w:t xml:space="preserve">The Importance of Statistical Innovation in Clinical Trial Operations</w:t>
       </w:r>
     </w:p>
     <w:p>

</xml_diff>

<commit_message>
Remove SCT 2026 reference
</commit_message>
<xml_diff>
--- a/publications/biopharm_report_spring2026/article.docx
+++ b/publications/biopharm_report_spring2026/article.docx
@@ -502,28 +502,6 @@
       </w:r>
       <w:r>
         <w:t xml:space="preserve">The session featured talks by Inna Perevozskaya (BMS) on trial monitoring methods, Vlad Anisimov (Amgen) on recruitment forecasting, Forrest Williamson (Eli Lilly) on pediatric trial challenges, and Ziqian Geng (AbbVie) on randomization in platform trials, with Kyle Wathen (Cytel) chairing. We generated great discussion with the ENAR audience, and we look forward to more conversations at these upcoming Efficiency+ sessions:</w:t>
-      </w:r>
-    </w:p>
-    <w:p>
-      <w:pPr>
-        <w:pStyle w:val="Compact"/>
-        <w:numPr>
-          <w:ilvl w:val="0"/>
-          <w:numId w:val="1001"/>
-        </w:numPr>
-      </w:pPr>
-      <w:r>
-        <w:rPr>
-          <w:b/>
-          <w:bCs/>
-        </w:rPr>
-        <w:t xml:space="preserve">SCT 2026</w:t>
-      </w:r>
-      <w:r>
-        <w:t xml:space="preserve"> </w:t>
-      </w:r>
-      <w:r>
-        <w:t xml:space="preserve">(May, Phoenix) - Cyrus Hoseyni, VP, Global Head of Quantitative Science and Clinical Pharmacology at Johnson &amp; Johnson Innovative Medicine, will deliver a keynote address that highlights Efficiency+ as part of a broader vision for statistical innovation in clinical trial operations</w:t>
       </w:r>
     </w:p>
     <w:p>

</xml_diff>